<commit_message>
integrating updated result in ms
</commit_message>
<xml_diff>
--- a/output/papers/Round 2/manuscript-brief-clean.docx
+++ b/output/papers/Round 2/manuscript-brief-clean.docx
@@ -1,6 +1,6 @@
 
 <file path=word/document.xml><?xml version="1.0" encoding="utf-8"?>
-<w:document xmlns:wpc="http://schemas.microsoft.com/office/word/2010/wordprocessingCanvas" xmlns:cx="http://schemas.microsoft.com/office/drawing/2014/chartex" xmlns:cx1="http://schemas.microsoft.com/office/drawing/2015/9/8/chartex" xmlns:cx2="http://schemas.microsoft.com/office/drawing/2015/10/21/chartex" xmlns:cx3="http://schemas.microsoft.com/office/drawing/2016/5/9/chartex" xmlns:cx4="http://schemas.microsoft.com/office/drawing/2016/5/10/chartex" xmlns:cx5="http://schemas.microsoft.com/office/drawing/2016/5/11/chartex" xmlns:cx6="http://schemas.microsoft.com/office/drawing/2016/5/12/chartex" xmlns:cx7="http://schemas.microsoft.com/office/drawing/2016/5/13/chartex" xmlns:cx8="http://schemas.microsoft.com/office/drawing/2016/5/14/chartex" xmlns:mc="http://schemas.openxmlformats.org/markup-compatibility/2006" xmlns:aink="http://schemas.microsoft.com/office/drawing/2016/ink" xmlns:am3d="http://schemas.microsoft.com/office/drawing/2017/model3d" xmlns:o="urn:schemas-microsoft-com:office:office" xmlns:oel="http://schemas.microsoft.com/office/2019/extlst" xmlns:r="http://schemas.openxmlformats.org/officeDocument/2006/relationships" xmlns:m="http://schemas.openxmlformats.org/officeDocument/2006/math" xmlns:v="urn:schemas-microsoft-com:vml" xmlns:wp14="http://schemas.microsoft.com/office/word/2010/wordprocessingDrawing" xmlns:wp="http://schemas.openxmlformats.org/drawingml/2006/wordprocessingDrawing" xmlns:w10="urn:schemas-microsoft-com:office:word" xmlns:w="http://schemas.openxmlformats.org/wordprocessingml/2006/main" xmlns:w14="http://schemas.microsoft.com/office/word/2010/wordml" xmlns:w15="http://schemas.microsoft.com/office/word/2012/wordml" xmlns:w16cex="http://schemas.microsoft.com/office/word/2018/wordml/cex" xmlns:w16cid="http://schemas.microsoft.com/office/word/2016/wordml/cid" xmlns:w16="http://schemas.microsoft.com/office/word/2018/wordml" xmlns:w16du="http://schemas.microsoft.com/office/word/2023/wordml/word16du" xmlns:w16sdtdh="http://schemas.microsoft.com/office/word/2020/wordml/sdtdatahash" xmlns:w16se="http://schemas.microsoft.com/office/word/2015/wordml/symex" xmlns:wpg="http://schemas.microsoft.com/office/word/2010/wordprocessingGroup" xmlns:wpi="http://schemas.microsoft.com/office/word/2010/wordprocessingInk" xmlns:wne="http://schemas.microsoft.com/office/word/2006/wordml" xmlns:wps="http://schemas.microsoft.com/office/word/2010/wordprocessingShape" mc:Ignorable="w14 w15 w16se w16cid w16 w16cex w16sdtdh w16du wp14">
+<w:document xmlns:wpc="http://schemas.microsoft.com/office/word/2010/wordprocessingCanvas" xmlns:cx="http://schemas.microsoft.com/office/drawing/2014/chartex" xmlns:cx1="http://schemas.microsoft.com/office/drawing/2015/9/8/chartex" xmlns:cx2="http://schemas.microsoft.com/office/drawing/2015/10/21/chartex" xmlns:cx3="http://schemas.microsoft.com/office/drawing/2016/5/9/chartex" xmlns:cx4="http://schemas.microsoft.com/office/drawing/2016/5/10/chartex" xmlns:cx5="http://schemas.microsoft.com/office/drawing/2016/5/11/chartex" xmlns:cx6="http://schemas.microsoft.com/office/drawing/2016/5/12/chartex" xmlns:cx7="http://schemas.microsoft.com/office/drawing/2016/5/13/chartex" xmlns:cx8="http://schemas.microsoft.com/office/drawing/2016/5/14/chartex" xmlns:mc="http://schemas.openxmlformats.org/markup-compatibility/2006" xmlns:aink="http://schemas.microsoft.com/office/drawing/2016/ink" xmlns:am3d="http://schemas.microsoft.com/office/drawing/2017/model3d" xmlns:o="urn:schemas-microsoft-com:office:office" xmlns:oel="http://schemas.microsoft.com/office/2019/extlst" xmlns:r="http://schemas.openxmlformats.org/officeDocument/2006/relationships" xmlns:m="http://schemas.openxmlformats.org/officeDocument/2006/math" xmlns:v="urn:schemas-microsoft-com:vml" xmlns:wp14="http://schemas.microsoft.com/office/word/2010/wordprocessingDrawing" xmlns:wp="http://schemas.openxmlformats.org/drawingml/2006/wordprocessingDrawing" xmlns:w10="urn:schemas-microsoft-com:office:word" xmlns:w="http://schemas.openxmlformats.org/wordprocessingml/2006/main" xmlns:w14="http://schemas.microsoft.com/office/word/2010/wordml" xmlns:w15="http://schemas.microsoft.com/office/word/2012/wordml" xmlns:w16cex="http://schemas.microsoft.com/office/word/2018/wordml/cex" xmlns:w16cid="http://schemas.microsoft.com/office/word/2016/wordml/cid" xmlns:w16="http://schemas.microsoft.com/office/word/2018/wordml" xmlns:w16du="http://schemas.microsoft.com/office/word/2023/wordml/word16du" xmlns:w16sdtdh="http://schemas.microsoft.com/office/word/2020/wordml/sdtdatahash" xmlns:w16sdtfl="http://schemas.microsoft.com/office/word/2024/wordml/sdtformatlock" xmlns:w16se="http://schemas.microsoft.com/office/word/2015/wordml/symex" xmlns:wpg="http://schemas.microsoft.com/office/word/2010/wordprocessingGroup" xmlns:wpi="http://schemas.microsoft.com/office/word/2010/wordprocessingInk" xmlns:wne="http://schemas.microsoft.com/office/word/2006/wordml" xmlns:wps="http://schemas.microsoft.com/office/word/2010/wordprocessingShape" mc:Ignorable="w14 w15 w16se w16cid w16 w16cex w16sdtdh w16sdtfl w16du wp14">
   <w:body>
     <w:p>
       <w:r>
@@ -595,7 +595,21 @@
         <w:rPr>
           <w:szCs w:val="22"/>
         </w:rPr>
-        <w:t xml:space="preserve"> In a series of perception experiments, we find that listeners compensate for the presence of a pen in the mouth of the talker, as long as the effects of the pen on the articulators (</w:t>
+        <w:t xml:space="preserve"> In a series of perception experiments, we find that listeners compensate for the presence of a pen in the mouth of the talker, </w:t>
+      </w:r>
+      <w:proofErr w:type="gramStart"/>
+      <w:r>
+        <w:rPr>
+          <w:szCs w:val="22"/>
+        </w:rPr>
+        <w:t>as long as</w:t>
+      </w:r>
+      <w:proofErr w:type="gramEnd"/>
+      <w:r>
+        <w:rPr>
+          <w:szCs w:val="22"/>
+        </w:rPr>
+        <w:t xml:space="preserve"> the effects of the pen on the articulators (</w:t>
       </w:r>
       <w:r>
         <w:rPr>
@@ -898,7 +912,21 @@
         <w:rPr>
           <w:szCs w:val="22"/>
         </w:rPr>
-        <w:t xml:space="preserve">acoustically more similar to typical </w:t>
+        <w:t xml:space="preserve">acoustically more </w:t>
+      </w:r>
+      <w:proofErr w:type="gramStart"/>
+      <w:r>
+        <w:rPr>
+          <w:szCs w:val="22"/>
+        </w:rPr>
+        <w:t>similar to</w:t>
+      </w:r>
+      <w:proofErr w:type="gramEnd"/>
+      <w:r>
+        <w:rPr>
+          <w:szCs w:val="22"/>
+        </w:rPr>
+        <w:t xml:space="preserve"> typical </w:t>
       </w:r>
       <w:r>
         <w:rPr>
@@ -1898,7 +1926,21 @@
         <w:rPr>
           <w:szCs w:val="22"/>
         </w:rPr>
-        <w:t>context should elicit compensation similar to that observed in previous studies on linguistic context</w:t>
+        <w:t xml:space="preserve">context should elicit compensation </w:t>
+      </w:r>
+      <w:proofErr w:type="gramStart"/>
+      <w:r>
+        <w:rPr>
+          <w:szCs w:val="22"/>
+        </w:rPr>
+        <w:t>similar to</w:t>
+      </w:r>
+      <w:proofErr w:type="gramEnd"/>
+      <w:r>
+        <w:rPr>
+          <w:szCs w:val="22"/>
+        </w:rPr>
+        <w:t xml:space="preserve"> that observed in previous studies on linguistic context</w:t>
       </w:r>
       <w:r>
         <w:rPr>
@@ -2142,7 +2184,21 @@
         <w:rPr>
           <w:szCs w:val="22"/>
         </w:rPr>
-        <w:t xml:space="preserve">from /s/ in English (Jongman, Wayland, &amp; Wong, 2000), both of these </w:t>
+        <w:t xml:space="preserve">from /s/ in English (Jongman, Wayland, &amp; Wong, 2000), </w:t>
+      </w:r>
+      <w:proofErr w:type="gramStart"/>
+      <w:r>
+        <w:rPr>
+          <w:szCs w:val="22"/>
+        </w:rPr>
+        <w:t>both of these</w:t>
+      </w:r>
+      <w:proofErr w:type="gramEnd"/>
+      <w:r>
+        <w:rPr>
+          <w:szCs w:val="22"/>
+        </w:rPr>
+        <w:t xml:space="preserve"> </w:t>
       </w:r>
       <w:r>
         <w:rPr>
@@ -2190,7 +2246,21 @@
         <w:rPr>
           <w:szCs w:val="22"/>
         </w:rPr>
-        <w:t xml:space="preserve">te for either or both of these effects of the pen on articulation, it should bias their perception towards </w:t>
+        <w:t xml:space="preserve">te for either or </w:t>
+      </w:r>
+      <w:proofErr w:type="gramStart"/>
+      <w:r>
+        <w:rPr>
+          <w:szCs w:val="22"/>
+        </w:rPr>
+        <w:t>both of these</w:t>
+      </w:r>
+      <w:proofErr w:type="gramEnd"/>
+      <w:r>
+        <w:rPr>
+          <w:szCs w:val="22"/>
+        </w:rPr>
+        <w:t xml:space="preserve"> effects of the pen on articulation, it should bias their perception towards </w:t>
       </w:r>
       <w:r>
         <w:rPr>
@@ -2554,7 +2624,21 @@
         <w:rPr>
           <w:szCs w:val="22"/>
         </w:rPr>
-        <w:t xml:space="preserve"> remained a matter of theoretical debate, and competing proposals appeal to different</w:t>
+        <w:t xml:space="preserve"> remained a matter of theoretical </w:t>
+      </w:r>
+      <w:proofErr w:type="gramStart"/>
+      <w:r>
+        <w:rPr>
+          <w:szCs w:val="22"/>
+        </w:rPr>
+        <w:t>debate, and</w:t>
+      </w:r>
+      <w:proofErr w:type="gramEnd"/>
+      <w:r>
+        <w:rPr>
+          <w:szCs w:val="22"/>
+        </w:rPr>
+        <w:t xml:space="preserve"> competing proposals appeal to different</w:t>
       </w:r>
       <w:r>
         <w:rPr>
@@ -3200,8 +3284,13 @@
       <w:r>
         <w:t xml:space="preserve"> </w:t>
       </w:r>
-      <w:r>
-        <w:t xml:space="preserve">With regard to ethnicity, </w:t>
+      <w:proofErr w:type="gramStart"/>
+      <w:r>
+        <w:t>With regard to</w:t>
+      </w:r>
+      <w:proofErr w:type="gramEnd"/>
+      <w:r>
+        <w:t xml:space="preserve"> ethnicity, </w:t>
       </w:r>
       <w:r>
         <w:t>8.5</w:t>
@@ -3225,13 +3314,21 @@
         <w:t>1.9</w:t>
       </w:r>
       <w:r>
-        <w:t>% declined to report. With</w:t>
+        <w:t xml:space="preserve">% declined to report. </w:t>
+      </w:r>
+      <w:proofErr w:type="gramStart"/>
+      <w:r>
+        <w:t>With</w:t>
       </w:r>
       <w:r>
         <w:t xml:space="preserve"> </w:t>
       </w:r>
       <w:r>
-        <w:t>regard to race, 7</w:t>
+        <w:t>regard to</w:t>
+      </w:r>
+      <w:proofErr w:type="gramEnd"/>
+      <w:r>
+        <w:t xml:space="preserve"> race, 7</w:t>
       </w:r>
       <w:r>
         <w:t>2.7</w:t>
@@ -3279,8 +3376,13 @@
         <w:t xml:space="preserve"> </w:t>
       </w:r>
       <w:r>
-        <w:t>American Indian/Alaska Native or Native Hawaiian or other</w:t>
-      </w:r>
+        <w:t xml:space="preserve">American Indian/Alaska Native or Native Hawaiian or </w:t>
+      </w:r>
+      <w:proofErr w:type="gramStart"/>
+      <w:r>
+        <w:t>other</w:t>
+      </w:r>
+      <w:proofErr w:type="gramEnd"/>
       <w:r>
         <w:t xml:space="preserve"> </w:t>
       </w:r>
@@ -4191,7 +4293,21 @@
         <w:rPr>
           <w:szCs w:val="22"/>
         </w:rPr>
-        <w:t>The use of audiovisual stimuli comes with unique challenges. While our goal was to investigate how the presence of the pen affects the perception of the acoustic input, the use of audiovisual stimuli entails that participants also had access to visual cues to the /s/-/ʃ/ contrast</w:t>
+        <w:t xml:space="preserve">The use of audiovisual stimuli comes with unique challenges. While our goal was to investigate how the presence of the pen affects the perception of the acoustic input, the use of audiovisual stimuli entails </w:t>
+      </w:r>
+      <w:proofErr w:type="gramStart"/>
+      <w:r>
+        <w:rPr>
+          <w:szCs w:val="22"/>
+        </w:rPr>
+        <w:t>that participants</w:t>
+      </w:r>
+      <w:proofErr w:type="gramEnd"/>
+      <w:r>
+        <w:rPr>
+          <w:szCs w:val="22"/>
+        </w:rPr>
+        <w:t xml:space="preserve"> also had access to visual cues to the /s/-/ʃ/ contrast</w:t>
       </w:r>
       <w:r>
         <w:rPr>
@@ -4203,21 +4319,7 @@
         <w:rPr>
           <w:szCs w:val="22"/>
         </w:rPr>
-        <w:t xml:space="preserve">Proctor, </w:t>
-      </w:r>
-      <w:proofErr w:type="spellStart"/>
-      <w:r>
-        <w:rPr>
-          <w:szCs w:val="22"/>
-        </w:rPr>
-        <w:t>Shadle</w:t>
-      </w:r>
-      <w:proofErr w:type="spellEnd"/>
-      <w:r>
-        <w:rPr>
-          <w:szCs w:val="22"/>
-        </w:rPr>
-        <w:t xml:space="preserve">, &amp; </w:t>
+        <w:t xml:space="preserve">Proctor, Shadle, &amp; </w:t>
       </w:r>
       <w:proofErr w:type="spellStart"/>
       <w:r>
@@ -4573,7 +4675,21 @@
         <w:rPr>
           <w:szCs w:val="22"/>
         </w:rPr>
-        <w:t xml:space="preserve"> sequence highly similar to </w:t>
+        <w:t xml:space="preserve"> sequence highly </w:t>
+      </w:r>
+      <w:proofErr w:type="gramStart"/>
+      <w:r>
+        <w:rPr>
+          <w:szCs w:val="22"/>
+        </w:rPr>
+        <w:t>similar to</w:t>
+      </w:r>
+      <w:proofErr w:type="gramEnd"/>
+      <w:r>
+        <w:rPr>
+          <w:szCs w:val="22"/>
+        </w:rPr>
+        <w:t xml:space="preserve"> </w:t>
       </w:r>
       <w:proofErr w:type="spellStart"/>
       <w:r>
@@ -6298,13 +6414,27 @@
         <w:rPr>
           <w:szCs w:val="22"/>
         </w:rPr>
-        <w:t xml:space="preserve"> required sound sequence similar </w:t>
-      </w:r>
-      <w:r>
-        <w:rPr>
-          <w:szCs w:val="22"/>
-        </w:rPr>
-        <w:t xml:space="preserve">to </w:t>
+        <w:t xml:space="preserve"> required sound sequence </w:t>
+      </w:r>
+      <w:proofErr w:type="gramStart"/>
+      <w:r>
+        <w:rPr>
+          <w:szCs w:val="22"/>
+        </w:rPr>
+        <w:t xml:space="preserve">similar </w:t>
+      </w:r>
+      <w:r>
+        <w:rPr>
+          <w:szCs w:val="22"/>
+        </w:rPr>
+        <w:t>to</w:t>
+      </w:r>
+      <w:proofErr w:type="gramEnd"/>
+      <w:r>
+        <w:rPr>
+          <w:szCs w:val="22"/>
+        </w:rPr>
+        <w:t xml:space="preserve"> </w:t>
       </w:r>
       <w:proofErr w:type="spellStart"/>
       <w:r>
@@ -7017,7 +7147,21 @@
         <w:rPr>
           <w:szCs w:val="22"/>
         </w:rPr>
-        <w:t xml:space="preserve">, but in order to start the experiment, participants had to accept the </w:t>
+        <w:t xml:space="preserve">, but </w:t>
+      </w:r>
+      <w:proofErr w:type="gramStart"/>
+      <w:r>
+        <w:rPr>
+          <w:szCs w:val="22"/>
+        </w:rPr>
+        <w:t>in order to</w:t>
+      </w:r>
+      <w:proofErr w:type="gramEnd"/>
+      <w:r>
+        <w:rPr>
+          <w:szCs w:val="22"/>
+        </w:rPr>
+        <w:t xml:space="preserve"> start the experiment, participants had to accept the </w:t>
       </w:r>
       <w:r>
         <w:rPr>
@@ -7272,7 +7416,21 @@
         <w:rPr>
           <w:szCs w:val="22"/>
         </w:rPr>
-        <w:t xml:space="preserve">. None of the trials during the test phase actually contained a white dot. Participants then completed 72 trials of a </w:t>
+        <w:t xml:space="preserve">. None of the trials during the test phase </w:t>
+      </w:r>
+      <w:proofErr w:type="gramStart"/>
+      <w:r>
+        <w:rPr>
+          <w:szCs w:val="22"/>
+        </w:rPr>
+        <w:t>actually contained</w:t>
+      </w:r>
+      <w:proofErr w:type="gramEnd"/>
+      <w:r>
+        <w:rPr>
+          <w:szCs w:val="22"/>
+        </w:rPr>
+        <w:t xml:space="preserve"> a white dot. Participants then completed 72 trials of a </w:t>
       </w:r>
       <w:r>
         <w:rPr>
@@ -8185,14 +8343,27 @@
       <w:r>
         <w:t xml:space="preserve">able </w:t>
       </w:r>
-      <w:fldSimple w:instr=" SEQ Table \* ARABIC ">
-        <w:r>
-          <w:rPr>
-            <w:noProof/>
-          </w:rPr>
-          <w:t>1</w:t>
-        </w:r>
-      </w:fldSimple>
+      <w:r>
+        <w:fldChar w:fldCharType="begin"/>
+      </w:r>
+      <w:r>
+        <w:instrText xml:space="preserve"> SEQ Table \* ARABIC </w:instrText>
+      </w:r>
+      <w:r>
+        <w:fldChar w:fldCharType="separate"/>
+      </w:r>
+      <w:r>
+        <w:rPr>
+          <w:noProof/>
+        </w:rPr>
+        <w:t>1</w:t>
+      </w:r>
+      <w:r>
+        <w:rPr>
+          <w:noProof/>
+        </w:rPr>
+        <w:fldChar w:fldCharType="end"/>
+      </w:r>
       <w:bookmarkEnd w:id="1"/>
       <w:r>
         <w:tab/>
@@ -12335,7 +12506,13 @@
               <w:rPr>
                 <w:szCs w:val="22"/>
               </w:rPr>
-              <w:t>-.68</w:t>
+              <w:t>-.</w:t>
+            </w:r>
+            <w:r>
+              <w:rPr>
+                <w:szCs w:val="22"/>
+              </w:rPr>
+              <w:t>71</w:t>
             </w:r>
           </w:p>
         </w:tc>
@@ -12360,7 +12537,7 @@
               <w:rPr>
                 <w:szCs w:val="22"/>
               </w:rPr>
-              <w:t>165.7</w:t>
+              <w:t>306.7</w:t>
             </w:r>
           </w:p>
         </w:tc>
@@ -12386,7 +12563,13 @@
               <w:rPr>
                 <w:szCs w:val="22"/>
               </w:rPr>
-              <w:t>.994</w:t>
+              <w:t>.99</w:t>
+            </w:r>
+            <w:r>
+              <w:rPr>
+                <w:szCs w:val="22"/>
+              </w:rPr>
+              <w:t>7</w:t>
             </w:r>
           </w:p>
         </w:tc>
@@ -12412,7 +12595,13 @@
               <w:rPr>
                 <w:szCs w:val="22"/>
               </w:rPr>
-              <w:t>-.40</w:t>
+              <w:t>-.</w:t>
+            </w:r>
+            <w:r>
+              <w:rPr>
+                <w:szCs w:val="22"/>
+              </w:rPr>
+              <w:t>34</w:t>
             </w:r>
           </w:p>
         </w:tc>
@@ -12437,7 +12626,19 @@
               <w:rPr>
                 <w:szCs w:val="22"/>
               </w:rPr>
-              <w:t>18.9</w:t>
+              <w:t>1</w:t>
+            </w:r>
+            <w:r>
+              <w:rPr>
+                <w:szCs w:val="22"/>
+              </w:rPr>
+              <w:t>2</w:t>
+            </w:r>
+            <w:r>
+              <w:rPr>
+                <w:szCs w:val="22"/>
+              </w:rPr>
+              <w:t>.9</w:t>
             </w:r>
           </w:p>
         </w:tc>
@@ -12463,7 +12664,13 @@
               <w:rPr>
                 <w:szCs w:val="22"/>
               </w:rPr>
-              <w:t>.950</w:t>
+              <w:t>.9</w:t>
+            </w:r>
+            <w:r>
+              <w:rPr>
+                <w:szCs w:val="22"/>
+              </w:rPr>
+              <w:t>28</w:t>
             </w:r>
           </w:p>
         </w:tc>
@@ -12489,7 +12696,13 @@
               <w:rPr>
                 <w:szCs w:val="22"/>
               </w:rPr>
-              <w:t>-.49</w:t>
+              <w:t>-.4</w:t>
+            </w:r>
+            <w:r>
+              <w:rPr>
+                <w:szCs w:val="22"/>
+              </w:rPr>
+              <w:t>8</w:t>
             </w:r>
           </w:p>
         </w:tc>
@@ -12514,7 +12727,7 @@
               <w:rPr>
                 <w:szCs w:val="22"/>
               </w:rPr>
-              <w:t>21.1</w:t>
+              <w:t>20.5</w:t>
             </w:r>
           </w:p>
         </w:tc>
@@ -12539,7 +12752,13 @@
               <w:rPr>
                 <w:szCs w:val="22"/>
               </w:rPr>
-              <w:t>.955</w:t>
+              <w:t>.95</w:t>
+            </w:r>
+            <w:r>
+              <w:rPr>
+                <w:szCs w:val="22"/>
+              </w:rPr>
+              <w:t>4</w:t>
             </w:r>
           </w:p>
         </w:tc>
@@ -12651,7 +12870,7 @@
               <w:rPr>
                 <w:szCs w:val="22"/>
               </w:rPr>
-              <w:t>.01</w:t>
+              <w:t>-.04</w:t>
             </w:r>
           </w:p>
         </w:tc>
@@ -12674,7 +12893,7 @@
               <w:rPr>
                 <w:szCs w:val="22"/>
               </w:rPr>
-              <w:t>.8</w:t>
+              <w:t>3.0</w:t>
             </w:r>
           </w:p>
         </w:tc>
@@ -12700,7 +12919,13 @@
               <w:rPr>
                 <w:szCs w:val="22"/>
               </w:rPr>
-              <w:t>.442</w:t>
+              <w:t>.</w:t>
+            </w:r>
+            <w:r>
+              <w:rPr>
+                <w:szCs w:val="22"/>
+              </w:rPr>
+              <w:t>750</w:t>
             </w:r>
           </w:p>
         </w:tc>
@@ -12726,7 +12951,13 @@
               <w:rPr>
                 <w:szCs w:val="22"/>
               </w:rPr>
-              <w:t>-.04</w:t>
+              <w:t>-.0</w:t>
+            </w:r>
+            <w:r>
+              <w:rPr>
+                <w:szCs w:val="22"/>
+              </w:rPr>
+              <w:t>3</w:t>
             </w:r>
           </w:p>
         </w:tc>
@@ -12749,7 +12980,7 @@
               <w:rPr>
                 <w:szCs w:val="22"/>
               </w:rPr>
-              <w:t>3.6</w:t>
+              <w:t>2.7</w:t>
             </w:r>
           </w:p>
         </w:tc>
@@ -12775,7 +13006,13 @@
               <w:rPr>
                 <w:szCs w:val="22"/>
               </w:rPr>
-              <w:t>.783</w:t>
+              <w:t>.7</w:t>
+            </w:r>
+            <w:r>
+              <w:rPr>
+                <w:szCs w:val="22"/>
+              </w:rPr>
+              <w:t>32</w:t>
             </w:r>
           </w:p>
         </w:tc>
@@ -12823,7 +13060,7 @@
               <w:rPr>
                 <w:szCs w:val="22"/>
               </w:rPr>
-              <w:t>26.0</w:t>
+              <w:t>19.9</w:t>
             </w:r>
           </w:p>
         </w:tc>
@@ -12846,7 +13083,13 @@
               <w:rPr>
                 <w:szCs w:val="22"/>
               </w:rPr>
-              <w:t>.963</w:t>
+              <w:t>.9</w:t>
+            </w:r>
+            <w:r>
+              <w:rPr>
+                <w:szCs w:val="22"/>
+              </w:rPr>
+              <w:t>52</w:t>
             </w:r>
           </w:p>
         </w:tc>
@@ -12966,7 +13209,13 @@
               <w:rPr>
                 <w:szCs w:val="22"/>
               </w:rPr>
-              <w:t>-.37</w:t>
+              <w:t>-.</w:t>
+            </w:r>
+            <w:r>
+              <w:rPr>
+                <w:szCs w:val="22"/>
+              </w:rPr>
+              <w:t>49</w:t>
             </w:r>
           </w:p>
         </w:tc>
@@ -12989,7 +13238,7 @@
               <w:rPr>
                 <w:szCs w:val="22"/>
               </w:rPr>
-              <w:t>7.5</w:t>
+              <w:t>11.2</w:t>
             </w:r>
           </w:p>
         </w:tc>
@@ -13015,7 +13264,13 @@
               <w:rPr>
                 <w:szCs w:val="22"/>
               </w:rPr>
-              <w:t>.883</w:t>
+              <w:t>.</w:t>
+            </w:r>
+            <w:r>
+              <w:rPr>
+                <w:szCs w:val="22"/>
+              </w:rPr>
+              <w:t>918</w:t>
             </w:r>
           </w:p>
         </w:tc>
@@ -13041,7 +13296,19 @@
               <w:rPr>
                 <w:szCs w:val="22"/>
               </w:rPr>
-              <w:t>-.30</w:t>
+              <w:t>-.</w:t>
+            </w:r>
+            <w:r>
+              <w:rPr>
+                <w:szCs w:val="22"/>
+              </w:rPr>
+              <w:t>2</w:t>
+            </w:r>
+            <w:r>
+              <w:rPr>
+                <w:szCs w:val="22"/>
+              </w:rPr>
+              <w:t>0</w:t>
             </w:r>
           </w:p>
         </w:tc>
@@ -13064,7 +13331,19 @@
               <w:rPr>
                 <w:szCs w:val="22"/>
               </w:rPr>
-              <w:t>6.6</w:t>
+              <w:t>2</w:t>
+            </w:r>
+            <w:r>
+              <w:rPr>
+                <w:szCs w:val="22"/>
+              </w:rPr>
+              <w:t>.</w:t>
+            </w:r>
+            <w:r>
+              <w:rPr>
+                <w:szCs w:val="22"/>
+              </w:rPr>
+              <w:t>4</w:t>
             </w:r>
           </w:p>
         </w:tc>
@@ -13090,7 +13369,13 @@
               <w:rPr>
                 <w:szCs w:val="22"/>
               </w:rPr>
-              <w:t>.868</w:t>
+              <w:t>.</w:t>
+            </w:r>
+            <w:r>
+              <w:rPr>
+                <w:szCs w:val="22"/>
+              </w:rPr>
+              <w:t>706</w:t>
             </w:r>
           </w:p>
         </w:tc>
@@ -13116,7 +13401,13 @@
               <w:rPr>
                 <w:szCs w:val="22"/>
               </w:rPr>
-              <w:t>-.77</w:t>
+              <w:t>-.</w:t>
+            </w:r>
+            <w:r>
+              <w:rPr>
+                <w:szCs w:val="22"/>
+              </w:rPr>
+              <w:t>93</w:t>
             </w:r>
           </w:p>
         </w:tc>
@@ -13139,7 +13430,7 @@
               <w:rPr>
                 <w:szCs w:val="22"/>
               </w:rPr>
-              <w:t>132.3</w:t>
+              <w:t>80.6</w:t>
             </w:r>
           </w:p>
         </w:tc>
@@ -13162,7 +13453,13 @@
               <w:rPr>
                 <w:szCs w:val="22"/>
               </w:rPr>
-              <w:t>.992</w:t>
+              <w:t>.9</w:t>
+            </w:r>
+            <w:r>
+              <w:rPr>
+                <w:szCs w:val="22"/>
+              </w:rPr>
+              <w:t>88</w:t>
             </w:r>
           </w:p>
         </w:tc>
@@ -13316,7 +13613,13 @@
               <w:rPr>
                 <w:szCs w:val="22"/>
               </w:rPr>
-              <w:t>-.13</w:t>
+              <w:t>-.</w:t>
+            </w:r>
+            <w:r>
+              <w:rPr>
+                <w:szCs w:val="22"/>
+              </w:rPr>
+              <w:t>09</w:t>
             </w:r>
           </w:p>
         </w:tc>
@@ -13342,7 +13645,19 @@
               <w:rPr>
                 <w:szCs w:val="22"/>
               </w:rPr>
-              <w:t>9.8</w:t>
+              <w:t>3</w:t>
+            </w:r>
+            <w:r>
+              <w:rPr>
+                <w:szCs w:val="22"/>
+              </w:rPr>
+              <w:t>.</w:t>
+            </w:r>
+            <w:r>
+              <w:rPr>
+                <w:szCs w:val="22"/>
+              </w:rPr>
+              <w:t>9</w:t>
             </w:r>
           </w:p>
         </w:tc>
@@ -13369,7 +13684,13 @@
               <w:rPr>
                 <w:szCs w:val="22"/>
               </w:rPr>
-              <w:t>.907</w:t>
+              <w:t>.</w:t>
+            </w:r>
+            <w:r>
+              <w:rPr>
+                <w:szCs w:val="22"/>
+              </w:rPr>
+              <w:t>795</w:t>
             </w:r>
           </w:p>
         </w:tc>
@@ -13396,7 +13717,19 @@
               <w:rPr>
                 <w:szCs w:val="22"/>
               </w:rPr>
-              <w:t>.01</w:t>
+              <w:t>-</w:t>
+            </w:r>
+            <w:r>
+              <w:rPr>
+                <w:szCs w:val="22"/>
+              </w:rPr>
+              <w:t>.0</w:t>
+            </w:r>
+            <w:r>
+              <w:rPr>
+                <w:szCs w:val="22"/>
+              </w:rPr>
+              <w:t>2</w:t>
             </w:r>
           </w:p>
         </w:tc>
@@ -13422,7 +13755,7 @@
               <w:rPr>
                 <w:szCs w:val="22"/>
               </w:rPr>
-              <w:t>.8</w:t>
+              <w:t>1.2</w:t>
             </w:r>
           </w:p>
         </w:tc>
@@ -13449,7 +13782,13 @@
               <w:rPr>
                 <w:szCs w:val="22"/>
               </w:rPr>
-              <w:t>.43</w:t>
+              <w:t>.</w:t>
+            </w:r>
+            <w:r>
+              <w:rPr>
+                <w:szCs w:val="22"/>
+              </w:rPr>
+              <w:t>55</w:t>
             </w:r>
           </w:p>
         </w:tc>
@@ -13476,7 +13815,13 @@
               <w:rPr>
                 <w:szCs w:val="22"/>
               </w:rPr>
-              <w:t>-.10</w:t>
+              <w:t>-.</w:t>
+            </w:r>
+            <w:r>
+              <w:rPr>
+                <w:szCs w:val="22"/>
+              </w:rPr>
+              <w:t>04</w:t>
             </w:r>
           </w:p>
         </w:tc>
@@ -13502,7 +13847,13 @@
               <w:rPr>
                 <w:szCs w:val="22"/>
               </w:rPr>
-              <w:t>11.2</w:t>
+              <w:t>2</w:t>
+            </w:r>
+            <w:r>
+              <w:rPr>
+                <w:szCs w:val="22"/>
+              </w:rPr>
+              <w:t>.2</w:t>
             </w:r>
           </w:p>
         </w:tc>
@@ -13528,7 +13879,13 @@
               <w:rPr>
                 <w:szCs w:val="22"/>
               </w:rPr>
-              <w:t>.918</w:t>
+              <w:t>.</w:t>
+            </w:r>
+            <w:r>
+              <w:rPr>
+                <w:szCs w:val="22"/>
+              </w:rPr>
+              <w:t>686</w:t>
             </w:r>
           </w:p>
         </w:tc>
@@ -13679,7 +14036,13 @@
               <w:rPr>
                 <w:szCs w:val="22"/>
               </w:rPr>
-              <w:t>.29</w:t>
+              <w:t>.2</w:t>
+            </w:r>
+            <w:r>
+              <w:rPr>
+                <w:szCs w:val="22"/>
+              </w:rPr>
+              <w:t>0</w:t>
             </w:r>
           </w:p>
         </w:tc>
@@ -13762,7 +14125,13 @@
               <w:rPr>
                 <w:szCs w:val="22"/>
               </w:rPr>
-              <w:t>.28</w:t>
+              <w:t>.2</w:t>
+            </w:r>
+            <w:r>
+              <w:rPr>
+                <w:szCs w:val="22"/>
+              </w:rPr>
+              <w:t>4</w:t>
             </w:r>
           </w:p>
         </w:tc>
@@ -13845,7 +14214,13 @@
               <w:rPr>
                 <w:szCs w:val="22"/>
               </w:rPr>
-              <w:t>.34</w:t>
+              <w:t>.</w:t>
+            </w:r>
+            <w:r>
+              <w:rPr>
+                <w:szCs w:val="22"/>
+              </w:rPr>
+              <w:t>29</w:t>
             </w:r>
           </w:p>
         </w:tc>
@@ -14050,7 +14425,13 @@
               <w:rPr>
                 <w:szCs w:val="22"/>
               </w:rPr>
-              <w:t>.50</w:t>
+              <w:t>.</w:t>
+            </w:r>
+            <w:r>
+              <w:rPr>
+                <w:szCs w:val="22"/>
+              </w:rPr>
+              <w:t>49</w:t>
             </w:r>
           </w:p>
         </w:tc>
@@ -14072,7 +14453,25 @@
               <w:rPr>
                 <w:szCs w:val="22"/>
               </w:rPr>
-              <w:t>71.7</w:t>
+              <w:t>7</w:t>
+            </w:r>
+            <w:r>
+              <w:rPr>
+                <w:szCs w:val="22"/>
+              </w:rPr>
+              <w:t>5</w:t>
+            </w:r>
+            <w:r>
+              <w:rPr>
+                <w:szCs w:val="22"/>
+              </w:rPr>
+              <w:t>.</w:t>
+            </w:r>
+            <w:r>
+              <w:rPr>
+                <w:szCs w:val="22"/>
+              </w:rPr>
+              <w:t>9</w:t>
             </w:r>
           </w:p>
         </w:tc>
@@ -14097,7 +14496,13 @@
               <w:rPr>
                 <w:szCs w:val="22"/>
               </w:rPr>
-              <w:t>.986</w:t>
+              <w:t>.98</w:t>
+            </w:r>
+            <w:r>
+              <w:rPr>
+                <w:szCs w:val="22"/>
+              </w:rPr>
+              <w:t>7</w:t>
             </w:r>
           </w:p>
         </w:tc>
@@ -14122,7 +14527,13 @@
               <w:rPr>
                 <w:szCs w:val="22"/>
               </w:rPr>
-              <w:t>1.08</w:t>
+              <w:t>1.0</w:t>
+            </w:r>
+            <w:r>
+              <w:rPr>
+                <w:szCs w:val="22"/>
+              </w:rPr>
+              <w:t>6</w:t>
             </w:r>
           </w:p>
         </w:tc>
@@ -14200,7 +14611,13 @@
               <w:rPr>
                 <w:szCs w:val="22"/>
               </w:rPr>
-              <w:t>.41</w:t>
+              <w:t>.4</w:t>
+            </w:r>
+            <w:r>
+              <w:rPr>
+                <w:szCs w:val="22"/>
+              </w:rPr>
+              <w:t>4</w:t>
             </w:r>
           </w:p>
         </w:tc>
@@ -14222,7 +14639,25 @@
               <w:rPr>
                 <w:szCs w:val="22"/>
               </w:rPr>
-              <w:t>20.3</w:t>
+              <w:t>2</w:t>
+            </w:r>
+            <w:r>
+              <w:rPr>
+                <w:szCs w:val="22"/>
+              </w:rPr>
+              <w:t>7</w:t>
+            </w:r>
+            <w:r>
+              <w:rPr>
+                <w:szCs w:val="22"/>
+              </w:rPr>
+              <w:t>.</w:t>
+            </w:r>
+            <w:r>
+              <w:rPr>
+                <w:szCs w:val="22"/>
+              </w:rPr>
+              <w:t>4</w:t>
             </w:r>
           </w:p>
         </w:tc>
@@ -14244,7 +14679,13 @@
               <w:rPr>
                 <w:szCs w:val="22"/>
               </w:rPr>
-              <w:t>.953</w:t>
+              <w:t>.9</w:t>
+            </w:r>
+            <w:r>
+              <w:rPr>
+                <w:szCs w:val="22"/>
+              </w:rPr>
+              <w:t>65</w:t>
             </w:r>
           </w:p>
         </w:tc>
@@ -14305,7 +14746,7 @@
               <w:rPr>
                 <w:szCs w:val="22"/>
               </w:rPr>
-              <w:t>.12</w:t>
+              <w:t>-.11</w:t>
             </w:r>
           </w:p>
         </w:tc>
@@ -14331,7 +14772,7 @@
               <w:rPr>
                 <w:szCs w:val="22"/>
               </w:rPr>
-              <w:t>8.4</w:t>
+              <w:t>10.5</w:t>
             </w:r>
           </w:p>
         </w:tc>
@@ -14358,7 +14799,13 @@
               <w:rPr>
                 <w:szCs w:val="22"/>
               </w:rPr>
-              <w:t>.894</w:t>
+              <w:t>.</w:t>
+            </w:r>
+            <w:r>
+              <w:rPr>
+                <w:szCs w:val="22"/>
+              </w:rPr>
+              <w:t>913</w:t>
             </w:r>
           </w:p>
         </w:tc>
@@ -14411,7 +14858,7 @@
               <w:rPr>
                 <w:szCs w:val="22"/>
               </w:rPr>
-              <w:t>48.4</w:t>
+              <w:t>50.4</w:t>
             </w:r>
           </w:p>
         </w:tc>
@@ -14438,7 +14885,13 @@
               <w:rPr>
                 <w:szCs w:val="22"/>
               </w:rPr>
-              <w:t>.980</w:t>
+              <w:t>.98</w:t>
+            </w:r>
+            <w:r>
+              <w:rPr>
+                <w:szCs w:val="22"/>
+              </w:rPr>
+              <w:t>1</w:t>
             </w:r>
           </w:p>
         </w:tc>
@@ -14465,7 +14918,13 @@
               <w:rPr>
                 <w:szCs w:val="22"/>
               </w:rPr>
-              <w:t>.01</w:t>
+              <w:t>.0</w:t>
+            </w:r>
+            <w:r>
+              <w:rPr>
+                <w:szCs w:val="22"/>
+              </w:rPr>
+              <w:t>2</w:t>
             </w:r>
           </w:p>
         </w:tc>
@@ -14491,7 +14950,25 @@
               <w:rPr>
                 <w:szCs w:val="22"/>
               </w:rPr>
-              <w:t>48.0</w:t>
+              <w:t>4</w:t>
+            </w:r>
+            <w:r>
+              <w:rPr>
+                <w:szCs w:val="22"/>
+              </w:rPr>
+              <w:t>7</w:t>
+            </w:r>
+            <w:r>
+              <w:rPr>
+                <w:szCs w:val="22"/>
+              </w:rPr>
+              <w:t>.</w:t>
+            </w:r>
+            <w:r>
+              <w:rPr>
+                <w:szCs w:val="22"/>
+              </w:rPr>
+              <w:t>1</w:t>
             </w:r>
           </w:p>
         </w:tc>
@@ -14517,7 +14994,13 @@
               <w:rPr>
                 <w:szCs w:val="22"/>
               </w:rPr>
-              <w:t>.980</w:t>
+              <w:t>.9</w:t>
+            </w:r>
+            <w:r>
+              <w:rPr>
+                <w:szCs w:val="22"/>
+              </w:rPr>
+              <w:t>79</w:t>
             </w:r>
           </w:p>
         </w:tc>
@@ -14577,7 +15060,13 @@
               <w:rPr>
                 <w:szCs w:val="22"/>
               </w:rPr>
-              <w:t>.19</w:t>
+              <w:t>.</w:t>
+            </w:r>
+            <w:r>
+              <w:rPr>
+                <w:szCs w:val="22"/>
+              </w:rPr>
+              <w:t>09</w:t>
             </w:r>
           </w:p>
         </w:tc>
@@ -14603,7 +15092,7 @@
               <w:rPr>
                 <w:szCs w:val="22"/>
               </w:rPr>
-              <w:t>18.6</w:t>
+              <w:t>37.0</w:t>
             </w:r>
           </w:p>
         </w:tc>
@@ -14630,7 +15119,13 @@
               <w:rPr>
                 <w:szCs w:val="22"/>
               </w:rPr>
-              <w:t>.949</w:t>
+              <w:t>.9</w:t>
+            </w:r>
+            <w:r>
+              <w:rPr>
+                <w:szCs w:val="22"/>
+              </w:rPr>
+              <w:t>74</w:t>
             </w:r>
           </w:p>
         </w:tc>
@@ -14683,7 +15178,7 @@
               <w:rPr>
                 <w:szCs w:val="22"/>
               </w:rPr>
-              <w:t>72.7</w:t>
+              <w:t>130.3</w:t>
             </w:r>
           </w:p>
         </w:tc>
@@ -14710,7 +15205,13 @@
               <w:rPr>
                 <w:szCs w:val="22"/>
               </w:rPr>
-              <w:t>.986</w:t>
+              <w:t>.9</w:t>
+            </w:r>
+            <w:r>
+              <w:rPr>
+                <w:szCs w:val="22"/>
+              </w:rPr>
+              <w:t>92</w:t>
             </w:r>
           </w:p>
         </w:tc>
@@ -14737,7 +15238,13 @@
               <w:rPr>
                 <w:szCs w:val="22"/>
               </w:rPr>
-              <w:t>-.09</w:t>
+              <w:t>.0</w:t>
+            </w:r>
+            <w:r>
+              <w:rPr>
+                <w:szCs w:val="22"/>
+              </w:rPr>
+              <w:t>8</w:t>
             </w:r>
           </w:p>
         </w:tc>
@@ -14763,7 +15270,7 @@
               <w:rPr>
                 <w:szCs w:val="22"/>
               </w:rPr>
-              <w:t>54.3</w:t>
+              <w:t>61.6</w:t>
             </w:r>
           </w:p>
         </w:tc>
@@ -14789,7 +15296,13 @@
               <w:rPr>
                 <w:szCs w:val="22"/>
               </w:rPr>
-              <w:t>.982</w:t>
+              <w:t>.98</w:t>
+            </w:r>
+            <w:r>
+              <w:rPr>
+                <w:szCs w:val="22"/>
+              </w:rPr>
+              <w:t>4</w:t>
             </w:r>
           </w:p>
         </w:tc>
@@ -14875,7 +15388,13 @@
               <w:rPr>
                 <w:szCs w:val="22"/>
               </w:rPr>
-              <w:t>-.00</w:t>
+              <w:t>-.0</w:t>
+            </w:r>
+            <w:r>
+              <w:rPr>
+                <w:szCs w:val="22"/>
+              </w:rPr>
+              <w:t>3</w:t>
             </w:r>
           </w:p>
         </w:tc>
@@ -14898,7 +15417,7 @@
               <w:rPr>
                 <w:szCs w:val="22"/>
               </w:rPr>
-              <w:t>36.7</w:t>
+              <w:t>3.9</w:t>
             </w:r>
           </w:p>
         </w:tc>
@@ -14924,7 +15443,13 @@
               <w:rPr>
                 <w:szCs w:val="22"/>
               </w:rPr>
-              <w:t>.973</w:t>
+              <w:t>.</w:t>
+            </w:r>
+            <w:r>
+              <w:rPr>
+                <w:szCs w:val="22"/>
+              </w:rPr>
+              <w:t>795</w:t>
             </w:r>
           </w:p>
         </w:tc>
@@ -14950,7 +15475,13 @@
               <w:rPr>
                 <w:szCs w:val="22"/>
               </w:rPr>
-              <w:t>.00</w:t>
+              <w:t>.0</w:t>
+            </w:r>
+            <w:r>
+              <w:rPr>
+                <w:szCs w:val="22"/>
+              </w:rPr>
+              <w:t>2</w:t>
             </w:r>
           </w:p>
         </w:tc>
@@ -14973,7 +15504,7 @@
               <w:rPr>
                 <w:szCs w:val="22"/>
               </w:rPr>
-              <w:t>81.0</w:t>
+              <w:t>52.5</w:t>
             </w:r>
           </w:p>
         </w:tc>
@@ -14999,7 +15530,13 @@
               <w:rPr>
                 <w:szCs w:val="22"/>
               </w:rPr>
-              <w:t>.988</w:t>
+              <w:t>.98</w:t>
+            </w:r>
+            <w:r>
+              <w:rPr>
+                <w:szCs w:val="22"/>
+              </w:rPr>
+              <w:t>1</w:t>
             </w:r>
           </w:p>
         </w:tc>
@@ -15025,7 +15562,13 @@
               <w:rPr>
                 <w:szCs w:val="22"/>
               </w:rPr>
-              <w:t>-.06</w:t>
+              <w:t>.0</w:t>
+            </w:r>
+            <w:r>
+              <w:rPr>
+                <w:szCs w:val="22"/>
+              </w:rPr>
+              <w:t>2</w:t>
             </w:r>
           </w:p>
         </w:tc>
@@ -15048,7 +15591,7 @@
               <w:rPr>
                 <w:szCs w:val="22"/>
               </w:rPr>
-              <w:t>116.1</w:t>
+              <w:t>2.9</w:t>
             </w:r>
           </w:p>
         </w:tc>
@@ -15071,7 +15614,13 @@
               <w:rPr>
                 <w:szCs w:val="22"/>
               </w:rPr>
-              <w:t>.991</w:t>
+              <w:t>.</w:t>
+            </w:r>
+            <w:r>
+              <w:rPr>
+                <w:szCs w:val="22"/>
+              </w:rPr>
+              <w:t>747</w:t>
             </w:r>
           </w:p>
         </w:tc>
@@ -15157,7 +15706,13 @@
               <w:rPr>
                 <w:szCs w:val="22"/>
               </w:rPr>
-              <w:t>-.07</w:t>
+              <w:t>-.0</w:t>
+            </w:r>
+            <w:r>
+              <w:rPr>
+                <w:szCs w:val="22"/>
+              </w:rPr>
+              <w:t>2</w:t>
             </w:r>
           </w:p>
         </w:tc>
@@ -15180,7 +15735,7 @@
               <w:rPr>
                 <w:szCs w:val="22"/>
               </w:rPr>
-              <w:t>54.2</w:t>
+              <w:t>150.9</w:t>
             </w:r>
           </w:p>
         </w:tc>
@@ -15232,7 +15787,13 @@
               <w:rPr>
                 <w:szCs w:val="22"/>
               </w:rPr>
-              <w:t>-.16</w:t>
+              <w:t>-.</w:t>
+            </w:r>
+            <w:r>
+              <w:rPr>
+                <w:szCs w:val="22"/>
+              </w:rPr>
+              <w:t>14</w:t>
             </w:r>
           </w:p>
         </w:tc>
@@ -15255,7 +15816,7 @@
               <w:rPr>
                 <w:szCs w:val="22"/>
               </w:rPr>
-              <w:t>24.2</w:t>
+              <w:t>11.5</w:t>
             </w:r>
           </w:p>
         </w:tc>
@@ -15281,7 +15842,19 @@
               <w:rPr>
                 <w:szCs w:val="22"/>
               </w:rPr>
-              <w:t>.960</w:t>
+              <w:t>.9</w:t>
+            </w:r>
+            <w:r>
+              <w:rPr>
+                <w:szCs w:val="22"/>
+              </w:rPr>
+              <w:t>2</w:t>
+            </w:r>
+            <w:r>
+              <w:rPr>
+                <w:szCs w:val="22"/>
+              </w:rPr>
+              <w:t>0</w:t>
             </w:r>
           </w:p>
         </w:tc>
@@ -15307,7 +15880,13 @@
               <w:rPr>
                 <w:szCs w:val="22"/>
               </w:rPr>
-              <w:t>-.12</w:t>
+              <w:t>.</w:t>
+            </w:r>
+            <w:r>
+              <w:rPr>
+                <w:szCs w:val="22"/>
+              </w:rPr>
+              <w:t>05</w:t>
             </w:r>
           </w:p>
         </w:tc>
@@ -15330,7 +15909,7 @@
               <w:rPr>
                 <w:szCs w:val="22"/>
               </w:rPr>
-              <w:t>50.5</w:t>
+              <w:t>87.8</w:t>
             </w:r>
           </w:p>
         </w:tc>
@@ -15353,7 +15932,13 @@
               <w:rPr>
                 <w:szCs w:val="22"/>
               </w:rPr>
-              <w:t>.981</w:t>
+              <w:t>.98</w:t>
+            </w:r>
+            <w:r>
+              <w:rPr>
+                <w:szCs w:val="22"/>
+              </w:rPr>
+              <w:t>9</w:t>
             </w:r>
           </w:p>
         </w:tc>
@@ -15408,11 +15993,33 @@
         </w:rPr>
         <w:t xml:space="preserve">if the pen was in the mouth (BFs &gt; </w:t>
       </w:r>
-      <w:r>
-        <w:rPr>
-          <w:szCs w:val="22"/>
-        </w:rPr>
-        <w:t>18.9</w:t>
+      <w:del w:id="4" w:author="Jaeger, Florian" w:date="2025-05-27T14:42:00Z" w16du:dateUtc="2025-05-27T18:42:00Z">
+        <w:r>
+          <w:rPr>
+            <w:szCs w:val="22"/>
+          </w:rPr>
+          <w:delText>18</w:delText>
+        </w:r>
+      </w:del>
+      <w:ins w:id="5" w:author="Jaeger, Florian" w:date="2025-05-27T14:42:00Z" w16du:dateUtc="2025-05-27T18:42:00Z">
+        <w:r>
+          <w:rPr>
+            <w:szCs w:val="22"/>
+          </w:rPr>
+          <w:t>1</w:t>
+        </w:r>
+        <w:r>
+          <w:rPr>
+            <w:szCs w:val="22"/>
+          </w:rPr>
+          <w:t>2</w:t>
+        </w:r>
+      </w:ins>
+      <w:r>
+        <w:rPr>
+          <w:szCs w:val="22"/>
+        </w:rPr>
+        <w:t>.9</w:t>
       </w:r>
       <w:r>
         <w:rPr>
@@ -15452,8 +16059,24 @@
         <w:rPr>
           <w:szCs w:val="22"/>
         </w:rPr>
-        <w:t xml:space="preserve"> 26.0</w:t>
-      </w:r>
+        <w:t xml:space="preserve"> </w:t>
+      </w:r>
+      <w:del w:id="6" w:author="Jaeger, Florian" w:date="2025-05-27T14:43:00Z" w16du:dateUtc="2025-05-27T18:43:00Z">
+        <w:r>
+          <w:rPr>
+            <w:szCs w:val="22"/>
+          </w:rPr>
+          <w:delText>26.0</w:delText>
+        </w:r>
+      </w:del>
+      <w:ins w:id="7" w:author="Jaeger, Florian" w:date="2025-05-27T14:43:00Z" w16du:dateUtc="2025-05-27T18:43:00Z">
+        <w:r>
+          <w:rPr>
+            <w:szCs w:val="22"/>
+          </w:rPr>
+          <w:t>19.9</w:t>
+        </w:r>
+      </w:ins>
       <w:r>
         <w:rPr>
           <w:szCs w:val="22"/>
@@ -15595,12 +16218,50 @@
         </w:rPr>
         <w:t xml:space="preserve">) and visual bias (BFs &gt; </w:t>
       </w:r>
-      <w:r>
-        <w:rPr>
-          <w:szCs w:val="22"/>
-        </w:rPr>
-        <w:t>20.3</w:t>
-      </w:r>
+      <w:del w:id="8" w:author="Jaeger, Florian" w:date="2025-05-27T14:43:00Z" w16du:dateUtc="2025-05-27T18:43:00Z">
+        <w:r>
+          <w:rPr>
+            <w:szCs w:val="22"/>
+          </w:rPr>
+          <w:delText>20</w:delText>
+        </w:r>
+      </w:del>
+      <w:ins w:id="9" w:author="Jaeger, Florian" w:date="2025-05-27T14:43:00Z" w16du:dateUtc="2025-05-27T18:43:00Z">
+        <w:r>
+          <w:rPr>
+            <w:szCs w:val="22"/>
+          </w:rPr>
+          <w:t>2</w:t>
+        </w:r>
+        <w:r>
+          <w:rPr>
+            <w:szCs w:val="22"/>
+          </w:rPr>
+          <w:t>7</w:t>
+        </w:r>
+      </w:ins>
+      <w:r>
+        <w:rPr>
+          <w:szCs w:val="22"/>
+        </w:rPr>
+        <w:t>.</w:t>
+      </w:r>
+      <w:ins w:id="10" w:author="Jaeger, Florian" w:date="2025-05-27T14:43:00Z" w16du:dateUtc="2025-05-27T18:43:00Z">
+        <w:r>
+          <w:rPr>
+            <w:szCs w:val="22"/>
+          </w:rPr>
+          <w:t>4</w:t>
+        </w:r>
+      </w:ins>
+      <w:del w:id="11" w:author="Jaeger, Florian" w:date="2025-05-27T14:43:00Z" w16du:dateUtc="2025-05-27T18:43:00Z">
+        <w:r>
+          <w:rPr>
+            <w:szCs w:val="22"/>
+          </w:rPr>
+          <w:delText>3</w:delText>
+        </w:r>
+      </w:del>
       <w:r>
         <w:rPr>
           <w:szCs w:val="22"/>
@@ -15717,12 +16378,22 @@
         </w:rPr>
         <w:t xml:space="preserve">suggest that the effects of pen location, visual bias, and the acoustic continuum were stable across blocks (BFs &gt; </w:t>
       </w:r>
-      <w:r>
-        <w:rPr>
-          <w:szCs w:val="22"/>
-        </w:rPr>
-        <w:t>18.6</w:t>
-      </w:r>
+      <w:del w:id="12" w:author="Jaeger, Florian" w:date="2025-05-27T14:44:00Z" w16du:dateUtc="2025-05-27T18:44:00Z">
+        <w:r>
+          <w:rPr>
+            <w:szCs w:val="22"/>
+          </w:rPr>
+          <w:delText>18.6</w:delText>
+        </w:r>
+      </w:del>
+      <w:ins w:id="13" w:author="Jaeger, Florian" w:date="2025-05-27T14:44:00Z" w16du:dateUtc="2025-05-27T18:44:00Z">
+        <w:r>
+          <w:rPr>
+            <w:szCs w:val="22"/>
+          </w:rPr>
+          <w:t>2.9</w:t>
+        </w:r>
+      </w:ins>
       <w:r>
         <w:rPr>
           <w:szCs w:val="22"/>
@@ -15746,7 +16417,21 @@
         <w:rPr>
           <w:szCs w:val="22"/>
         </w:rPr>
-        <w:t xml:space="preserve">while not of particular relevance to our goals, </w:t>
+        <w:t xml:space="preserve">while not of </w:t>
+      </w:r>
+      <w:proofErr w:type="gramStart"/>
+      <w:r>
+        <w:rPr>
+          <w:szCs w:val="22"/>
+        </w:rPr>
+        <w:t>particular relevance</w:t>
+      </w:r>
+      <w:proofErr w:type="gramEnd"/>
+      <w:r>
+        <w:rPr>
+          <w:szCs w:val="22"/>
+        </w:rPr>
+        <w:t xml:space="preserve"> to our goals, </w:t>
       </w:r>
       <w:r>
         <w:rPr>
@@ -16031,7 +16716,14 @@
         <w:rPr>
           <w:szCs w:val="22"/>
         </w:rPr>
-        <w:t xml:space="preserve"> when the talker in the video had </w:t>
+        <w:t xml:space="preserve"> when the talker in the video </w:t>
+      </w:r>
+      <w:proofErr w:type="gramStart"/>
+      <w:r>
+        <w:rPr>
+          <w:szCs w:val="22"/>
+        </w:rPr>
+        <w:t xml:space="preserve">had </w:t>
       </w:r>
       <w:r>
         <w:rPr>
@@ -16050,7 +16742,14 @@
         <w:rPr>
           <w:szCs w:val="22"/>
         </w:rPr>
-        <w:t>in the mouth, compared to when the talker held the pen in the hand</w:t>
+        <w:t>in the mouth</w:t>
+      </w:r>
+      <w:proofErr w:type="gramEnd"/>
+      <w:r>
+        <w:rPr>
+          <w:szCs w:val="22"/>
+        </w:rPr>
+        <w:t>, compared to when the talker held the pen in the hand</w:t>
       </w:r>
       <w:r>
         <w:rPr>
@@ -16237,7 +16936,21 @@
         <w:rPr>
           <w:szCs w:val="22"/>
         </w:rPr>
-        <w:t>(similar to the effects of a bite</w:t>
+        <w:t>(</w:t>
+      </w:r>
+      <w:proofErr w:type="gramStart"/>
+      <w:r>
+        <w:rPr>
+          <w:szCs w:val="22"/>
+        </w:rPr>
+        <w:t>similar to</w:t>
+      </w:r>
+      <w:proofErr w:type="gramEnd"/>
+      <w:r>
+        <w:rPr>
+          <w:szCs w:val="22"/>
+        </w:rPr>
+        <w:t xml:space="preserve"> the effects of a bite</w:t>
       </w:r>
       <w:r>
         <w:rPr>
@@ -16911,7 +17624,7 @@
           <w:szCs w:val="22"/>
         </w:rPr>
       </w:pPr>
-      <w:bookmarkStart w:id="4" w:name="_Ref136084921"/>
+      <w:bookmarkStart w:id="14" w:name="_Ref136084921"/>
       <w:r>
         <w:rPr>
           <w:szCs w:val="22"/>
@@ -16950,7 +17663,7 @@
         </w:rPr>
         <w:fldChar w:fldCharType="end"/>
       </w:r>
-      <w:bookmarkEnd w:id="4"/>
+      <w:bookmarkEnd w:id="14"/>
       <w:r>
         <w:rPr>
           <w:szCs w:val="22"/>
@@ -18413,7 +19126,7 @@
           <w:szCs w:val="22"/>
         </w:rPr>
       </w:pPr>
-      <w:bookmarkStart w:id="5" w:name="_Ref136190811"/>
+      <w:bookmarkStart w:id="15" w:name="_Ref136190811"/>
       <w:r>
         <w:rPr>
           <w:szCs w:val="22"/>
@@ -18452,7 +19165,7 @@
         </w:rPr>
         <w:fldChar w:fldCharType="end"/>
       </w:r>
-      <w:bookmarkEnd w:id="5"/>
+      <w:bookmarkEnd w:id="15"/>
       <w:r>
         <w:rPr>
           <w:szCs w:val="22"/>
@@ -18559,7 +19272,7 @@
       <w:pPr>
         <w:pStyle w:val="Caption"/>
       </w:pPr>
-      <w:bookmarkStart w:id="6" w:name="_Ref136190818"/>
+      <w:bookmarkStart w:id="16" w:name="_Ref136190818"/>
       <w:r>
         <w:rPr>
           <w:szCs w:val="22"/>
@@ -18599,7 +19312,7 @@
         </w:rPr>
         <w:fldChar w:fldCharType="end"/>
       </w:r>
-      <w:bookmarkEnd w:id="6"/>
+      <w:bookmarkEnd w:id="16"/>
       <w:r>
         <w:rPr>
           <w:szCs w:val="22"/>
@@ -18653,10 +19366,10 @@
         <w:tblLook w:val="04A0" w:firstRow="1" w:lastRow="0" w:firstColumn="1" w:lastColumn="0" w:noHBand="0" w:noVBand="1"/>
       </w:tblPr>
       <w:tblGrid>
-        <w:gridCol w:w="6072"/>
-        <w:gridCol w:w="565"/>
-        <w:gridCol w:w="781"/>
-        <w:gridCol w:w="840"/>
+        <w:gridCol w:w="5800"/>
+        <w:gridCol w:w="785"/>
+        <w:gridCol w:w="1096"/>
+        <w:gridCol w:w="931"/>
       </w:tblGrid>
       <w:tr>
         <w:trPr>
@@ -18990,12 +19703,28 @@
               </w:rPr>
               <w:t>.</w:t>
             </w:r>
-            <w:r>
-              <w:rPr>
-                <w:szCs w:val="22"/>
-              </w:rPr>
-              <w:t>490</w:t>
-            </w:r>
+            <w:del w:id="17" w:author="Jaeger, Florian" w:date="2025-05-27T14:45:00Z" w16du:dateUtc="2025-05-27T18:45:00Z">
+              <w:r>
+                <w:rPr>
+                  <w:szCs w:val="22"/>
+                </w:rPr>
+                <w:delText>490</w:delText>
+              </w:r>
+            </w:del>
+            <w:ins w:id="18" w:author="Jaeger, Florian" w:date="2025-05-27T14:45:00Z" w16du:dateUtc="2025-05-27T18:45:00Z">
+              <w:r>
+                <w:rPr>
+                  <w:szCs w:val="22"/>
+                </w:rPr>
+                <w:t>49</w:t>
+              </w:r>
+              <w:r>
+                <w:rPr>
+                  <w:szCs w:val="22"/>
+                </w:rPr>
+                <w:t>7</w:t>
+              </w:r>
+            </w:ins>
           </w:p>
         </w:tc>
       </w:tr>
@@ -19175,8 +19904,24 @@
               <w:rPr>
                 <w:szCs w:val="22"/>
               </w:rPr>
-              <w:t>386</w:t>
-            </w:r>
+              <w:t>3</w:t>
+            </w:r>
+            <w:ins w:id="19" w:author="Jaeger, Florian" w:date="2025-05-27T14:45:00Z" w16du:dateUtc="2025-05-27T18:45:00Z">
+              <w:r>
+                <w:rPr>
+                  <w:szCs w:val="22"/>
+                </w:rPr>
+                <w:t>63</w:t>
+              </w:r>
+            </w:ins>
+            <w:del w:id="20" w:author="Jaeger, Florian" w:date="2025-05-27T14:45:00Z" w16du:dateUtc="2025-05-27T18:45:00Z">
+              <w:r>
+                <w:rPr>
+                  <w:szCs w:val="22"/>
+                </w:rPr>
+                <w:delText>86</w:delText>
+              </w:r>
+            </w:del>
           </w:p>
         </w:tc>
       </w:tr>
@@ -19297,11 +20042,27 @@
               </w:rPr>
               <w:t>-.</w:t>
             </w:r>
-            <w:r>
-              <w:rPr>
-                <w:szCs w:val="22"/>
-              </w:rPr>
-              <w:t>18</w:t>
+            <w:ins w:id="21" w:author="Jaeger, Florian" w:date="2025-05-27T14:45:00Z" w16du:dateUtc="2025-05-27T18:45:00Z">
+              <w:r>
+                <w:rPr>
+                  <w:szCs w:val="22"/>
+                </w:rPr>
+                <w:t>0</w:t>
+              </w:r>
+            </w:ins>
+            <w:del w:id="22" w:author="Jaeger, Florian" w:date="2025-05-27T14:45:00Z" w16du:dateUtc="2025-05-27T18:45:00Z">
+              <w:r>
+                <w:rPr>
+                  <w:szCs w:val="22"/>
+                </w:rPr>
+                <w:delText>1</w:delText>
+              </w:r>
+            </w:del>
+            <w:r>
+              <w:rPr>
+                <w:szCs w:val="22"/>
+              </w:rPr>
+              <w:t>8</w:t>
             </w:r>
           </w:p>
         </w:tc>
@@ -19320,12 +20081,22 @@
                 <w:szCs w:val="22"/>
               </w:rPr>
             </w:pPr>
-            <w:r>
-              <w:rPr>
-                <w:szCs w:val="22"/>
-              </w:rPr>
-              <w:t>2.9</w:t>
-            </w:r>
+            <w:del w:id="23" w:author="Jaeger, Florian" w:date="2025-05-27T14:45:00Z" w16du:dateUtc="2025-05-27T18:45:00Z">
+              <w:r>
+                <w:rPr>
+                  <w:szCs w:val="22"/>
+                </w:rPr>
+                <w:delText>2.9</w:delText>
+              </w:r>
+            </w:del>
+            <w:ins w:id="24" w:author="Jaeger, Florian" w:date="2025-05-27T14:45:00Z" w16du:dateUtc="2025-05-27T18:45:00Z">
+              <w:r>
+                <w:rPr>
+                  <w:szCs w:val="22"/>
+                </w:rPr>
+                <w:t>1.6</w:t>
+              </w:r>
+            </w:ins>
           </w:p>
         </w:tc>
         <w:tc>
@@ -19352,12 +20123,38 @@
               </w:rPr>
               <w:t>.</w:t>
             </w:r>
-            <w:r>
-              <w:rPr>
-                <w:szCs w:val="22"/>
-              </w:rPr>
-              <w:t>744</w:t>
-            </w:r>
+            <w:ins w:id="25" w:author="Jaeger, Florian" w:date="2025-05-27T14:45:00Z" w16du:dateUtc="2025-05-27T18:45:00Z">
+              <w:r>
+                <w:rPr>
+                  <w:szCs w:val="22"/>
+                </w:rPr>
+                <w:t>61</w:t>
+              </w:r>
+            </w:ins>
+            <w:del w:id="26" w:author="Jaeger, Florian" w:date="2025-05-27T14:45:00Z" w16du:dateUtc="2025-05-27T18:45:00Z">
+              <w:r>
+                <w:rPr>
+                  <w:szCs w:val="22"/>
+                </w:rPr>
+                <w:delText>74</w:delText>
+              </w:r>
+            </w:del>
+            <w:ins w:id="27" w:author="Jaeger, Florian" w:date="2025-05-27T14:45:00Z" w16du:dateUtc="2025-05-27T18:45:00Z">
+              <w:r>
+                <w:rPr>
+                  <w:szCs w:val="22"/>
+                </w:rPr>
+                <w:t>0</w:t>
+              </w:r>
+            </w:ins>
+            <w:del w:id="28" w:author="Jaeger, Florian" w:date="2025-05-27T14:45:00Z" w16du:dateUtc="2025-05-27T18:45:00Z">
+              <w:r>
+                <w:rPr>
+                  <w:szCs w:val="22"/>
+                </w:rPr>
+                <w:delText>4</w:delText>
+              </w:r>
+            </w:del>
           </w:p>
         </w:tc>
       </w:tr>
@@ -19516,8 +20313,24 @@
               <w:rPr>
                 <w:szCs w:val="22"/>
               </w:rPr>
-              <w:t>06</w:t>
-            </w:r>
+              <w:t>0</w:t>
+            </w:r>
+            <w:ins w:id="29" w:author="Jaeger, Florian" w:date="2025-05-27T14:45:00Z" w16du:dateUtc="2025-05-27T18:45:00Z">
+              <w:r>
+                <w:rPr>
+                  <w:szCs w:val="22"/>
+                </w:rPr>
+                <w:t>9</w:t>
+              </w:r>
+            </w:ins>
+            <w:del w:id="30" w:author="Jaeger, Florian" w:date="2025-05-27T14:45:00Z" w16du:dateUtc="2025-05-27T18:45:00Z">
+              <w:r>
+                <w:rPr>
+                  <w:szCs w:val="22"/>
+                </w:rPr>
+                <w:delText>6</w:delText>
+              </w:r>
+            </w:del>
           </w:p>
         </w:tc>
         <w:tc>
@@ -19538,24 +20351,34 @@
                 <w:szCs w:val="22"/>
               </w:rPr>
             </w:pPr>
-            <w:r>
-              <w:rPr>
-                <w:szCs w:val="22"/>
-              </w:rPr>
-              <w:t>3</w:t>
-            </w:r>
-            <w:r>
-              <w:rPr>
-                <w:szCs w:val="22"/>
-              </w:rPr>
-              <w:t>.</w:t>
-            </w:r>
-            <w:r>
-              <w:rPr>
-                <w:szCs w:val="22"/>
-              </w:rPr>
-              <w:t>1</w:t>
-            </w:r>
+            <w:del w:id="31" w:author="Jaeger, Florian" w:date="2025-05-27T14:45:00Z" w16du:dateUtc="2025-05-27T18:45:00Z">
+              <w:r>
+                <w:rPr>
+                  <w:szCs w:val="22"/>
+                </w:rPr>
+                <w:delText>3</w:delText>
+              </w:r>
+              <w:r>
+                <w:rPr>
+                  <w:szCs w:val="22"/>
+                </w:rPr>
+                <w:delText>.</w:delText>
+              </w:r>
+              <w:r>
+                <w:rPr>
+                  <w:szCs w:val="22"/>
+                </w:rPr>
+                <w:delText>1</w:delText>
+              </w:r>
+            </w:del>
+            <w:ins w:id="32" w:author="Jaeger, Florian" w:date="2025-05-27T14:45:00Z" w16du:dateUtc="2025-05-27T18:45:00Z">
+              <w:r>
+                <w:rPr>
+                  <w:szCs w:val="22"/>
+                </w:rPr>
+                <w:t>4.0</w:t>
+              </w:r>
+            </w:ins>
           </w:p>
         </w:tc>
         <w:tc>
@@ -19583,12 +20406,22 @@
               </w:rPr>
               <w:t>.</w:t>
             </w:r>
-            <w:r>
-              <w:rPr>
-                <w:szCs w:val="22"/>
-              </w:rPr>
-              <w:t>754</w:t>
-            </w:r>
+            <w:ins w:id="33" w:author="Jaeger, Florian" w:date="2025-05-27T14:45:00Z" w16du:dateUtc="2025-05-27T18:45:00Z">
+              <w:r>
+                <w:rPr>
+                  <w:szCs w:val="22"/>
+                </w:rPr>
+                <w:t>800</w:t>
+              </w:r>
+            </w:ins>
+            <w:del w:id="34" w:author="Jaeger, Florian" w:date="2025-05-27T14:45:00Z" w16du:dateUtc="2025-05-27T18:45:00Z">
+              <w:r>
+                <w:rPr>
+                  <w:szCs w:val="22"/>
+                </w:rPr>
+                <w:delText>754</w:delText>
+              </w:r>
+            </w:del>
           </w:p>
         </w:tc>
       </w:tr>
@@ -19734,8 +20567,24 @@
               <w:rPr>
                 <w:szCs w:val="22"/>
               </w:rPr>
-              <w:t>36</w:t>
-            </w:r>
+              <w:t>3</w:t>
+            </w:r>
+            <w:ins w:id="35" w:author="Jaeger, Florian" w:date="2025-05-27T14:45:00Z" w16du:dateUtc="2025-05-27T18:45:00Z">
+              <w:r>
+                <w:rPr>
+                  <w:szCs w:val="22"/>
+                </w:rPr>
+                <w:t>0</w:t>
+              </w:r>
+            </w:ins>
+            <w:del w:id="36" w:author="Jaeger, Florian" w:date="2025-05-27T14:45:00Z" w16du:dateUtc="2025-05-27T18:45:00Z">
+              <w:r>
+                <w:rPr>
+                  <w:szCs w:val="22"/>
+                </w:rPr>
+                <w:delText>6</w:delText>
+              </w:r>
+            </w:del>
           </w:p>
         </w:tc>
         <w:tc>
@@ -19932,12 +20781,22 @@
               </w:rPr>
               <w:t>.</w:t>
             </w:r>
-            <w:r>
-              <w:rPr>
-                <w:szCs w:val="22"/>
-              </w:rPr>
-              <w:t>05</w:t>
-            </w:r>
+            <w:del w:id="37" w:author="Jaeger, Florian" w:date="2025-05-27T14:45:00Z" w16du:dateUtc="2025-05-27T18:45:00Z">
+              <w:r>
+                <w:rPr>
+                  <w:szCs w:val="22"/>
+                </w:rPr>
+                <w:delText>05</w:delText>
+              </w:r>
+            </w:del>
+            <w:ins w:id="38" w:author="Jaeger, Florian" w:date="2025-05-27T14:45:00Z" w16du:dateUtc="2025-05-27T18:45:00Z">
+              <w:r>
+                <w:rPr>
+                  <w:szCs w:val="22"/>
+                </w:rPr>
+                <w:t>17</w:t>
+              </w:r>
+            </w:ins>
           </w:p>
         </w:tc>
         <w:tc>
@@ -19954,11 +20813,27 @@
                 <w:szCs w:val="22"/>
               </w:rPr>
             </w:pPr>
-            <w:r>
-              <w:rPr>
-                <w:szCs w:val="22"/>
-              </w:rPr>
-              <w:t>1.</w:t>
+            <w:del w:id="39" w:author="Jaeger, Florian" w:date="2025-05-27T14:46:00Z" w16du:dateUtc="2025-05-27T18:46:00Z">
+              <w:r>
+                <w:rPr>
+                  <w:szCs w:val="22"/>
+                </w:rPr>
+                <w:delText>1</w:delText>
+              </w:r>
+            </w:del>
+            <w:ins w:id="40" w:author="Jaeger, Florian" w:date="2025-05-27T14:46:00Z" w16du:dateUtc="2025-05-27T18:46:00Z">
+              <w:r>
+                <w:rPr>
+                  <w:szCs w:val="22"/>
+                </w:rPr>
+                <w:t>4</w:t>
+              </w:r>
+            </w:ins>
+            <w:r>
+              <w:rPr>
+                <w:szCs w:val="22"/>
+              </w:rPr>
+              <w:t>.</w:t>
             </w:r>
             <w:r>
               <w:rPr>
@@ -19991,12 +20866,22 @@
               </w:rPr>
               <w:t>.</w:t>
             </w:r>
-            <w:r>
-              <w:rPr>
-                <w:szCs w:val="22"/>
-              </w:rPr>
-              <w:t>582</w:t>
-            </w:r>
+            <w:del w:id="41" w:author="Jaeger, Florian" w:date="2025-05-27T14:46:00Z" w16du:dateUtc="2025-05-27T18:46:00Z">
+              <w:r>
+                <w:rPr>
+                  <w:szCs w:val="22"/>
+                </w:rPr>
+                <w:delText>582</w:delText>
+              </w:r>
+            </w:del>
+            <w:ins w:id="42" w:author="Jaeger, Florian" w:date="2025-05-27T14:46:00Z" w16du:dateUtc="2025-05-27T18:46:00Z">
+              <w:r>
+                <w:rPr>
+                  <w:szCs w:val="22"/>
+                </w:rPr>
+                <w:t>814</w:t>
+              </w:r>
+            </w:ins>
           </w:p>
         </w:tc>
       </w:tr>
@@ -20052,18 +20937,36 @@
                 <w:szCs w:val="22"/>
               </w:rPr>
             </w:pPr>
+            <w:ins w:id="43" w:author="Jaeger, Florian" w:date="2025-05-27T14:46:00Z" w16du:dateUtc="2025-05-27T18:46:00Z">
+              <w:r>
+                <w:rPr>
+                  <w:szCs w:val="22"/>
+                </w:rPr>
+                <w:t>-</w:t>
+              </w:r>
+            </w:ins>
             <w:r>
               <w:rPr>
                 <w:szCs w:val="22"/>
               </w:rPr>
               <w:t>.</w:t>
             </w:r>
-            <w:r>
-              <w:rPr>
-                <w:szCs w:val="22"/>
-              </w:rPr>
-              <w:t>03</w:t>
-            </w:r>
+            <w:del w:id="44" w:author="Jaeger, Florian" w:date="2025-05-27T14:46:00Z" w16du:dateUtc="2025-05-27T18:46:00Z">
+              <w:r>
+                <w:rPr>
+                  <w:szCs w:val="22"/>
+                </w:rPr>
+                <w:delText>03</w:delText>
+              </w:r>
+            </w:del>
+            <w:ins w:id="45" w:author="Jaeger, Florian" w:date="2025-05-27T14:46:00Z" w16du:dateUtc="2025-05-27T18:46:00Z">
+              <w:r>
+                <w:rPr>
+                  <w:szCs w:val="22"/>
+                </w:rPr>
+                <w:t>07</w:t>
+              </w:r>
+            </w:ins>
           </w:p>
         </w:tc>
         <w:tc>
@@ -20084,12 +20987,44 @@
                 <w:szCs w:val="22"/>
               </w:rPr>
             </w:pPr>
-            <w:r>
-              <w:rPr>
-                <w:szCs w:val="22"/>
-              </w:rPr>
-              <w:t>52.8</w:t>
-            </w:r>
+            <w:del w:id="46" w:author="Jaeger, Florian" w:date="2025-05-27T14:46:00Z" w16du:dateUtc="2025-05-27T18:46:00Z">
+              <w:r>
+                <w:rPr>
+                  <w:szCs w:val="22"/>
+                </w:rPr>
+                <w:delText>52</w:delText>
+              </w:r>
+            </w:del>
+            <w:ins w:id="47" w:author="Jaeger, Florian" w:date="2025-05-27T14:46:00Z" w16du:dateUtc="2025-05-27T18:46:00Z">
+              <w:r>
+                <w:rPr>
+                  <w:szCs w:val="22"/>
+                </w:rPr>
+                <w:t>22</w:t>
+              </w:r>
+            </w:ins>
+            <w:r>
+              <w:rPr>
+                <w:szCs w:val="22"/>
+              </w:rPr>
+              <w:t>.</w:t>
+            </w:r>
+            <w:ins w:id="48" w:author="Jaeger, Florian" w:date="2025-05-27T14:46:00Z" w16du:dateUtc="2025-05-27T18:46:00Z">
+              <w:r>
+                <w:rPr>
+                  <w:szCs w:val="22"/>
+                </w:rPr>
+                <w:t>7</w:t>
+              </w:r>
+            </w:ins>
+            <w:del w:id="49" w:author="Jaeger, Florian" w:date="2025-05-27T14:46:00Z" w16du:dateUtc="2025-05-27T18:46:00Z">
+              <w:r>
+                <w:rPr>
+                  <w:szCs w:val="22"/>
+                </w:rPr>
+                <w:delText>8</w:delText>
+              </w:r>
+            </w:del>
           </w:p>
         </w:tc>
         <w:tc>
@@ -20121,8 +21056,30 @@
               <w:rPr>
                 <w:szCs w:val="22"/>
               </w:rPr>
-              <w:t>981</w:t>
-            </w:r>
+              <w:t>9</w:t>
+            </w:r>
+            <w:ins w:id="50" w:author="Jaeger, Florian" w:date="2025-05-27T14:46:00Z" w16du:dateUtc="2025-05-27T18:46:00Z">
+              <w:r>
+                <w:rPr>
+                  <w:szCs w:val="22"/>
+                </w:rPr>
+                <w:t>5</w:t>
+              </w:r>
+            </w:ins>
+            <w:r>
+              <w:rPr>
+                <w:szCs w:val="22"/>
+              </w:rPr>
+              <w:t>8</w:t>
+            </w:r>
+            <w:del w:id="51" w:author="Jaeger, Florian" w:date="2025-05-27T14:46:00Z" w16du:dateUtc="2025-05-27T18:46:00Z">
+              <w:r>
+                <w:rPr>
+                  <w:szCs w:val="22"/>
+                </w:rPr>
+                <w:delText>1</w:delText>
+              </w:r>
+            </w:del>
           </w:p>
         </w:tc>
       </w:tr>
@@ -20187,8 +21144,24 @@
               <w:rPr>
                 <w:szCs w:val="22"/>
               </w:rPr>
-              <w:t>08</w:t>
-            </w:r>
+              <w:t>0</w:t>
+            </w:r>
+            <w:ins w:id="52" w:author="Jaeger, Florian" w:date="2025-05-27T14:46:00Z" w16du:dateUtc="2025-05-27T18:46:00Z">
+              <w:r>
+                <w:rPr>
+                  <w:szCs w:val="22"/>
+                </w:rPr>
+                <w:t>1</w:t>
+              </w:r>
+            </w:ins>
+            <w:del w:id="53" w:author="Jaeger, Florian" w:date="2025-05-27T14:46:00Z" w16du:dateUtc="2025-05-27T18:46:00Z">
+              <w:r>
+                <w:rPr>
+                  <w:szCs w:val="22"/>
+                </w:rPr>
+                <w:delText>8</w:delText>
+              </w:r>
+            </w:del>
           </w:p>
         </w:tc>
         <w:tc>
@@ -20209,12 +21182,22 @@
                 <w:szCs w:val="22"/>
               </w:rPr>
             </w:pPr>
-            <w:r>
-              <w:rPr>
-                <w:szCs w:val="22"/>
-              </w:rPr>
-              <w:t>59.3</w:t>
-            </w:r>
+            <w:ins w:id="54" w:author="Jaeger, Florian" w:date="2025-05-27T14:47:00Z" w16du:dateUtc="2025-05-27T18:47:00Z">
+              <w:r>
+                <w:rPr>
+                  <w:szCs w:val="22"/>
+                </w:rPr>
+                <w:t>122.0</w:t>
+              </w:r>
+            </w:ins>
+            <w:del w:id="55" w:author="Jaeger, Florian" w:date="2025-05-27T14:47:00Z" w16du:dateUtc="2025-05-27T18:47:00Z">
+              <w:r>
+                <w:rPr>
+                  <w:szCs w:val="22"/>
+                </w:rPr>
+                <w:delText>59.3</w:delText>
+              </w:r>
+            </w:del>
           </w:p>
         </w:tc>
         <w:tc>
@@ -20242,12 +21225,22 @@
               </w:rPr>
               <w:t>.9</w:t>
             </w:r>
-            <w:r>
-              <w:rPr>
-                <w:szCs w:val="22"/>
-              </w:rPr>
-              <w:t>83</w:t>
-            </w:r>
+            <w:ins w:id="56" w:author="Jaeger, Florian" w:date="2025-05-27T14:46:00Z" w16du:dateUtc="2025-05-27T18:46:00Z">
+              <w:r>
+                <w:rPr>
+                  <w:szCs w:val="22"/>
+                </w:rPr>
+                <w:t>92</w:t>
+              </w:r>
+            </w:ins>
+            <w:del w:id="57" w:author="Jaeger, Florian" w:date="2025-05-27T14:46:00Z" w16du:dateUtc="2025-05-27T18:46:00Z">
+              <w:r>
+                <w:rPr>
+                  <w:szCs w:val="22"/>
+                </w:rPr>
+                <w:delText>83</w:delText>
+              </w:r>
+            </w:del>
           </w:p>
         </w:tc>
       </w:tr>
@@ -20332,8 +21325,24 @@
               <w:rPr>
                 <w:szCs w:val="22"/>
               </w:rPr>
-              <w:t>.00</w:t>
-            </w:r>
+              <w:t>.0</w:t>
+            </w:r>
+            <w:ins w:id="58" w:author="Jaeger, Florian" w:date="2025-05-27T14:46:00Z" w16du:dateUtc="2025-05-27T18:46:00Z">
+              <w:r>
+                <w:rPr>
+                  <w:szCs w:val="22"/>
+                </w:rPr>
+                <w:t>1</w:t>
+              </w:r>
+            </w:ins>
+            <w:del w:id="59" w:author="Jaeger, Florian" w:date="2025-05-27T14:46:00Z" w16du:dateUtc="2025-05-27T18:46:00Z">
+              <w:r>
+                <w:rPr>
+                  <w:szCs w:val="22"/>
+                </w:rPr>
+                <w:delText>0</w:delText>
+              </w:r>
+            </w:del>
           </w:p>
         </w:tc>
         <w:tc>
@@ -20351,12 +21360,44 @@
                 <w:szCs w:val="22"/>
               </w:rPr>
             </w:pPr>
-            <w:r>
-              <w:rPr>
-                <w:szCs w:val="22"/>
-              </w:rPr>
-              <w:t>53.4</w:t>
-            </w:r>
+            <w:ins w:id="60" w:author="Jaeger, Florian" w:date="2025-05-27T14:47:00Z" w16du:dateUtc="2025-05-27T18:47:00Z">
+              <w:r>
+                <w:rPr>
+                  <w:szCs w:val="22"/>
+                </w:rPr>
+                <w:t>87</w:t>
+              </w:r>
+            </w:ins>
+            <w:del w:id="61" w:author="Jaeger, Florian" w:date="2025-05-27T14:47:00Z" w16du:dateUtc="2025-05-27T18:47:00Z">
+              <w:r>
+                <w:rPr>
+                  <w:szCs w:val="22"/>
+                </w:rPr>
+                <w:delText>53</w:delText>
+              </w:r>
+            </w:del>
+            <w:r>
+              <w:rPr>
+                <w:szCs w:val="22"/>
+              </w:rPr>
+              <w:t>.</w:t>
+            </w:r>
+            <w:ins w:id="62" w:author="Jaeger, Florian" w:date="2025-05-27T14:47:00Z" w16du:dateUtc="2025-05-27T18:47:00Z">
+              <w:r>
+                <w:rPr>
+                  <w:szCs w:val="22"/>
+                </w:rPr>
+                <w:t>7</w:t>
+              </w:r>
+            </w:ins>
+            <w:del w:id="63" w:author="Jaeger, Florian" w:date="2025-05-27T14:47:00Z" w16du:dateUtc="2025-05-27T18:47:00Z">
+              <w:r>
+                <w:rPr>
+                  <w:szCs w:val="22"/>
+                </w:rPr>
+                <w:delText>4</w:delText>
+              </w:r>
+            </w:del>
           </w:p>
         </w:tc>
         <w:tc>
@@ -20387,8 +21428,24 @@
               <w:rPr>
                 <w:szCs w:val="22"/>
               </w:rPr>
-              <w:t>982</w:t>
-            </w:r>
+              <w:t>98</w:t>
+            </w:r>
+            <w:ins w:id="64" w:author="Jaeger, Florian" w:date="2025-05-27T14:46:00Z" w16du:dateUtc="2025-05-27T18:46:00Z">
+              <w:r>
+                <w:rPr>
+                  <w:szCs w:val="22"/>
+                </w:rPr>
+                <w:t>9</w:t>
+              </w:r>
+            </w:ins>
+            <w:del w:id="65" w:author="Jaeger, Florian" w:date="2025-05-27T14:46:00Z" w16du:dateUtc="2025-05-27T18:46:00Z">
+              <w:r>
+                <w:rPr>
+                  <w:szCs w:val="22"/>
+                </w:rPr>
+                <w:delText>2</w:delText>
+              </w:r>
+            </w:del>
           </w:p>
         </w:tc>
       </w:tr>
@@ -20475,12 +21532,22 @@
               </w:rPr>
               <w:t>-.0</w:t>
             </w:r>
-            <w:r>
-              <w:rPr>
-                <w:szCs w:val="22"/>
-              </w:rPr>
-              <w:t>3</w:t>
-            </w:r>
+            <w:ins w:id="66" w:author="Jaeger, Florian" w:date="2025-05-27T14:46:00Z" w16du:dateUtc="2025-05-27T18:46:00Z">
+              <w:r>
+                <w:rPr>
+                  <w:szCs w:val="22"/>
+                </w:rPr>
+                <w:t>4</w:t>
+              </w:r>
+            </w:ins>
+            <w:del w:id="67" w:author="Jaeger, Florian" w:date="2025-05-27T14:46:00Z" w16du:dateUtc="2025-05-27T18:46:00Z">
+              <w:r>
+                <w:rPr>
+                  <w:szCs w:val="22"/>
+                </w:rPr>
+                <w:delText>3</w:delText>
+              </w:r>
+            </w:del>
           </w:p>
         </w:tc>
         <w:tc>
@@ -20498,12 +21565,38 @@
                 <w:szCs w:val="22"/>
               </w:rPr>
             </w:pPr>
-            <w:r>
-              <w:rPr>
-                <w:szCs w:val="22"/>
-              </w:rPr>
-              <w:t>87.7</w:t>
-            </w:r>
+            <w:ins w:id="68" w:author="Jaeger, Florian" w:date="2025-05-27T14:46:00Z" w16du:dateUtc="2025-05-27T18:46:00Z">
+              <w:r>
+                <w:rPr>
+                  <w:szCs w:val="22"/>
+                </w:rPr>
+                <w:t>118</w:t>
+              </w:r>
+            </w:ins>
+            <w:ins w:id="69" w:author="Jaeger, Florian" w:date="2025-05-27T14:47:00Z" w16du:dateUtc="2025-05-27T18:47:00Z">
+              <w:r>
+                <w:rPr>
+                  <w:szCs w:val="22"/>
+                </w:rPr>
+                <w:t>.</w:t>
+              </w:r>
+            </w:ins>
+            <w:ins w:id="70" w:author="Jaeger, Florian" w:date="2025-05-27T14:46:00Z" w16du:dateUtc="2025-05-27T18:46:00Z">
+              <w:r>
+                <w:rPr>
+                  <w:szCs w:val="22"/>
+                </w:rPr>
+                <w:t>3</w:t>
+              </w:r>
+            </w:ins>
+            <w:del w:id="71" w:author="Jaeger, Florian" w:date="2025-05-27T14:46:00Z" w16du:dateUtc="2025-05-27T18:46:00Z">
+              <w:r>
+                <w:rPr>
+                  <w:szCs w:val="22"/>
+                </w:rPr>
+                <w:delText>87.7</w:delText>
+              </w:r>
+            </w:del>
           </w:p>
         </w:tc>
         <w:tc>
@@ -20528,14 +21621,30 @@
               <w:rPr>
                 <w:szCs w:val="22"/>
               </w:rPr>
-              <w:t>.98</w:t>
-            </w:r>
+              <w:t>.9</w:t>
+            </w:r>
+            <w:del w:id="72" w:author="Jaeger, Florian" w:date="2025-05-27T14:46:00Z" w16du:dateUtc="2025-05-27T18:46:00Z">
+              <w:r>
+                <w:rPr>
+                  <w:szCs w:val="22"/>
+                </w:rPr>
+                <w:delText>8</w:delText>
+              </w:r>
+            </w:del>
             <w:r>
               <w:rPr>
                 <w:szCs w:val="22"/>
               </w:rPr>
               <w:t>9</w:t>
             </w:r>
+            <w:ins w:id="73" w:author="Jaeger, Florian" w:date="2025-05-27T14:46:00Z" w16du:dateUtc="2025-05-27T18:46:00Z">
+              <w:r>
+                <w:rPr>
+                  <w:szCs w:val="22"/>
+                </w:rPr>
+                <w:t>2</w:t>
+              </w:r>
+            </w:ins>
           </w:p>
         </w:tc>
       </w:tr>
@@ -20581,7 +21690,14 @@
         <w:rPr>
           <w:szCs w:val="22"/>
         </w:rPr>
-        <w:t xml:space="preserve"> paid attention to the stimul</w:t>
+        <w:t xml:space="preserve"> paid attention to the </w:t>
+      </w:r>
+      <w:proofErr w:type="gramStart"/>
+      <w:r>
+        <w:rPr>
+          <w:szCs w:val="22"/>
+        </w:rPr>
+        <w:t>stimul</w:t>
       </w:r>
       <w:r>
         <w:rPr>
@@ -20593,7 +21709,14 @@
         <w:rPr>
           <w:szCs w:val="22"/>
         </w:rPr>
-        <w:t>, and yet failed to exhibit any effects of pen location</w:t>
+        <w:t>, and</w:t>
+      </w:r>
+      <w:proofErr w:type="gramEnd"/>
+      <w:r>
+        <w:rPr>
+          <w:szCs w:val="22"/>
+        </w:rPr>
+        <w:t xml:space="preserve"> yet failed to exhibit any effects of pen location</w:t>
       </w:r>
       <w:r>
         <w:rPr>
@@ -20647,7 +21770,21 @@
         <w:rPr>
           <w:szCs w:val="22"/>
         </w:rPr>
-        <w:t xml:space="preserve">. This experiment was identical to Experiment 2, except that participants had to </w:t>
+        <w:t xml:space="preserve">. This experiment was identical to Experiment 2, except </w:t>
+      </w:r>
+      <w:proofErr w:type="gramStart"/>
+      <w:r>
+        <w:rPr>
+          <w:szCs w:val="22"/>
+        </w:rPr>
+        <w:t>that participants</w:t>
+      </w:r>
+      <w:proofErr w:type="gramEnd"/>
+      <w:r>
+        <w:rPr>
+          <w:szCs w:val="22"/>
+        </w:rPr>
+        <w:t xml:space="preserve"> had to </w:t>
       </w:r>
       <w:r>
         <w:rPr>
@@ -20755,7 +21892,57 @@
         <w:rPr>
           <w:szCs w:val="22"/>
         </w:rPr>
-        <w:t xml:space="preserve">.16, BF = .4, </w:t>
+        <w:t>.</w:t>
+      </w:r>
+      <w:del w:id="74" w:author="Jaeger, Florian" w:date="2025-05-27T14:48:00Z" w16du:dateUtc="2025-05-27T18:48:00Z">
+        <w:r>
+          <w:rPr>
+            <w:szCs w:val="22"/>
+          </w:rPr>
+          <w:delText>16</w:delText>
+        </w:r>
+      </w:del>
+      <w:ins w:id="75" w:author="Jaeger, Florian" w:date="2025-05-27T14:48:00Z" w16du:dateUtc="2025-05-27T18:48:00Z">
+        <w:r>
+          <w:rPr>
+            <w:szCs w:val="22"/>
+          </w:rPr>
+          <w:t>1</w:t>
+        </w:r>
+        <w:r>
+          <w:rPr>
+            <w:szCs w:val="22"/>
+          </w:rPr>
+          <w:t>7</w:t>
+        </w:r>
+      </w:ins>
+      <w:r>
+        <w:rPr>
+          <w:szCs w:val="22"/>
+        </w:rPr>
+        <w:t>, BF = .</w:t>
+      </w:r>
+      <w:del w:id="76" w:author="Jaeger, Florian" w:date="2025-05-27T14:48:00Z" w16du:dateUtc="2025-05-27T18:48:00Z">
+        <w:r>
+          <w:rPr>
+            <w:szCs w:val="22"/>
+          </w:rPr>
+          <w:delText>4</w:delText>
+        </w:r>
+      </w:del>
+      <w:ins w:id="77" w:author="Jaeger, Florian" w:date="2025-05-27T14:48:00Z" w16du:dateUtc="2025-05-27T18:48:00Z">
+        <w:r>
+          <w:rPr>
+            <w:szCs w:val="22"/>
+          </w:rPr>
+          <w:t>3</w:t>
+        </w:r>
+      </w:ins>
+      <w:r>
+        <w:rPr>
+          <w:szCs w:val="22"/>
+        </w:rPr>
+        <w:t xml:space="preserve">, </w:t>
       </w:r>
       <w:proofErr w:type="spellStart"/>
       <w:r>
@@ -20780,7 +21967,35 @@
         <w:rPr>
           <w:szCs w:val="22"/>
         </w:rPr>
-        <w:t xml:space="preserve"> = .27)</w:t>
+        <w:t xml:space="preserve"> = .</w:t>
+      </w:r>
+      <w:del w:id="78" w:author="Jaeger, Florian" w:date="2025-05-27T14:48:00Z" w16du:dateUtc="2025-05-27T18:48:00Z">
+        <w:r>
+          <w:rPr>
+            <w:szCs w:val="22"/>
+          </w:rPr>
+          <w:delText>27</w:delText>
+        </w:r>
+      </w:del>
+      <w:ins w:id="79" w:author="Jaeger, Florian" w:date="2025-05-27T14:48:00Z" w16du:dateUtc="2025-05-27T18:48:00Z">
+        <w:r>
+          <w:rPr>
+            <w:szCs w:val="22"/>
+          </w:rPr>
+          <w:t>2</w:t>
+        </w:r>
+        <w:r>
+          <w:rPr>
+            <w:szCs w:val="22"/>
+          </w:rPr>
+          <w:t>5</w:t>
+        </w:r>
+      </w:ins>
+      <w:r>
+        <w:rPr>
+          <w:szCs w:val="22"/>
+        </w:rPr>
+        <w:t>)</w:t>
       </w:r>
       <w:r>
         <w:rPr>
@@ -21101,14 +22316,52 @@
         <w:rPr>
           <w:szCs w:val="22"/>
         </w:rPr>
-        <w:t xml:space="preserve">-.71, </w:t>
-      </w:r>
-      <w:r>
-        <w:rPr>
-          <w:szCs w:val="22"/>
-        </w:rPr>
-        <w:t>BF = 73.1</w:t>
-      </w:r>
+        <w:t>-.</w:t>
+      </w:r>
+      <w:del w:id="80" w:author="Jaeger, Florian" w:date="2025-05-27T14:51:00Z" w16du:dateUtc="2025-05-27T18:51:00Z">
+        <w:r>
+          <w:rPr>
+            <w:szCs w:val="22"/>
+          </w:rPr>
+          <w:delText>71</w:delText>
+        </w:r>
+      </w:del>
+      <w:ins w:id="81" w:author="Jaeger, Florian" w:date="2025-05-27T14:51:00Z" w16du:dateUtc="2025-05-27T18:51:00Z">
+        <w:r>
+          <w:rPr>
+            <w:szCs w:val="22"/>
+          </w:rPr>
+          <w:t>68</w:t>
+        </w:r>
+      </w:ins>
+      <w:r>
+        <w:rPr>
+          <w:szCs w:val="22"/>
+        </w:rPr>
+        <w:t xml:space="preserve">, </w:t>
+      </w:r>
+      <w:r>
+        <w:rPr>
+          <w:szCs w:val="22"/>
+        </w:rPr>
+        <w:t xml:space="preserve">BF = </w:t>
+      </w:r>
+      <w:del w:id="82" w:author="Jaeger, Florian" w:date="2025-05-27T14:51:00Z" w16du:dateUtc="2025-05-27T18:51:00Z">
+        <w:r>
+          <w:rPr>
+            <w:szCs w:val="22"/>
+          </w:rPr>
+          <w:delText>73.1</w:delText>
+        </w:r>
+      </w:del>
+      <w:ins w:id="83" w:author="Jaeger, Florian" w:date="2025-05-27T14:51:00Z" w16du:dateUtc="2025-05-27T18:51:00Z">
+        <w:r>
+          <w:rPr>
+            <w:szCs w:val="22"/>
+          </w:rPr>
+          <w:t>29.5</w:t>
+        </w:r>
+      </w:ins>
       <w:r>
         <w:rPr>
           <w:szCs w:val="22"/>
@@ -21138,8 +22391,30 @@
         <w:rPr>
           <w:szCs w:val="22"/>
         </w:rPr>
-        <w:t xml:space="preserve"> = .986</w:t>
-      </w:r>
+        <w:t xml:space="preserve"> = .9</w:t>
+      </w:r>
+      <w:del w:id="84" w:author="Jaeger, Florian" w:date="2025-05-27T14:51:00Z" w16du:dateUtc="2025-05-27T18:51:00Z">
+        <w:r>
+          <w:rPr>
+            <w:szCs w:val="22"/>
+          </w:rPr>
+          <w:delText>8</w:delText>
+        </w:r>
+      </w:del>
+      <w:r>
+        <w:rPr>
+          <w:szCs w:val="22"/>
+        </w:rPr>
+        <w:t>6</w:t>
+      </w:r>
+      <w:ins w:id="85" w:author="Jaeger, Florian" w:date="2025-05-27T14:51:00Z" w16du:dateUtc="2025-05-27T18:51:00Z">
+        <w:r>
+          <w:rPr>
+            <w:szCs w:val="22"/>
+          </w:rPr>
+          <w:t>7</w:t>
+        </w:r>
+      </w:ins>
       <w:r>
         <w:rPr>
           <w:szCs w:val="22"/>
@@ -21220,7 +22495,29 @@
         <w:rPr>
           <w:szCs w:val="22"/>
         </w:rPr>
-        <w:t xml:space="preserve">.14, </w:t>
+        <w:t>.1</w:t>
+      </w:r>
+      <w:ins w:id="86" w:author="Jaeger, Florian" w:date="2025-05-27T14:51:00Z" w16du:dateUtc="2025-05-27T18:51:00Z">
+        <w:r>
+          <w:rPr>
+            <w:szCs w:val="22"/>
+          </w:rPr>
+          <w:t>5</w:t>
+        </w:r>
+      </w:ins>
+      <w:del w:id="87" w:author="Jaeger, Florian" w:date="2025-05-27T14:51:00Z" w16du:dateUtc="2025-05-27T18:51:00Z">
+        <w:r>
+          <w:rPr>
+            <w:szCs w:val="22"/>
+          </w:rPr>
+          <w:delText>4</w:delText>
+        </w:r>
+      </w:del>
+      <w:r>
+        <w:rPr>
+          <w:szCs w:val="22"/>
+        </w:rPr>
+        <w:t xml:space="preserve">, </w:t>
       </w:r>
       <w:r>
         <w:rPr>
@@ -21257,8 +22554,30 @@
         <w:rPr>
           <w:szCs w:val="22"/>
         </w:rPr>
-        <w:t xml:space="preserve"> = .345</w:t>
-      </w:r>
+        <w:t xml:space="preserve"> = .</w:t>
+      </w:r>
+      <w:del w:id="88" w:author="Jaeger, Florian" w:date="2025-05-27T14:51:00Z" w16du:dateUtc="2025-05-27T18:51:00Z">
+        <w:r>
+          <w:rPr>
+            <w:szCs w:val="22"/>
+          </w:rPr>
+          <w:delText>345</w:delText>
+        </w:r>
+      </w:del>
+      <w:ins w:id="89" w:author="Jaeger, Florian" w:date="2025-05-27T14:51:00Z" w16du:dateUtc="2025-05-27T18:51:00Z">
+        <w:r>
+          <w:rPr>
+            <w:szCs w:val="22"/>
+          </w:rPr>
+          <w:t>3</w:t>
+        </w:r>
+        <w:r>
+          <w:rPr>
+            <w:szCs w:val="22"/>
+          </w:rPr>
+          <w:t>39</w:t>
+        </w:r>
+      </w:ins>
       <w:r>
         <w:rPr>
           <w:szCs w:val="22"/>
@@ -21275,7 +22594,15 @@
         <w:t>Indeed, t</w:t>
       </w:r>
       <w:r>
-        <w:t xml:space="preserve">he only striking similarity between the pen-in-the-mouth and visual occlusion was that both reduced the effect of visual bias (see SI for details, and also </w:t>
+        <w:t xml:space="preserve">he only striking similarity between the pen-in-the-mouth and visual occlusion was that both reduced the effect of visual bias (see SI for details, </w:t>
+      </w:r>
+      <w:proofErr w:type="gramStart"/>
+      <w:r>
+        <w:t>and also</w:t>
+      </w:r>
+      <w:proofErr w:type="gramEnd"/>
+      <w:r>
+        <w:t xml:space="preserve"> </w:t>
       </w:r>
       <w:r>
         <w:fldChar w:fldCharType="begin"/>
@@ -21470,13 +22797,27 @@
         <w:rPr>
           <w:szCs w:val="22"/>
         </w:rPr>
-        <w:t>While we cannot conclusively rule out this possibility, we consider it unlikely for a</w:t>
-      </w:r>
-      <w:r>
-        <w:rPr>
-          <w:szCs w:val="22"/>
-        </w:rPr>
-        <w:t xml:space="preserve"> number of </w:t>
+        <w:t xml:space="preserve">While we cannot conclusively rule out this possibility, we consider it unlikely for </w:t>
+      </w:r>
+      <w:proofErr w:type="gramStart"/>
+      <w:r>
+        <w:rPr>
+          <w:szCs w:val="22"/>
+        </w:rPr>
+        <w:t>a</w:t>
+      </w:r>
+      <w:r>
+        <w:rPr>
+          <w:szCs w:val="22"/>
+        </w:rPr>
+        <w:t xml:space="preserve"> number of</w:t>
+      </w:r>
+      <w:proofErr w:type="gramEnd"/>
+      <w:r>
+        <w:rPr>
+          <w:szCs w:val="22"/>
+        </w:rPr>
+        <w:t xml:space="preserve"> </w:t>
       </w:r>
       <w:r>
         <w:rPr>
@@ -22128,7 +23469,21 @@
         <w:rPr>
           <w:szCs w:val="22"/>
         </w:rPr>
-        <w:t xml:space="preserve"> a talker’s lips exhibit a certain shape, as long as (1) they do, and (2) plausibly do so for </w:t>
+        <w:t xml:space="preserve"> a talker’s lips exhibit a certain shape, </w:t>
+      </w:r>
+      <w:proofErr w:type="gramStart"/>
+      <w:r>
+        <w:rPr>
+          <w:szCs w:val="22"/>
+        </w:rPr>
+        <w:t>as long as</w:t>
+      </w:r>
+      <w:proofErr w:type="gramEnd"/>
+      <w:r>
+        <w:rPr>
+          <w:szCs w:val="22"/>
+        </w:rPr>
+        <w:t xml:space="preserve"> (1) they do, and (2) plausibly do so for </w:t>
       </w:r>
       <w:r>
         <w:rPr>
@@ -22204,7 +23559,21 @@
         <w:rPr>
           <w:szCs w:val="22"/>
         </w:rPr>
-        <w:t>The present results also raise a number of questions for future research on compensation and adaptive speech perception more broadly. We briefly discuss t</w:t>
+        <w:t xml:space="preserve">The present results also raise </w:t>
+      </w:r>
+      <w:proofErr w:type="gramStart"/>
+      <w:r>
+        <w:rPr>
+          <w:szCs w:val="22"/>
+        </w:rPr>
+        <w:t>a number of</w:t>
+      </w:r>
+      <w:proofErr w:type="gramEnd"/>
+      <w:r>
+        <w:rPr>
+          <w:szCs w:val="22"/>
+        </w:rPr>
+        <w:t xml:space="preserve"> questions for future research on compensation and adaptive speech perception more broadly. We briefly discuss t</w:t>
       </w:r>
       <w:r>
         <w:rPr>
@@ -23504,21 +24873,7 @@
         <w:rPr>
           <w:szCs w:val="22"/>
         </w:rPr>
-        <w:t xml:space="preserve">, Rachel </w:t>
-      </w:r>
-      <w:proofErr w:type="spellStart"/>
-      <w:r>
-        <w:rPr>
-          <w:szCs w:val="22"/>
-        </w:rPr>
-        <w:t>Sabatello</w:t>
-      </w:r>
-      <w:proofErr w:type="spellEnd"/>
-      <w:r>
-        <w:rPr>
-          <w:szCs w:val="22"/>
-        </w:rPr>
-        <w:t xml:space="preserve">, and two anonymous reviewers </w:t>
+        <w:t xml:space="preserve">, Rachel Sabatello, and two anonymous reviewers </w:t>
       </w:r>
       <w:r>
         <w:rPr>
@@ -23878,7 +25233,21 @@
         <w:rPr>
           <w:szCs w:val="22"/>
         </w:rPr>
-        <w:t xml:space="preserve">, PS 19(4). Retrieved from osf.io.pj5hb. </w:t>
+        <w:t xml:space="preserve">, PS 19(4). Retrieved from </w:t>
+      </w:r>
+      <w:proofErr w:type="gramStart"/>
+      <w:r>
+        <w:rPr>
+          <w:szCs w:val="22"/>
+        </w:rPr>
+        <w:t>osf.io.pj</w:t>
+      </w:r>
+      <w:proofErr w:type="gramEnd"/>
+      <w:r>
+        <w:rPr>
+          <w:szCs w:val="22"/>
+        </w:rPr>
+        <w:t xml:space="preserve">5hb. </w:t>
       </w:r>
     </w:p>
     <w:p>
@@ -23925,19 +25294,11 @@
         </w:rPr>
       </w:pPr>
       <w:hyperlink w:history="1"/>
-      <w:proofErr w:type="spellStart"/>
-      <w:r>
-        <w:rPr>
-          <w:szCs w:val="22"/>
-        </w:rPr>
-        <w:t>Bejjanki</w:t>
-      </w:r>
-      <w:proofErr w:type="spellEnd"/>
-      <w:r>
-        <w:rPr>
-          <w:szCs w:val="22"/>
-        </w:rPr>
-        <w:t xml:space="preserve">, </w:t>
+      <w:r>
+        <w:rPr>
+          <w:szCs w:val="22"/>
+        </w:rPr>
+        <w:t xml:space="preserve">Bejjanki, </w:t>
       </w:r>
       <w:r>
         <w:rPr>
@@ -23967,21 +25328,7 @@
         <w:rPr>
           <w:szCs w:val="22"/>
         </w:rPr>
-        <w:t xml:space="preserve">, </w:t>
-      </w:r>
-      <w:proofErr w:type="spellStart"/>
-      <w:r>
-        <w:rPr>
-          <w:szCs w:val="22"/>
-        </w:rPr>
-        <w:t>Clayards</w:t>
-      </w:r>
-      <w:proofErr w:type="spellEnd"/>
-      <w:r>
-        <w:rPr>
-          <w:szCs w:val="22"/>
-        </w:rPr>
-        <w:t xml:space="preserve"> M</w:t>
+        <w:t>, Clayards M</w:t>
       </w:r>
       <w:r>
         <w:rPr>
@@ -24343,7 +25690,21 @@
         <w:rPr>
           <w:szCs w:val="22"/>
         </w:rPr>
-        <w:t xml:space="preserve">Fowler, C. A. (2004). Speech as a Supramodal or </w:t>
+        <w:t xml:space="preserve">Fowler, C. A. (2004). Speech as a </w:t>
+      </w:r>
+      <w:proofErr w:type="spellStart"/>
+      <w:r>
+        <w:rPr>
+          <w:szCs w:val="22"/>
+        </w:rPr>
+        <w:t>Supramodal</w:t>
+      </w:r>
+      <w:proofErr w:type="spellEnd"/>
+      <w:r>
+        <w:rPr>
+          <w:szCs w:val="22"/>
+        </w:rPr>
+        <w:t xml:space="preserve"> or </w:t>
       </w:r>
       <w:proofErr w:type="spellStart"/>
       <w:r>
@@ -24891,7 +26252,21 @@
           <w:szCs w:val="22"/>
         </w:rPr>
         <w:lastRenderedPageBreak/>
-        <w:t xml:space="preserve">Kraljic, T., &amp; Samuel, A. G. (2011). Perceptual learning evidence for contextually-specific representations. </w:t>
+        <w:t xml:space="preserve">Kraljic, T., &amp; Samuel, A. G. (2011). Perceptual learning evidence for </w:t>
+      </w:r>
+      <w:proofErr w:type="gramStart"/>
+      <w:r>
+        <w:rPr>
+          <w:szCs w:val="22"/>
+        </w:rPr>
+        <w:t>contextually-specific</w:t>
+      </w:r>
+      <w:proofErr w:type="gramEnd"/>
+      <w:r>
+        <w:rPr>
+          <w:szCs w:val="22"/>
+        </w:rPr>
+        <w:t xml:space="preserve"> representations. </w:t>
       </w:r>
       <w:r>
         <w:rPr>
@@ -26185,7 +27560,7 @@
 </file>
 
 <file path=word/endnotes.xml><?xml version="1.0" encoding="utf-8"?>
-<w:endnotes xmlns:wpc="http://schemas.microsoft.com/office/word/2010/wordprocessingCanvas" xmlns:cx="http://schemas.microsoft.com/office/drawing/2014/chartex" xmlns:cx1="http://schemas.microsoft.com/office/drawing/2015/9/8/chartex" xmlns:cx2="http://schemas.microsoft.com/office/drawing/2015/10/21/chartex" xmlns:cx3="http://schemas.microsoft.com/office/drawing/2016/5/9/chartex" xmlns:cx4="http://schemas.microsoft.com/office/drawing/2016/5/10/chartex" xmlns:cx5="http://schemas.microsoft.com/office/drawing/2016/5/11/chartex" xmlns:cx6="http://schemas.microsoft.com/office/drawing/2016/5/12/chartex" xmlns:cx7="http://schemas.microsoft.com/office/drawing/2016/5/13/chartex" xmlns:cx8="http://schemas.microsoft.com/office/drawing/2016/5/14/chartex" xmlns:mc="http://schemas.openxmlformats.org/markup-compatibility/2006" xmlns:aink="http://schemas.microsoft.com/office/drawing/2016/ink" xmlns:am3d="http://schemas.microsoft.com/office/drawing/2017/model3d" xmlns:o="urn:schemas-microsoft-com:office:office" xmlns:oel="http://schemas.microsoft.com/office/2019/extlst" xmlns:r="http://schemas.openxmlformats.org/officeDocument/2006/relationships" xmlns:m="http://schemas.openxmlformats.org/officeDocument/2006/math" xmlns:v="urn:schemas-microsoft-com:vml" xmlns:wp14="http://schemas.microsoft.com/office/word/2010/wordprocessingDrawing" xmlns:wp="http://schemas.openxmlformats.org/drawingml/2006/wordprocessingDrawing" xmlns:w10="urn:schemas-microsoft-com:office:word" xmlns:w="http://schemas.openxmlformats.org/wordprocessingml/2006/main" xmlns:w14="http://schemas.microsoft.com/office/word/2010/wordml" xmlns:w15="http://schemas.microsoft.com/office/word/2012/wordml" xmlns:w16cex="http://schemas.microsoft.com/office/word/2018/wordml/cex" xmlns:w16cid="http://schemas.microsoft.com/office/word/2016/wordml/cid" xmlns:w16="http://schemas.microsoft.com/office/word/2018/wordml" xmlns:w16du="http://schemas.microsoft.com/office/word/2023/wordml/word16du" xmlns:w16sdtdh="http://schemas.microsoft.com/office/word/2020/wordml/sdtdatahash" xmlns:w16se="http://schemas.microsoft.com/office/word/2015/wordml/symex" xmlns:wpg="http://schemas.microsoft.com/office/word/2010/wordprocessingGroup" xmlns:wpi="http://schemas.microsoft.com/office/word/2010/wordprocessingInk" xmlns:wne="http://schemas.microsoft.com/office/word/2006/wordml" xmlns:wps="http://schemas.microsoft.com/office/word/2010/wordprocessingShape" mc:Ignorable="w14 w15 w16se w16cid w16 w16cex w16sdtdh w16du wp14">
+<w:endnotes xmlns:wpc="http://schemas.microsoft.com/office/word/2010/wordprocessingCanvas" xmlns:cx="http://schemas.microsoft.com/office/drawing/2014/chartex" xmlns:cx1="http://schemas.microsoft.com/office/drawing/2015/9/8/chartex" xmlns:cx2="http://schemas.microsoft.com/office/drawing/2015/10/21/chartex" xmlns:cx3="http://schemas.microsoft.com/office/drawing/2016/5/9/chartex" xmlns:cx4="http://schemas.microsoft.com/office/drawing/2016/5/10/chartex" xmlns:cx5="http://schemas.microsoft.com/office/drawing/2016/5/11/chartex" xmlns:cx6="http://schemas.microsoft.com/office/drawing/2016/5/12/chartex" xmlns:cx7="http://schemas.microsoft.com/office/drawing/2016/5/13/chartex" xmlns:cx8="http://schemas.microsoft.com/office/drawing/2016/5/14/chartex" xmlns:mc="http://schemas.openxmlformats.org/markup-compatibility/2006" xmlns:aink="http://schemas.microsoft.com/office/drawing/2016/ink" xmlns:am3d="http://schemas.microsoft.com/office/drawing/2017/model3d" xmlns:o="urn:schemas-microsoft-com:office:office" xmlns:oel="http://schemas.microsoft.com/office/2019/extlst" xmlns:r="http://schemas.openxmlformats.org/officeDocument/2006/relationships" xmlns:m="http://schemas.openxmlformats.org/officeDocument/2006/math" xmlns:v="urn:schemas-microsoft-com:vml" xmlns:wp14="http://schemas.microsoft.com/office/word/2010/wordprocessingDrawing" xmlns:wp="http://schemas.openxmlformats.org/drawingml/2006/wordprocessingDrawing" xmlns:w10="urn:schemas-microsoft-com:office:word" xmlns:w="http://schemas.openxmlformats.org/wordprocessingml/2006/main" xmlns:w14="http://schemas.microsoft.com/office/word/2010/wordml" xmlns:w15="http://schemas.microsoft.com/office/word/2012/wordml" xmlns:w16cex="http://schemas.microsoft.com/office/word/2018/wordml/cex" xmlns:w16cid="http://schemas.microsoft.com/office/word/2016/wordml/cid" xmlns:w16="http://schemas.microsoft.com/office/word/2018/wordml" xmlns:w16du="http://schemas.microsoft.com/office/word/2023/wordml/word16du" xmlns:w16sdtdh="http://schemas.microsoft.com/office/word/2020/wordml/sdtdatahash" xmlns:w16sdtfl="http://schemas.microsoft.com/office/word/2024/wordml/sdtformatlock" xmlns:w16se="http://schemas.microsoft.com/office/word/2015/wordml/symex" xmlns:wpg="http://schemas.microsoft.com/office/word/2010/wordprocessingGroup" xmlns:wpi="http://schemas.microsoft.com/office/word/2010/wordprocessingInk" xmlns:wne="http://schemas.microsoft.com/office/word/2006/wordml" xmlns:wps="http://schemas.microsoft.com/office/word/2010/wordprocessingShape" mc:Ignorable="w14 w15 w16se w16cid w16 w16cex w16sdtdh w16sdtfl w16du wp14">
   <w:endnote w:type="separator" w:id="-1">
     <w:p>
       <w:r>
@@ -26207,7 +27582,7 @@
 </file>
 
 <file path=word/footer1.xml><?xml version="1.0" encoding="utf-8"?>
-<w:ftr xmlns:wpc="http://schemas.microsoft.com/office/word/2010/wordprocessingCanvas" xmlns:cx="http://schemas.microsoft.com/office/drawing/2014/chartex" xmlns:cx1="http://schemas.microsoft.com/office/drawing/2015/9/8/chartex" xmlns:cx2="http://schemas.microsoft.com/office/drawing/2015/10/21/chartex" xmlns:cx3="http://schemas.microsoft.com/office/drawing/2016/5/9/chartex" xmlns:cx4="http://schemas.microsoft.com/office/drawing/2016/5/10/chartex" xmlns:cx5="http://schemas.microsoft.com/office/drawing/2016/5/11/chartex" xmlns:cx6="http://schemas.microsoft.com/office/drawing/2016/5/12/chartex" xmlns:cx7="http://schemas.microsoft.com/office/drawing/2016/5/13/chartex" xmlns:cx8="http://schemas.microsoft.com/office/drawing/2016/5/14/chartex" xmlns:mc="http://schemas.openxmlformats.org/markup-compatibility/2006" xmlns:aink="http://schemas.microsoft.com/office/drawing/2016/ink" xmlns:am3d="http://schemas.microsoft.com/office/drawing/2017/model3d" xmlns:o="urn:schemas-microsoft-com:office:office" xmlns:oel="http://schemas.microsoft.com/office/2019/extlst" xmlns:r="http://schemas.openxmlformats.org/officeDocument/2006/relationships" xmlns:m="http://schemas.openxmlformats.org/officeDocument/2006/math" xmlns:v="urn:schemas-microsoft-com:vml" xmlns:wp14="http://schemas.microsoft.com/office/word/2010/wordprocessingDrawing" xmlns:wp="http://schemas.openxmlformats.org/drawingml/2006/wordprocessingDrawing" xmlns:w10="urn:schemas-microsoft-com:office:word" xmlns:w="http://schemas.openxmlformats.org/wordprocessingml/2006/main" xmlns:w14="http://schemas.microsoft.com/office/word/2010/wordml" xmlns:w15="http://schemas.microsoft.com/office/word/2012/wordml" xmlns:w16cex="http://schemas.microsoft.com/office/word/2018/wordml/cex" xmlns:w16cid="http://schemas.microsoft.com/office/word/2016/wordml/cid" xmlns:w16="http://schemas.microsoft.com/office/word/2018/wordml" xmlns:w16du="http://schemas.microsoft.com/office/word/2023/wordml/word16du" xmlns:w16sdtdh="http://schemas.microsoft.com/office/word/2020/wordml/sdtdatahash" xmlns:w16se="http://schemas.microsoft.com/office/word/2015/wordml/symex" xmlns:wpg="http://schemas.microsoft.com/office/word/2010/wordprocessingGroup" xmlns:wpi="http://schemas.microsoft.com/office/word/2010/wordprocessingInk" xmlns:wne="http://schemas.microsoft.com/office/word/2006/wordml" xmlns:wps="http://schemas.microsoft.com/office/word/2010/wordprocessingShape" mc:Ignorable="w14 w15 w16se w16cid w16 w16cex w16sdtdh w16du wp14">
+<w:ftr xmlns:wpc="http://schemas.microsoft.com/office/word/2010/wordprocessingCanvas" xmlns:cx="http://schemas.microsoft.com/office/drawing/2014/chartex" xmlns:cx1="http://schemas.microsoft.com/office/drawing/2015/9/8/chartex" xmlns:cx2="http://schemas.microsoft.com/office/drawing/2015/10/21/chartex" xmlns:cx3="http://schemas.microsoft.com/office/drawing/2016/5/9/chartex" xmlns:cx4="http://schemas.microsoft.com/office/drawing/2016/5/10/chartex" xmlns:cx5="http://schemas.microsoft.com/office/drawing/2016/5/11/chartex" xmlns:cx6="http://schemas.microsoft.com/office/drawing/2016/5/12/chartex" xmlns:cx7="http://schemas.microsoft.com/office/drawing/2016/5/13/chartex" xmlns:cx8="http://schemas.microsoft.com/office/drawing/2016/5/14/chartex" xmlns:mc="http://schemas.openxmlformats.org/markup-compatibility/2006" xmlns:aink="http://schemas.microsoft.com/office/drawing/2016/ink" xmlns:am3d="http://schemas.microsoft.com/office/drawing/2017/model3d" xmlns:o="urn:schemas-microsoft-com:office:office" xmlns:oel="http://schemas.microsoft.com/office/2019/extlst" xmlns:r="http://schemas.openxmlformats.org/officeDocument/2006/relationships" xmlns:m="http://schemas.openxmlformats.org/officeDocument/2006/math" xmlns:v="urn:schemas-microsoft-com:vml" xmlns:wp14="http://schemas.microsoft.com/office/word/2010/wordprocessingDrawing" xmlns:wp="http://schemas.openxmlformats.org/drawingml/2006/wordprocessingDrawing" xmlns:w10="urn:schemas-microsoft-com:office:word" xmlns:w="http://schemas.openxmlformats.org/wordprocessingml/2006/main" xmlns:w14="http://schemas.microsoft.com/office/word/2010/wordml" xmlns:w15="http://schemas.microsoft.com/office/word/2012/wordml" xmlns:w16cex="http://schemas.microsoft.com/office/word/2018/wordml/cex" xmlns:w16cid="http://schemas.microsoft.com/office/word/2016/wordml/cid" xmlns:w16="http://schemas.microsoft.com/office/word/2018/wordml" xmlns:w16du="http://schemas.microsoft.com/office/word/2023/wordml/word16du" xmlns:w16sdtdh="http://schemas.microsoft.com/office/word/2020/wordml/sdtdatahash" xmlns:w16sdtfl="http://schemas.microsoft.com/office/word/2024/wordml/sdtformatlock" xmlns:w16se="http://schemas.microsoft.com/office/word/2015/wordml/symex" xmlns:wpg="http://schemas.microsoft.com/office/word/2010/wordprocessingGroup" xmlns:wpi="http://schemas.microsoft.com/office/word/2010/wordprocessingInk" xmlns:wne="http://schemas.microsoft.com/office/word/2006/wordml" xmlns:wps="http://schemas.microsoft.com/office/word/2010/wordprocessingShape" mc:Ignorable="w14 w15 w16se w16cid w16 w16cex w16sdtdh w16sdtfl w16du wp14">
   <w:sdt>
     <w:sdtPr>
       <w:rPr>
@@ -26257,7 +27632,7 @@
 </file>
 
 <file path=word/footer2.xml><?xml version="1.0" encoding="utf-8"?>
-<w:ftr xmlns:wpc="http://schemas.microsoft.com/office/word/2010/wordprocessingCanvas" xmlns:cx="http://schemas.microsoft.com/office/drawing/2014/chartex" xmlns:cx1="http://schemas.microsoft.com/office/drawing/2015/9/8/chartex" xmlns:cx2="http://schemas.microsoft.com/office/drawing/2015/10/21/chartex" xmlns:cx3="http://schemas.microsoft.com/office/drawing/2016/5/9/chartex" xmlns:cx4="http://schemas.microsoft.com/office/drawing/2016/5/10/chartex" xmlns:cx5="http://schemas.microsoft.com/office/drawing/2016/5/11/chartex" xmlns:cx6="http://schemas.microsoft.com/office/drawing/2016/5/12/chartex" xmlns:cx7="http://schemas.microsoft.com/office/drawing/2016/5/13/chartex" xmlns:cx8="http://schemas.microsoft.com/office/drawing/2016/5/14/chartex" xmlns:mc="http://schemas.openxmlformats.org/markup-compatibility/2006" xmlns:aink="http://schemas.microsoft.com/office/drawing/2016/ink" xmlns:am3d="http://schemas.microsoft.com/office/drawing/2017/model3d" xmlns:o="urn:schemas-microsoft-com:office:office" xmlns:oel="http://schemas.microsoft.com/office/2019/extlst" xmlns:r="http://schemas.openxmlformats.org/officeDocument/2006/relationships" xmlns:m="http://schemas.openxmlformats.org/officeDocument/2006/math" xmlns:v="urn:schemas-microsoft-com:vml" xmlns:wp14="http://schemas.microsoft.com/office/word/2010/wordprocessingDrawing" xmlns:wp="http://schemas.openxmlformats.org/drawingml/2006/wordprocessingDrawing" xmlns:w10="urn:schemas-microsoft-com:office:word" xmlns:w="http://schemas.openxmlformats.org/wordprocessingml/2006/main" xmlns:w14="http://schemas.microsoft.com/office/word/2010/wordml" xmlns:w15="http://schemas.microsoft.com/office/word/2012/wordml" xmlns:w16cex="http://schemas.microsoft.com/office/word/2018/wordml/cex" xmlns:w16cid="http://schemas.microsoft.com/office/word/2016/wordml/cid" xmlns:w16="http://schemas.microsoft.com/office/word/2018/wordml" xmlns:w16du="http://schemas.microsoft.com/office/word/2023/wordml/word16du" xmlns:w16sdtdh="http://schemas.microsoft.com/office/word/2020/wordml/sdtdatahash" xmlns:w16se="http://schemas.microsoft.com/office/word/2015/wordml/symex" xmlns:wpg="http://schemas.microsoft.com/office/word/2010/wordprocessingGroup" xmlns:wpi="http://schemas.microsoft.com/office/word/2010/wordprocessingInk" xmlns:wne="http://schemas.microsoft.com/office/word/2006/wordml" xmlns:wps="http://schemas.microsoft.com/office/word/2010/wordprocessingShape" mc:Ignorable="w14 w15 w16se w16cid w16 w16cex w16sdtdh w16du wp14">
+<w:ftr xmlns:wpc="http://schemas.microsoft.com/office/word/2010/wordprocessingCanvas" xmlns:cx="http://schemas.microsoft.com/office/drawing/2014/chartex" xmlns:cx1="http://schemas.microsoft.com/office/drawing/2015/9/8/chartex" xmlns:cx2="http://schemas.microsoft.com/office/drawing/2015/10/21/chartex" xmlns:cx3="http://schemas.microsoft.com/office/drawing/2016/5/9/chartex" xmlns:cx4="http://schemas.microsoft.com/office/drawing/2016/5/10/chartex" xmlns:cx5="http://schemas.microsoft.com/office/drawing/2016/5/11/chartex" xmlns:cx6="http://schemas.microsoft.com/office/drawing/2016/5/12/chartex" xmlns:cx7="http://schemas.microsoft.com/office/drawing/2016/5/13/chartex" xmlns:cx8="http://schemas.microsoft.com/office/drawing/2016/5/14/chartex" xmlns:mc="http://schemas.openxmlformats.org/markup-compatibility/2006" xmlns:aink="http://schemas.microsoft.com/office/drawing/2016/ink" xmlns:am3d="http://schemas.microsoft.com/office/drawing/2017/model3d" xmlns:o="urn:schemas-microsoft-com:office:office" xmlns:oel="http://schemas.microsoft.com/office/2019/extlst" xmlns:r="http://schemas.openxmlformats.org/officeDocument/2006/relationships" xmlns:m="http://schemas.openxmlformats.org/officeDocument/2006/math" xmlns:v="urn:schemas-microsoft-com:vml" xmlns:wp14="http://schemas.microsoft.com/office/word/2010/wordprocessingDrawing" xmlns:wp="http://schemas.openxmlformats.org/drawingml/2006/wordprocessingDrawing" xmlns:w10="urn:schemas-microsoft-com:office:word" xmlns:w="http://schemas.openxmlformats.org/wordprocessingml/2006/main" xmlns:w14="http://schemas.microsoft.com/office/word/2010/wordml" xmlns:w15="http://schemas.microsoft.com/office/word/2012/wordml" xmlns:w16cex="http://schemas.microsoft.com/office/word/2018/wordml/cex" xmlns:w16cid="http://schemas.microsoft.com/office/word/2016/wordml/cid" xmlns:w16="http://schemas.microsoft.com/office/word/2018/wordml" xmlns:w16du="http://schemas.microsoft.com/office/word/2023/wordml/word16du" xmlns:w16sdtdh="http://schemas.microsoft.com/office/word/2020/wordml/sdtdatahash" xmlns:w16sdtfl="http://schemas.microsoft.com/office/word/2024/wordml/sdtformatlock" xmlns:w16se="http://schemas.microsoft.com/office/word/2015/wordml/symex" xmlns:wpg="http://schemas.microsoft.com/office/word/2010/wordprocessingGroup" xmlns:wpi="http://schemas.microsoft.com/office/word/2010/wordprocessingInk" xmlns:wne="http://schemas.microsoft.com/office/word/2006/wordml" xmlns:wps="http://schemas.microsoft.com/office/word/2010/wordprocessingShape" mc:Ignorable="w14 w15 w16se w16cid w16 w16cex w16sdtdh w16sdtfl w16du wp14">
   <w:p>
     <w:pPr>
       <w:pStyle w:val="Footer"/>
@@ -26352,7 +27727,7 @@
 </file>
 
 <file path=word/footer3.xml><?xml version="1.0" encoding="utf-8"?>
-<w:ftr xmlns:wpc="http://schemas.microsoft.com/office/word/2010/wordprocessingCanvas" xmlns:cx="http://schemas.microsoft.com/office/drawing/2014/chartex" xmlns:cx1="http://schemas.microsoft.com/office/drawing/2015/9/8/chartex" xmlns:cx2="http://schemas.microsoft.com/office/drawing/2015/10/21/chartex" xmlns:cx3="http://schemas.microsoft.com/office/drawing/2016/5/9/chartex" xmlns:cx4="http://schemas.microsoft.com/office/drawing/2016/5/10/chartex" xmlns:cx5="http://schemas.microsoft.com/office/drawing/2016/5/11/chartex" xmlns:cx6="http://schemas.microsoft.com/office/drawing/2016/5/12/chartex" xmlns:cx7="http://schemas.microsoft.com/office/drawing/2016/5/13/chartex" xmlns:cx8="http://schemas.microsoft.com/office/drawing/2016/5/14/chartex" xmlns:mc="http://schemas.openxmlformats.org/markup-compatibility/2006" xmlns:aink="http://schemas.microsoft.com/office/drawing/2016/ink" xmlns:am3d="http://schemas.microsoft.com/office/drawing/2017/model3d" xmlns:o="urn:schemas-microsoft-com:office:office" xmlns:oel="http://schemas.microsoft.com/office/2019/extlst" xmlns:r="http://schemas.openxmlformats.org/officeDocument/2006/relationships" xmlns:m="http://schemas.openxmlformats.org/officeDocument/2006/math" xmlns:v="urn:schemas-microsoft-com:vml" xmlns:wp14="http://schemas.microsoft.com/office/word/2010/wordprocessingDrawing" xmlns:wp="http://schemas.openxmlformats.org/drawingml/2006/wordprocessingDrawing" xmlns:w10="urn:schemas-microsoft-com:office:word" xmlns:w="http://schemas.openxmlformats.org/wordprocessingml/2006/main" xmlns:w14="http://schemas.microsoft.com/office/word/2010/wordml" xmlns:w15="http://schemas.microsoft.com/office/word/2012/wordml" xmlns:w16cex="http://schemas.microsoft.com/office/word/2018/wordml/cex" xmlns:w16cid="http://schemas.microsoft.com/office/word/2016/wordml/cid" xmlns:w16="http://schemas.microsoft.com/office/word/2018/wordml" xmlns:w16du="http://schemas.microsoft.com/office/word/2023/wordml/word16du" xmlns:w16sdtdh="http://schemas.microsoft.com/office/word/2020/wordml/sdtdatahash" xmlns:w16se="http://schemas.microsoft.com/office/word/2015/wordml/symex" xmlns:wpg="http://schemas.microsoft.com/office/word/2010/wordprocessingGroup" xmlns:wpi="http://schemas.microsoft.com/office/word/2010/wordprocessingInk" xmlns:wne="http://schemas.microsoft.com/office/word/2006/wordml" xmlns:wps="http://schemas.microsoft.com/office/word/2010/wordprocessingShape" mc:Ignorable="w14 w15 w16se w16cid w16 w16cex w16sdtdh w16du wp14">
+<w:ftr xmlns:wpc="http://schemas.microsoft.com/office/word/2010/wordprocessingCanvas" xmlns:cx="http://schemas.microsoft.com/office/drawing/2014/chartex" xmlns:cx1="http://schemas.microsoft.com/office/drawing/2015/9/8/chartex" xmlns:cx2="http://schemas.microsoft.com/office/drawing/2015/10/21/chartex" xmlns:cx3="http://schemas.microsoft.com/office/drawing/2016/5/9/chartex" xmlns:cx4="http://schemas.microsoft.com/office/drawing/2016/5/10/chartex" xmlns:cx5="http://schemas.microsoft.com/office/drawing/2016/5/11/chartex" xmlns:cx6="http://schemas.microsoft.com/office/drawing/2016/5/12/chartex" xmlns:cx7="http://schemas.microsoft.com/office/drawing/2016/5/13/chartex" xmlns:cx8="http://schemas.microsoft.com/office/drawing/2016/5/14/chartex" xmlns:mc="http://schemas.openxmlformats.org/markup-compatibility/2006" xmlns:aink="http://schemas.microsoft.com/office/drawing/2016/ink" xmlns:am3d="http://schemas.microsoft.com/office/drawing/2017/model3d" xmlns:o="urn:schemas-microsoft-com:office:office" xmlns:oel="http://schemas.microsoft.com/office/2019/extlst" xmlns:r="http://schemas.openxmlformats.org/officeDocument/2006/relationships" xmlns:m="http://schemas.openxmlformats.org/officeDocument/2006/math" xmlns:v="urn:schemas-microsoft-com:vml" xmlns:wp14="http://schemas.microsoft.com/office/word/2010/wordprocessingDrawing" xmlns:wp="http://schemas.openxmlformats.org/drawingml/2006/wordprocessingDrawing" xmlns:w10="urn:schemas-microsoft-com:office:word" xmlns:w="http://schemas.openxmlformats.org/wordprocessingml/2006/main" xmlns:w14="http://schemas.microsoft.com/office/word/2010/wordml" xmlns:w15="http://schemas.microsoft.com/office/word/2012/wordml" xmlns:w16cex="http://schemas.microsoft.com/office/word/2018/wordml/cex" xmlns:w16cid="http://schemas.microsoft.com/office/word/2016/wordml/cid" xmlns:w16="http://schemas.microsoft.com/office/word/2018/wordml" xmlns:w16du="http://schemas.microsoft.com/office/word/2023/wordml/word16du" xmlns:w16sdtdh="http://schemas.microsoft.com/office/word/2020/wordml/sdtdatahash" xmlns:w16sdtfl="http://schemas.microsoft.com/office/word/2024/wordml/sdtformatlock" xmlns:w16se="http://schemas.microsoft.com/office/word/2015/wordml/symex" xmlns:wpg="http://schemas.microsoft.com/office/word/2010/wordprocessingGroup" xmlns:wpi="http://schemas.microsoft.com/office/word/2010/wordprocessingInk" xmlns:wne="http://schemas.microsoft.com/office/word/2006/wordml" xmlns:wps="http://schemas.microsoft.com/office/word/2010/wordprocessingShape" mc:Ignorable="w14 w15 w16se w16cid w16 w16cex w16sdtdh w16sdtfl w16du wp14">
   <w:p>
     <w:pPr>
       <w:pStyle w:val="Footer"/>
@@ -26447,7 +27822,7 @@
 </file>
 
 <file path=word/footnotes.xml><?xml version="1.0" encoding="utf-8"?>
-<w:footnotes xmlns:wpc="http://schemas.microsoft.com/office/word/2010/wordprocessingCanvas" xmlns:cx="http://schemas.microsoft.com/office/drawing/2014/chartex" xmlns:cx1="http://schemas.microsoft.com/office/drawing/2015/9/8/chartex" xmlns:cx2="http://schemas.microsoft.com/office/drawing/2015/10/21/chartex" xmlns:cx3="http://schemas.microsoft.com/office/drawing/2016/5/9/chartex" xmlns:cx4="http://schemas.microsoft.com/office/drawing/2016/5/10/chartex" xmlns:cx5="http://schemas.microsoft.com/office/drawing/2016/5/11/chartex" xmlns:cx6="http://schemas.microsoft.com/office/drawing/2016/5/12/chartex" xmlns:cx7="http://schemas.microsoft.com/office/drawing/2016/5/13/chartex" xmlns:cx8="http://schemas.microsoft.com/office/drawing/2016/5/14/chartex" xmlns:mc="http://schemas.openxmlformats.org/markup-compatibility/2006" xmlns:aink="http://schemas.microsoft.com/office/drawing/2016/ink" xmlns:am3d="http://schemas.microsoft.com/office/drawing/2017/model3d" xmlns:o="urn:schemas-microsoft-com:office:office" xmlns:oel="http://schemas.microsoft.com/office/2019/extlst" xmlns:r="http://schemas.openxmlformats.org/officeDocument/2006/relationships" xmlns:m="http://schemas.openxmlformats.org/officeDocument/2006/math" xmlns:v="urn:schemas-microsoft-com:vml" xmlns:wp14="http://schemas.microsoft.com/office/word/2010/wordprocessingDrawing" xmlns:wp="http://schemas.openxmlformats.org/drawingml/2006/wordprocessingDrawing" xmlns:w10="urn:schemas-microsoft-com:office:word" xmlns:w="http://schemas.openxmlformats.org/wordprocessingml/2006/main" xmlns:w14="http://schemas.microsoft.com/office/word/2010/wordml" xmlns:w15="http://schemas.microsoft.com/office/word/2012/wordml" xmlns:w16cex="http://schemas.microsoft.com/office/word/2018/wordml/cex" xmlns:w16cid="http://schemas.microsoft.com/office/word/2016/wordml/cid" xmlns:w16="http://schemas.microsoft.com/office/word/2018/wordml" xmlns:w16du="http://schemas.microsoft.com/office/word/2023/wordml/word16du" xmlns:w16sdtdh="http://schemas.microsoft.com/office/word/2020/wordml/sdtdatahash" xmlns:w16se="http://schemas.microsoft.com/office/word/2015/wordml/symex" xmlns:wpg="http://schemas.microsoft.com/office/word/2010/wordprocessingGroup" xmlns:wpi="http://schemas.microsoft.com/office/word/2010/wordprocessingInk" xmlns:wne="http://schemas.microsoft.com/office/word/2006/wordml" xmlns:wps="http://schemas.microsoft.com/office/word/2010/wordprocessingShape" mc:Ignorable="w14 w15 w16se w16cid w16 w16cex w16sdtdh w16du wp14">
+<w:footnotes xmlns:wpc="http://schemas.microsoft.com/office/word/2010/wordprocessingCanvas" xmlns:cx="http://schemas.microsoft.com/office/drawing/2014/chartex" xmlns:cx1="http://schemas.microsoft.com/office/drawing/2015/9/8/chartex" xmlns:cx2="http://schemas.microsoft.com/office/drawing/2015/10/21/chartex" xmlns:cx3="http://schemas.microsoft.com/office/drawing/2016/5/9/chartex" xmlns:cx4="http://schemas.microsoft.com/office/drawing/2016/5/10/chartex" xmlns:cx5="http://schemas.microsoft.com/office/drawing/2016/5/11/chartex" xmlns:cx6="http://schemas.microsoft.com/office/drawing/2016/5/12/chartex" xmlns:cx7="http://schemas.microsoft.com/office/drawing/2016/5/13/chartex" xmlns:cx8="http://schemas.microsoft.com/office/drawing/2016/5/14/chartex" xmlns:mc="http://schemas.openxmlformats.org/markup-compatibility/2006" xmlns:aink="http://schemas.microsoft.com/office/drawing/2016/ink" xmlns:am3d="http://schemas.microsoft.com/office/drawing/2017/model3d" xmlns:o="urn:schemas-microsoft-com:office:office" xmlns:oel="http://schemas.microsoft.com/office/2019/extlst" xmlns:r="http://schemas.openxmlformats.org/officeDocument/2006/relationships" xmlns:m="http://schemas.openxmlformats.org/officeDocument/2006/math" xmlns:v="urn:schemas-microsoft-com:vml" xmlns:wp14="http://schemas.microsoft.com/office/word/2010/wordprocessingDrawing" xmlns:wp="http://schemas.openxmlformats.org/drawingml/2006/wordprocessingDrawing" xmlns:w10="urn:schemas-microsoft-com:office:word" xmlns:w="http://schemas.openxmlformats.org/wordprocessingml/2006/main" xmlns:w14="http://schemas.microsoft.com/office/word/2010/wordml" xmlns:w15="http://schemas.microsoft.com/office/word/2012/wordml" xmlns:w16cex="http://schemas.microsoft.com/office/word/2018/wordml/cex" xmlns:w16cid="http://schemas.microsoft.com/office/word/2016/wordml/cid" xmlns:w16="http://schemas.microsoft.com/office/word/2018/wordml" xmlns:w16du="http://schemas.microsoft.com/office/word/2023/wordml/word16du" xmlns:w16sdtdh="http://schemas.microsoft.com/office/word/2020/wordml/sdtdatahash" xmlns:w16sdtfl="http://schemas.microsoft.com/office/word/2024/wordml/sdtformatlock" xmlns:w16se="http://schemas.microsoft.com/office/word/2015/wordml/symex" xmlns:wpg="http://schemas.microsoft.com/office/word/2010/wordprocessingGroup" xmlns:wpi="http://schemas.microsoft.com/office/word/2010/wordprocessingInk" xmlns:wne="http://schemas.microsoft.com/office/word/2006/wordml" xmlns:wps="http://schemas.microsoft.com/office/word/2010/wordprocessingShape" mc:Ignorable="w14 w15 w16se w16cid w16 w16cex w16sdtdh w16sdtfl w16du wp14">
   <w:footnote w:type="separator" w:id="-1">
     <w:p>
       <w:r>
@@ -26769,7 +28144,15 @@
         <w:t xml:space="preserve"> </w:t>
       </w:r>
       <w:r>
-        <w:t>approach more conservative, and decided on this change prior to analysis</w:t>
+        <w:t xml:space="preserve">approach more </w:t>
+      </w:r>
+      <w:proofErr w:type="gramStart"/>
+      <w:r>
+        <w:t>conservative, and</w:t>
+      </w:r>
+      <w:proofErr w:type="gramEnd"/>
+      <w:r>
+        <w:t xml:space="preserve"> decided on this change prior to analysis</w:t>
       </w:r>
       <w:r>
         <w:t xml:space="preserve">. </w:t>
@@ -26842,7 +28225,7 @@
 </file>
 
 <file path=word/header1.xml><?xml version="1.0" encoding="utf-8"?>
-<w:hdr xmlns:wpc="http://schemas.microsoft.com/office/word/2010/wordprocessingCanvas" xmlns:cx="http://schemas.microsoft.com/office/drawing/2014/chartex" xmlns:cx1="http://schemas.microsoft.com/office/drawing/2015/9/8/chartex" xmlns:cx2="http://schemas.microsoft.com/office/drawing/2015/10/21/chartex" xmlns:cx3="http://schemas.microsoft.com/office/drawing/2016/5/9/chartex" xmlns:cx4="http://schemas.microsoft.com/office/drawing/2016/5/10/chartex" xmlns:cx5="http://schemas.microsoft.com/office/drawing/2016/5/11/chartex" xmlns:cx6="http://schemas.microsoft.com/office/drawing/2016/5/12/chartex" xmlns:cx7="http://schemas.microsoft.com/office/drawing/2016/5/13/chartex" xmlns:cx8="http://schemas.microsoft.com/office/drawing/2016/5/14/chartex" xmlns:mc="http://schemas.openxmlformats.org/markup-compatibility/2006" xmlns:aink="http://schemas.microsoft.com/office/drawing/2016/ink" xmlns:am3d="http://schemas.microsoft.com/office/drawing/2017/model3d" xmlns:o="urn:schemas-microsoft-com:office:office" xmlns:oel="http://schemas.microsoft.com/office/2019/extlst" xmlns:r="http://schemas.openxmlformats.org/officeDocument/2006/relationships" xmlns:m="http://schemas.openxmlformats.org/officeDocument/2006/math" xmlns:v="urn:schemas-microsoft-com:vml" xmlns:wp14="http://schemas.microsoft.com/office/word/2010/wordprocessingDrawing" xmlns:wp="http://schemas.openxmlformats.org/drawingml/2006/wordprocessingDrawing" xmlns:w10="urn:schemas-microsoft-com:office:word" xmlns:w="http://schemas.openxmlformats.org/wordprocessingml/2006/main" xmlns:w14="http://schemas.microsoft.com/office/word/2010/wordml" xmlns:w15="http://schemas.microsoft.com/office/word/2012/wordml" xmlns:w16cex="http://schemas.microsoft.com/office/word/2018/wordml/cex" xmlns:w16cid="http://schemas.microsoft.com/office/word/2016/wordml/cid" xmlns:w16="http://schemas.microsoft.com/office/word/2018/wordml" xmlns:w16du="http://schemas.microsoft.com/office/word/2023/wordml/word16du" xmlns:w16sdtdh="http://schemas.microsoft.com/office/word/2020/wordml/sdtdatahash" xmlns:w16se="http://schemas.microsoft.com/office/word/2015/wordml/symex" xmlns:wpg="http://schemas.microsoft.com/office/word/2010/wordprocessingGroup" xmlns:wpi="http://schemas.microsoft.com/office/word/2010/wordprocessingInk" xmlns:wne="http://schemas.microsoft.com/office/word/2006/wordml" xmlns:wps="http://schemas.microsoft.com/office/word/2010/wordprocessingShape" mc:Ignorable="w14 w15 w16se w16cid w16 w16cex w16sdtdh w16du wp14">
+<w:hdr xmlns:wpc="http://schemas.microsoft.com/office/word/2010/wordprocessingCanvas" xmlns:cx="http://schemas.microsoft.com/office/drawing/2014/chartex" xmlns:cx1="http://schemas.microsoft.com/office/drawing/2015/9/8/chartex" xmlns:cx2="http://schemas.microsoft.com/office/drawing/2015/10/21/chartex" xmlns:cx3="http://schemas.microsoft.com/office/drawing/2016/5/9/chartex" xmlns:cx4="http://schemas.microsoft.com/office/drawing/2016/5/10/chartex" xmlns:cx5="http://schemas.microsoft.com/office/drawing/2016/5/11/chartex" xmlns:cx6="http://schemas.microsoft.com/office/drawing/2016/5/12/chartex" xmlns:cx7="http://schemas.microsoft.com/office/drawing/2016/5/13/chartex" xmlns:cx8="http://schemas.microsoft.com/office/drawing/2016/5/14/chartex" xmlns:mc="http://schemas.openxmlformats.org/markup-compatibility/2006" xmlns:aink="http://schemas.microsoft.com/office/drawing/2016/ink" xmlns:am3d="http://schemas.microsoft.com/office/drawing/2017/model3d" xmlns:o="urn:schemas-microsoft-com:office:office" xmlns:oel="http://schemas.microsoft.com/office/2019/extlst" xmlns:r="http://schemas.openxmlformats.org/officeDocument/2006/relationships" xmlns:m="http://schemas.openxmlformats.org/officeDocument/2006/math" xmlns:v="urn:schemas-microsoft-com:vml" xmlns:wp14="http://schemas.microsoft.com/office/word/2010/wordprocessingDrawing" xmlns:wp="http://schemas.openxmlformats.org/drawingml/2006/wordprocessingDrawing" xmlns:w10="urn:schemas-microsoft-com:office:word" xmlns:w="http://schemas.openxmlformats.org/wordprocessingml/2006/main" xmlns:w14="http://schemas.microsoft.com/office/word/2010/wordml" xmlns:w15="http://schemas.microsoft.com/office/word/2012/wordml" xmlns:w16cex="http://schemas.microsoft.com/office/word/2018/wordml/cex" xmlns:w16cid="http://schemas.microsoft.com/office/word/2016/wordml/cid" xmlns:w16="http://schemas.microsoft.com/office/word/2018/wordml" xmlns:w16du="http://schemas.microsoft.com/office/word/2023/wordml/word16du" xmlns:w16sdtdh="http://schemas.microsoft.com/office/word/2020/wordml/sdtdatahash" xmlns:w16sdtfl="http://schemas.microsoft.com/office/word/2024/wordml/sdtformatlock" xmlns:w16se="http://schemas.microsoft.com/office/word/2015/wordml/symex" xmlns:wpg="http://schemas.microsoft.com/office/word/2010/wordprocessingGroup" xmlns:wpi="http://schemas.microsoft.com/office/word/2010/wordprocessingInk" xmlns:wne="http://schemas.microsoft.com/office/word/2006/wordml" xmlns:wps="http://schemas.microsoft.com/office/word/2010/wordprocessingShape" mc:Ignorable="w14 w15 w16se w16cid w16 w16cex w16sdtdh w16sdtfl w16du wp14">
   <w:p>
     <w:pPr>
       <w:pStyle w:val="Header"/>
@@ -26867,7 +28250,7 @@
 </file>
 
 <file path=word/numbering.xml><?xml version="1.0" encoding="utf-8"?>
-<w:numbering xmlns:wpc="http://schemas.microsoft.com/office/word/2010/wordprocessingCanvas" xmlns:cx="http://schemas.microsoft.com/office/drawing/2014/chartex" xmlns:cx1="http://schemas.microsoft.com/office/drawing/2015/9/8/chartex" xmlns:cx2="http://schemas.microsoft.com/office/drawing/2015/10/21/chartex" xmlns:cx3="http://schemas.microsoft.com/office/drawing/2016/5/9/chartex" xmlns:cx4="http://schemas.microsoft.com/office/drawing/2016/5/10/chartex" xmlns:cx5="http://schemas.microsoft.com/office/drawing/2016/5/11/chartex" xmlns:cx6="http://schemas.microsoft.com/office/drawing/2016/5/12/chartex" xmlns:cx7="http://schemas.microsoft.com/office/drawing/2016/5/13/chartex" xmlns:cx8="http://schemas.microsoft.com/office/drawing/2016/5/14/chartex" xmlns:mc="http://schemas.openxmlformats.org/markup-compatibility/2006" xmlns:aink="http://schemas.microsoft.com/office/drawing/2016/ink" xmlns:am3d="http://schemas.microsoft.com/office/drawing/2017/model3d" xmlns:o="urn:schemas-microsoft-com:office:office" xmlns:oel="http://schemas.microsoft.com/office/2019/extlst" xmlns:r="http://schemas.openxmlformats.org/officeDocument/2006/relationships" xmlns:m="http://schemas.openxmlformats.org/officeDocument/2006/math" xmlns:v="urn:schemas-microsoft-com:vml" xmlns:wp14="http://schemas.microsoft.com/office/word/2010/wordprocessingDrawing" xmlns:wp="http://schemas.openxmlformats.org/drawingml/2006/wordprocessingDrawing" xmlns:w10="urn:schemas-microsoft-com:office:word" xmlns:w="http://schemas.openxmlformats.org/wordprocessingml/2006/main" xmlns:w14="http://schemas.microsoft.com/office/word/2010/wordml" xmlns:w15="http://schemas.microsoft.com/office/word/2012/wordml" xmlns:w16cex="http://schemas.microsoft.com/office/word/2018/wordml/cex" xmlns:w16cid="http://schemas.microsoft.com/office/word/2016/wordml/cid" xmlns:w16="http://schemas.microsoft.com/office/word/2018/wordml" xmlns:w16du="http://schemas.microsoft.com/office/word/2023/wordml/word16du" xmlns:w16sdtdh="http://schemas.microsoft.com/office/word/2020/wordml/sdtdatahash" xmlns:w16se="http://schemas.microsoft.com/office/word/2015/wordml/symex" xmlns:wpg="http://schemas.microsoft.com/office/word/2010/wordprocessingGroup" xmlns:wpi="http://schemas.microsoft.com/office/word/2010/wordprocessingInk" xmlns:wne="http://schemas.microsoft.com/office/word/2006/wordml" xmlns:wps="http://schemas.microsoft.com/office/word/2010/wordprocessingShape" mc:Ignorable="w14 w15 w16se w16cid w16 w16cex w16sdtdh w16du wp14">
+<w:numbering xmlns:wpc="http://schemas.microsoft.com/office/word/2010/wordprocessingCanvas" xmlns:cx="http://schemas.microsoft.com/office/drawing/2014/chartex" xmlns:cx1="http://schemas.microsoft.com/office/drawing/2015/9/8/chartex" xmlns:cx2="http://schemas.microsoft.com/office/drawing/2015/10/21/chartex" xmlns:cx3="http://schemas.microsoft.com/office/drawing/2016/5/9/chartex" xmlns:cx4="http://schemas.microsoft.com/office/drawing/2016/5/10/chartex" xmlns:cx5="http://schemas.microsoft.com/office/drawing/2016/5/11/chartex" xmlns:cx6="http://schemas.microsoft.com/office/drawing/2016/5/12/chartex" xmlns:cx7="http://schemas.microsoft.com/office/drawing/2016/5/13/chartex" xmlns:cx8="http://schemas.microsoft.com/office/drawing/2016/5/14/chartex" xmlns:mc="http://schemas.openxmlformats.org/markup-compatibility/2006" xmlns:aink="http://schemas.microsoft.com/office/drawing/2016/ink" xmlns:am3d="http://schemas.microsoft.com/office/drawing/2017/model3d" xmlns:o="urn:schemas-microsoft-com:office:office" xmlns:oel="http://schemas.microsoft.com/office/2019/extlst" xmlns:r="http://schemas.openxmlformats.org/officeDocument/2006/relationships" xmlns:m="http://schemas.openxmlformats.org/officeDocument/2006/math" xmlns:v="urn:schemas-microsoft-com:vml" xmlns:wp14="http://schemas.microsoft.com/office/word/2010/wordprocessingDrawing" xmlns:wp="http://schemas.openxmlformats.org/drawingml/2006/wordprocessingDrawing" xmlns:w10="urn:schemas-microsoft-com:office:word" xmlns:w="http://schemas.openxmlformats.org/wordprocessingml/2006/main" xmlns:w14="http://schemas.microsoft.com/office/word/2010/wordml" xmlns:w15="http://schemas.microsoft.com/office/word/2012/wordml" xmlns:w16cex="http://schemas.microsoft.com/office/word/2018/wordml/cex" xmlns:w16cid="http://schemas.microsoft.com/office/word/2016/wordml/cid" xmlns:w16="http://schemas.microsoft.com/office/word/2018/wordml" xmlns:w16du="http://schemas.microsoft.com/office/word/2023/wordml/word16du" xmlns:w16sdtdh="http://schemas.microsoft.com/office/word/2020/wordml/sdtdatahash" xmlns:w16sdtfl="http://schemas.microsoft.com/office/word/2024/wordml/sdtformatlock" xmlns:w16se="http://schemas.microsoft.com/office/word/2015/wordml/symex" xmlns:wpg="http://schemas.microsoft.com/office/word/2010/wordprocessingGroup" xmlns:wpi="http://schemas.microsoft.com/office/word/2010/wordprocessingInk" xmlns:wne="http://schemas.microsoft.com/office/word/2006/wordml" xmlns:wps="http://schemas.microsoft.com/office/word/2010/wordprocessingShape" mc:Ignorable="w14 w15 w16se w16cid w16 w16cex w16sdtdh w16sdtfl w16du wp14">
   <w:abstractNum w:abstractNumId="0" w15:restartNumberingAfterBreak="0">
     <w:nsid w:val="05EC708F"/>
     <w:multiLevelType w:val="hybridMultilevel"/>
@@ -31302,8 +32685,16 @@
 </w:numbering>
 </file>
 
+<file path=word/people.xml><?xml version="1.0" encoding="utf-8"?>
+<w15:people xmlns:wpc="http://schemas.microsoft.com/office/word/2010/wordprocessingCanvas" xmlns:cx="http://schemas.microsoft.com/office/drawing/2014/chartex" xmlns:cx1="http://schemas.microsoft.com/office/drawing/2015/9/8/chartex" xmlns:cx2="http://schemas.microsoft.com/office/drawing/2015/10/21/chartex" xmlns:cx3="http://schemas.microsoft.com/office/drawing/2016/5/9/chartex" xmlns:cx4="http://schemas.microsoft.com/office/drawing/2016/5/10/chartex" xmlns:cx5="http://schemas.microsoft.com/office/drawing/2016/5/11/chartex" xmlns:cx6="http://schemas.microsoft.com/office/drawing/2016/5/12/chartex" xmlns:cx7="http://schemas.microsoft.com/office/drawing/2016/5/13/chartex" xmlns:cx8="http://schemas.microsoft.com/office/drawing/2016/5/14/chartex" xmlns:mc="http://schemas.openxmlformats.org/markup-compatibility/2006" xmlns:aink="http://schemas.microsoft.com/office/drawing/2016/ink" xmlns:am3d="http://schemas.microsoft.com/office/drawing/2017/model3d" xmlns:o="urn:schemas-microsoft-com:office:office" xmlns:oel="http://schemas.microsoft.com/office/2019/extlst" xmlns:r="http://schemas.openxmlformats.org/officeDocument/2006/relationships" xmlns:m="http://schemas.openxmlformats.org/officeDocument/2006/math" xmlns:v="urn:schemas-microsoft-com:vml" xmlns:wp14="http://schemas.microsoft.com/office/word/2010/wordprocessingDrawing" xmlns:wp="http://schemas.openxmlformats.org/drawingml/2006/wordprocessingDrawing" xmlns:w10="urn:schemas-microsoft-com:office:word" xmlns:w="http://schemas.openxmlformats.org/wordprocessingml/2006/main" xmlns:w14="http://schemas.microsoft.com/office/word/2010/wordml" xmlns:w15="http://schemas.microsoft.com/office/word/2012/wordml" xmlns:w16cex="http://schemas.microsoft.com/office/word/2018/wordml/cex" xmlns:w16cid="http://schemas.microsoft.com/office/word/2016/wordml/cid" xmlns:w16="http://schemas.microsoft.com/office/word/2018/wordml" xmlns:w16du="http://schemas.microsoft.com/office/word/2023/wordml/word16du" xmlns:w16sdtdh="http://schemas.microsoft.com/office/word/2020/wordml/sdtdatahash" xmlns:w16sdtfl="http://schemas.microsoft.com/office/word/2024/wordml/sdtformatlock" xmlns:w16se="http://schemas.microsoft.com/office/word/2015/wordml/symex" xmlns:wpg="http://schemas.microsoft.com/office/word/2010/wordprocessingGroup" xmlns:wpi="http://schemas.microsoft.com/office/word/2010/wordprocessingInk" xmlns:wne="http://schemas.microsoft.com/office/word/2006/wordml" xmlns:wps="http://schemas.microsoft.com/office/word/2010/wordprocessingShape" mc:Ignorable="w14 w15 w16se w16cid w16 w16cex w16sdtdh w16sdtfl w16du wp14">
+  <w15:person w15:author="Jaeger, Florian">
+    <w15:presenceInfo w15:providerId="AD" w15:userId="S::fjaeger@ur.rochester.edu::0d0acd91-09a2-4ddb-a934-22efc544688e"/>
+  </w15:person>
+</w15:people>
+</file>
+
 <file path=word/styles.xml><?xml version="1.0" encoding="utf-8"?>
-<w:styles xmlns:mc="http://schemas.openxmlformats.org/markup-compatibility/2006" xmlns:r="http://schemas.openxmlformats.org/officeDocument/2006/relationships" xmlns:w="http://schemas.openxmlformats.org/wordprocessingml/2006/main" xmlns:w14="http://schemas.microsoft.com/office/word/2010/wordml" xmlns:w15="http://schemas.microsoft.com/office/word/2012/wordml" xmlns:w16cex="http://schemas.microsoft.com/office/word/2018/wordml/cex" xmlns:w16cid="http://schemas.microsoft.com/office/word/2016/wordml/cid" xmlns:w16="http://schemas.microsoft.com/office/word/2018/wordml" xmlns:w16du="http://schemas.microsoft.com/office/word/2023/wordml/word16du" xmlns:w16sdtdh="http://schemas.microsoft.com/office/word/2020/wordml/sdtdatahash" xmlns:w16se="http://schemas.microsoft.com/office/word/2015/wordml/symex" mc:Ignorable="w14 w15 w16se w16cid w16 w16cex w16sdtdh w16du">
+<w:styles xmlns:mc="http://schemas.openxmlformats.org/markup-compatibility/2006" xmlns:r="http://schemas.openxmlformats.org/officeDocument/2006/relationships" xmlns:w="http://schemas.openxmlformats.org/wordprocessingml/2006/main" xmlns:w14="http://schemas.microsoft.com/office/word/2010/wordml" xmlns:w15="http://schemas.microsoft.com/office/word/2012/wordml" xmlns:w16cex="http://schemas.microsoft.com/office/word/2018/wordml/cex" xmlns:w16cid="http://schemas.microsoft.com/office/word/2016/wordml/cid" xmlns:w16="http://schemas.microsoft.com/office/word/2018/wordml" xmlns:w16du="http://schemas.microsoft.com/office/word/2023/wordml/word16du" xmlns:w16sdtdh="http://schemas.microsoft.com/office/word/2020/wordml/sdtdatahash" xmlns:w16sdtfl="http://schemas.microsoft.com/office/word/2024/wordml/sdtformatlock" xmlns:w16se="http://schemas.microsoft.com/office/word/2015/wordml/symex" mc:Ignorable="w14 w15 w16se w16cid w16 w16cex w16sdtdh w16sdtfl w16du">
   <w:docDefaults>
     <w:rPrDefault>
       <w:rPr>
@@ -31750,6 +33141,7 @@
   <w:style w:type="character" w:default="1" w:styleId="DefaultParagraphFont">
     <w:name w:val="Default Paragraph Font"/>
     <w:uiPriority w:val="1"/>
+    <w:semiHidden/>
     <w:unhideWhenUsed/>
   </w:style>
   <w:style w:type="table" w:default="1" w:styleId="TableNormal">
@@ -32644,7 +34036,7 @@
 </file>
 
 <file path=customXml/itemProps1.xml><?xml version="1.0" encoding="utf-8"?>
-<ds:datastoreItem xmlns:ds="http://schemas.openxmlformats.org/officeDocument/2006/customXml" ds:itemID="{B20ED14E-20BD-0342-A447-925FFA2C3804}">
+<ds:datastoreItem xmlns:ds="http://schemas.openxmlformats.org/officeDocument/2006/customXml" ds:itemID="{CEAF82DD-8E2B-F442-854C-D22AA8B4402F}">
   <ds:schemaRefs>
     <ds:schemaRef ds:uri="http://schemas.openxmlformats.org/officeDocument/2006/bibliography"/>
   </ds:schemaRefs>
@@ -32652,7 +34044,7 @@
 </file>
 
 <file path=customXml/itemProps2.xml><?xml version="1.0" encoding="utf-8"?>
-<ds:datastoreItem xmlns:ds="http://schemas.openxmlformats.org/officeDocument/2006/customXml" ds:itemID="{CEAF82DD-8E2B-F442-854C-D22AA8B4402F}">
+<ds:datastoreItem xmlns:ds="http://schemas.openxmlformats.org/officeDocument/2006/customXml" ds:itemID="{B20ED14E-20BD-0342-A447-925FFA2C3804}">
   <ds:schemaRefs>
     <ds:schemaRef ds:uri="http://schemas.openxmlformats.org/officeDocument/2006/bibliography"/>
   </ds:schemaRefs>

</xml_diff>

<commit_message>
Last few edits and track changes
</commit_message>
<xml_diff>
--- a/output/papers/Round 2/manuscript-brief-clean.docx
+++ b/output/papers/Round 2/manuscript-brief-clean.docx
@@ -18855,7 +18855,19 @@
         <w:rPr>
           <w:szCs w:val="22"/>
         </w:rPr>
-        <w:t xml:space="preserve">), the effect of which was similar </w:t>
+        <w:t>), the effect of which was similar</w:t>
+      </w:r>
+      <w:r>
+        <w:rPr>
+          <w:szCs w:val="22"/>
+        </w:rPr>
+        <w:t xml:space="preserve"> and numerically greater</w:t>
+      </w:r>
+      <w:r>
+        <w:rPr>
+          <w:szCs w:val="22"/>
+        </w:rPr>
+        <w:t xml:space="preserve"> </w:t>
       </w:r>
       <w:r>
         <w:rPr>
@@ -18928,40 +18940,15 @@
         <w:rPr>
           <w:szCs w:val="22"/>
         </w:rPr>
-        <w:t xml:space="preserve"> Experiments 1a-c </w:t>
-      </w:r>
-      <w:r>
-        <w:rPr>
-          <w:szCs w:val="22"/>
-          <w:highlight w:val="yellow"/>
-        </w:rPr>
-        <w:t>(</w:t>
+        <w:t xml:space="preserve"> Experiments </w:t>
+      </w:r>
+      <w:r>
+        <w:rPr>
+          <w:szCs w:val="22"/>
+        </w:rPr>
+        <w:t>1a-c (</w:t>
       </w:r>
       <m:oMath>
-        <m:r>
-          <w:rPr>
-            <w:rFonts w:ascii="Cambria Math" w:hAnsi="Cambria Math"/>
-            <w:szCs w:val="22"/>
-            <w:highlight w:val="yellow"/>
-          </w:rPr>
-          <m:t>.2</m:t>
-        </m:r>
-        <m:r>
-          <w:rPr>
-            <w:rFonts w:ascii="Cambria Math" w:hAnsi="Cambria Math"/>
-            <w:szCs w:val="22"/>
-            <w:highlight w:val="yellow"/>
-          </w:rPr>
-          <m:t>0</m:t>
-        </m:r>
-        <m:r>
-          <w:rPr>
-            <w:rFonts w:ascii="Cambria Math" w:hAnsi="Cambria Math"/>
-            <w:szCs w:val="22"/>
-            <w:highlight w:val="yellow"/>
-          </w:rPr>
-          <m:t xml:space="preserve">&lt; </m:t>
-        </m:r>
         <m:acc>
           <m:accPr>
             <m:ctrlPr>
@@ -18969,7 +18956,6 @@
                 <w:rFonts w:ascii="Cambria Math" w:hAnsi="Cambria Math"/>
                 <w:i/>
                 <w:szCs w:val="22"/>
-                <w:highlight w:val="yellow"/>
               </w:rPr>
             </m:ctrlPr>
           </m:accPr>
@@ -18978,7 +18964,6 @@
               <w:rPr>
                 <w:rFonts w:ascii="Cambria Math" w:hAnsi="Cambria Math"/>
                 <w:szCs w:val="22"/>
-                <w:highlight w:val="yellow"/>
               </w:rPr>
               <m:t>β</m:t>
             </m:r>
@@ -18988,34 +18973,61 @@
           <w:rPr>
             <w:rFonts w:ascii="Cambria Math" w:hAnsi="Cambria Math"/>
             <w:szCs w:val="22"/>
-            <w:highlight w:val="yellow"/>
           </w:rPr>
           <m:t>s</m:t>
         </m:r>
-        <w:commentRangeStart w:id="5"/>
         <m:r>
           <w:rPr>
             <w:rFonts w:ascii="Cambria Math" w:hAnsi="Cambria Math"/>
             <w:szCs w:val="22"/>
-            <w:highlight w:val="yellow"/>
           </w:rPr>
-          <m:t>=.34</m:t>
+          <m:t xml:space="preserve"> </m:t>
         </m:r>
-        <w:commentRangeEnd w:id="5"/>
         <m:r>
           <m:rPr>
             <m:sty m:val="p"/>
           </m:rPr>
           <w:rPr>
-            <w:rStyle w:val="CommentReference"/>
+            <w:rFonts w:ascii="Cambria Math" w:hAnsi="Cambria Math"/>
+            <w:szCs w:val="22"/>
           </w:rPr>
-          <w:commentReference w:id="5"/>
+          <m:t>between</m:t>
+        </m:r>
+        <m:r>
+          <w:rPr>
+            <w:rFonts w:ascii="Cambria Math" w:hAnsi="Cambria Math"/>
+            <w:szCs w:val="22"/>
+          </w:rPr>
+          <m:t xml:space="preserve"> .20 </m:t>
+        </m:r>
+        <m:r>
+          <m:rPr>
+            <m:sty m:val="p"/>
+          </m:rPr>
+          <w:rPr>
+            <w:rFonts w:ascii="Cambria Math" w:hAnsi="Cambria Math"/>
+            <w:szCs w:val="22"/>
+          </w:rPr>
+          <m:t xml:space="preserve">and </m:t>
+        </m:r>
+        <m:r>
+          <w:rPr>
+            <w:rFonts w:ascii="Cambria Math" w:hAnsi="Cambria Math"/>
+            <w:szCs w:val="22"/>
+          </w:rPr>
+          <m:t>.</m:t>
+        </m:r>
+        <m:r>
+          <w:rPr>
+            <w:rFonts w:ascii="Cambria Math" w:hAnsi="Cambria Math"/>
+            <w:szCs w:val="22"/>
+          </w:rPr>
+          <m:t>29</m:t>
         </m:r>
       </m:oMath>
       <w:r>
         <w:rPr>
           <w:szCs w:val="22"/>
-          <w:highlight w:val="yellow"/>
         </w:rPr>
         <w:t>).</w:t>
       </w:r>
@@ -19048,7 +19060,7 @@
                     <pic:cNvPicPr/>
                   </pic:nvPicPr>
                   <pic:blipFill>
-                    <a:blip r:embed="rId21"/>
+                    <a:blip r:embed="rId17"/>
                     <a:stretch>
                       <a:fillRect/>
                     </a:stretch>
@@ -19076,7 +19088,7 @@
           <w:szCs w:val="22"/>
         </w:rPr>
       </w:pPr>
-      <w:bookmarkStart w:id="6" w:name="_Ref136190811"/>
+      <w:bookmarkStart w:id="5" w:name="_Ref136190811"/>
       <w:r>
         <w:rPr>
           <w:szCs w:val="22"/>
@@ -19115,7 +19127,7 @@
         </w:rPr>
         <w:fldChar w:fldCharType="end"/>
       </w:r>
-      <w:bookmarkEnd w:id="6"/>
+      <w:bookmarkEnd w:id="5"/>
       <w:r>
         <w:rPr>
           <w:szCs w:val="22"/>
@@ -19222,7 +19234,7 @@
       <w:pPr>
         <w:pStyle w:val="Caption"/>
       </w:pPr>
-      <w:bookmarkStart w:id="7" w:name="_Ref136190818"/>
+      <w:bookmarkStart w:id="6" w:name="_Ref136190818"/>
       <w:r>
         <w:rPr>
           <w:szCs w:val="22"/>
@@ -19262,7 +19274,7 @@
         </w:rPr>
         <w:fldChar w:fldCharType="end"/>
       </w:r>
-      <w:bookmarkEnd w:id="7"/>
+      <w:bookmarkEnd w:id="6"/>
       <w:r>
         <w:rPr>
           <w:szCs w:val="22"/>
@@ -22182,27 +22194,129 @@
         <w:t>those visual</w:t>
       </w:r>
       <w:r>
-        <w:t xml:space="preserve"> cues were masked by the black rectangle in Experiment 2.</w:t>
-      </w:r>
-      <w:r>
-        <w:rPr>
-          <w:rFonts w:ascii="Arial" w:hAnsi="Arial" w:cs="Arial"/>
-          <w:sz w:val="16"/>
-          <w:szCs w:val="16"/>
-          <w:shd w:val="clear" w:color="auto" w:fill="FFFFFF"/>
-        </w:rPr>
-        <w:t xml:space="preserve"> </w:t>
+        <w:t xml:space="preserve"> cues were masked by the black rectangle in Experiment 2</w:t>
+      </w:r>
+      <w:r>
+        <w:t>.</w:t>
       </w:r>
     </w:p>
     <w:p>
       <w:pPr>
         <w:rPr>
-          <w:rFonts w:ascii="Arial" w:hAnsi="Arial" w:cs="Arial"/>
-          <w:sz w:val="16"/>
-          <w:szCs w:val="16"/>
-          <w:shd w:val="clear" w:color="auto" w:fill="FFFFFF"/>
-        </w:rPr>
-      </w:pPr>
+          <w:szCs w:val="22"/>
+        </w:rPr>
+      </w:pPr>
+      <w:r>
+        <w:t xml:space="preserve">At first blush, the results of Experiment 2 favor hypothesis </w:t>
+      </w:r>
+      <w:r>
+        <w:t>(</w:t>
+      </w:r>
+      <w:r>
+        <w:t>1b</w:t>
+      </w:r>
+      <w:r>
+        <w:t>) described in the introduction to Experiment 2:</w:t>
+      </w:r>
+      <w:r>
+        <w:t xml:space="preserve"> that listeners </w:t>
+      </w:r>
+      <w:r>
+        <w:rPr>
+          <w:szCs w:val="22"/>
+        </w:rPr>
+        <w:t xml:space="preserve">compensate based on the visually evident state of the articulators caused by the pen in the mouth rather than the presence of the pen itself. </w:t>
+      </w:r>
+      <w:r>
+        <w:rPr>
+          <w:szCs w:val="22"/>
+        </w:rPr>
+        <w:t xml:space="preserve">It is, however, possible that </w:t>
+      </w:r>
+      <w:r>
+        <w:rPr>
+          <w:szCs w:val="22"/>
+        </w:rPr>
+        <w:t xml:space="preserve">the addition of the black box </w:t>
+      </w:r>
+      <w:r>
+        <w:rPr>
+          <w:szCs w:val="22"/>
+        </w:rPr>
+        <w:t xml:space="preserve">had effects beyond </w:t>
+      </w:r>
+      <w:r>
+        <w:rPr>
+          <w:szCs w:val="22"/>
+        </w:rPr>
+        <w:t>remov</w:t>
+      </w:r>
+      <w:r>
+        <w:rPr>
+          <w:szCs w:val="22"/>
+        </w:rPr>
+        <w:t>ing</w:t>
+      </w:r>
+      <w:r>
+        <w:rPr>
+          <w:szCs w:val="22"/>
+        </w:rPr>
+        <w:t xml:space="preserve"> </w:t>
+      </w:r>
+      <w:r>
+        <w:rPr>
+          <w:szCs w:val="22"/>
+        </w:rPr>
+        <w:t xml:space="preserve">visual </w:t>
+      </w:r>
+      <w:r>
+        <w:rPr>
+          <w:szCs w:val="22"/>
+        </w:rPr>
+        <w:t xml:space="preserve">evidence </w:t>
+      </w:r>
+      <w:r>
+        <w:rPr>
+          <w:szCs w:val="22"/>
+        </w:rPr>
+        <w:t xml:space="preserve">about </w:t>
+      </w:r>
+      <w:r>
+        <w:rPr>
+          <w:szCs w:val="22"/>
+        </w:rPr>
+        <w:t xml:space="preserve">the state of the articulators. </w:t>
+      </w:r>
+      <w:r>
+        <w:rPr>
+          <w:szCs w:val="22"/>
+        </w:rPr>
+        <w:t>Here we briefly discuss</w:t>
+      </w:r>
+      <w:r>
+        <w:rPr>
+          <w:szCs w:val="22"/>
+        </w:rPr>
+        <w:t xml:space="preserve"> two possibilities</w:t>
+      </w:r>
+      <w:r>
+        <w:rPr>
+          <w:szCs w:val="22"/>
+        </w:rPr>
+        <w:t xml:space="preserve"> </w:t>
+      </w:r>
+      <w:r>
+        <w:rPr>
+          <w:szCs w:val="22"/>
+        </w:rPr>
+        <w:t>that might require attention in future research</w:t>
+      </w:r>
+      <w:r>
+        <w:rPr>
+          <w:szCs w:val="22"/>
+        </w:rPr>
+        <w:t xml:space="preserve">. </w:t>
+      </w:r>
     </w:p>
     <w:p>
       <w:pPr>
@@ -22210,6 +22324,331 @@
           <w:szCs w:val="22"/>
         </w:rPr>
       </w:pPr>
+      <w:r>
+        <w:rPr>
+          <w:szCs w:val="22"/>
+        </w:rPr>
+        <w:t>First,</w:t>
+      </w:r>
+      <w:r>
+        <w:rPr>
+          <w:szCs w:val="22"/>
+        </w:rPr>
+        <w:t xml:space="preserve"> </w:t>
+      </w:r>
+      <w:r>
+        <w:rPr>
+          <w:szCs w:val="22"/>
+        </w:rPr>
+        <w:t>the black occluder box might distract participants from the primary task, which could</w:t>
+      </w:r>
+      <w:r>
+        <w:rPr>
+          <w:szCs w:val="22"/>
+        </w:rPr>
+        <w:t xml:space="preserve"> interrupt the cognitive process underlying compensation. </w:t>
+      </w:r>
+      <w:r>
+        <w:rPr>
+          <w:szCs w:val="22"/>
+        </w:rPr>
+        <w:t>While we cannot conclusively rule out this possibility, we consider it unlikely for a</w:t>
+      </w:r>
+      <w:r>
+        <w:rPr>
+          <w:szCs w:val="22"/>
+        </w:rPr>
+        <w:t xml:space="preserve"> number of </w:t>
+      </w:r>
+      <w:r>
+        <w:rPr>
+          <w:szCs w:val="22"/>
+        </w:rPr>
+        <w:t>reasons</w:t>
+      </w:r>
+      <w:r>
+        <w:rPr>
+          <w:szCs w:val="22"/>
+        </w:rPr>
+        <w:t xml:space="preserve">. </w:t>
+      </w:r>
+      <w:r>
+        <w:rPr>
+          <w:szCs w:val="22"/>
+        </w:rPr>
+        <w:t>Compared to Experiments 1a-c, l</w:t>
+      </w:r>
+      <w:r>
+        <w:rPr>
+          <w:szCs w:val="22"/>
+        </w:rPr>
+        <w:t xml:space="preserve">isteners in </w:t>
+      </w:r>
+      <w:r>
+        <w:rPr>
+          <w:szCs w:val="22"/>
+        </w:rPr>
+        <w:t>E</w:t>
+      </w:r>
+      <w:r>
+        <w:rPr>
+          <w:szCs w:val="22"/>
+        </w:rPr>
+        <w:t xml:space="preserve">xperiment 2 demonstrated </w:t>
+      </w:r>
+      <w:r>
+        <w:rPr>
+          <w:szCs w:val="22"/>
+        </w:rPr>
+        <w:t xml:space="preserve">about the same—in fact, </w:t>
+      </w:r>
+      <w:r>
+        <w:rPr>
+          <w:szCs w:val="22"/>
+        </w:rPr>
+        <w:t xml:space="preserve">numerically </w:t>
+      </w:r>
+      <w:r>
+        <w:rPr>
+          <w:szCs w:val="22"/>
+        </w:rPr>
+        <w:t>somewhat greater—</w:t>
+      </w:r>
+      <w:r>
+        <w:rPr>
+          <w:szCs w:val="22"/>
+        </w:rPr>
+        <w:lastRenderedPageBreak/>
+        <w:t xml:space="preserve">sensitivity to the acoustic continuum </w:t>
+      </w:r>
+      <w:r>
+        <w:rPr>
+          <w:szCs w:val="22"/>
+        </w:rPr>
+        <w:t xml:space="preserve">(see </w:t>
+      </w:r>
+      <w:r>
+        <w:rPr>
+          <w:szCs w:val="22"/>
+        </w:rPr>
+        <w:fldChar w:fldCharType="begin"/>
+      </w:r>
+      <w:r>
+        <w:rPr>
+          <w:szCs w:val="22"/>
+        </w:rPr>
+        <w:instrText xml:space="preserve"> REF _Ref136190811 \h </w:instrText>
+      </w:r>
+      <w:r>
+        <w:rPr>
+          <w:szCs w:val="22"/>
+        </w:rPr>
+      </w:r>
+      <w:r>
+        <w:rPr>
+          <w:szCs w:val="22"/>
+        </w:rPr>
+        <w:fldChar w:fldCharType="separate"/>
+      </w:r>
+      <w:r>
+        <w:rPr>
+          <w:szCs w:val="22"/>
+        </w:rPr>
+        <w:t xml:space="preserve">Figure </w:t>
+      </w:r>
+      <w:r>
+        <w:rPr>
+          <w:noProof/>
+          <w:szCs w:val="22"/>
+        </w:rPr>
+        <w:t>4</w:t>
+      </w:r>
+      <w:r>
+        <w:rPr>
+          <w:szCs w:val="22"/>
+        </w:rPr>
+        <w:fldChar w:fldCharType="end"/>
+      </w:r>
+      <w:r>
+        <w:rPr>
+          <w:szCs w:val="22"/>
+        </w:rPr>
+        <w:t>A)</w:t>
+      </w:r>
+      <w:r>
+        <w:rPr>
+          <w:szCs w:val="22"/>
+        </w:rPr>
+        <w:t>, speaking against a higher proportion of attentional lapses or random guesses. Along a similar vein, average reaction time</w:t>
+      </w:r>
+      <w:r>
+        <w:rPr>
+          <w:szCs w:val="22"/>
+        </w:rPr>
+        <w:t>s</w:t>
+      </w:r>
+      <w:r>
+        <w:rPr>
+          <w:szCs w:val="22"/>
+        </w:rPr>
+        <w:t xml:space="preserve"> w</w:t>
+      </w:r>
+      <w:r>
+        <w:rPr>
+          <w:szCs w:val="22"/>
+        </w:rPr>
+        <w:t>ere</w:t>
+      </w:r>
+      <w:r>
+        <w:rPr>
+          <w:szCs w:val="22"/>
+        </w:rPr>
+        <w:t xml:space="preserve"> not significantly higher in Experiment 2</w:t>
+      </w:r>
+      <w:r>
+        <w:rPr>
+          <w:szCs w:val="22"/>
+        </w:rPr>
+        <w:t xml:space="preserve"> (mean </w:t>
+      </w:r>
+      <w:r>
+        <w:rPr>
+          <w:szCs w:val="22"/>
+        </w:rPr>
+        <w:t xml:space="preserve">log-RT = </w:t>
+      </w:r>
+      <w:r>
+        <w:rPr>
+          <w:szCs w:val="22"/>
+        </w:rPr>
+        <w:t>3.4</w:t>
+      </w:r>
+      <w:r>
+        <w:rPr>
+          <w:szCs w:val="22"/>
+        </w:rPr>
+        <w:t>4</w:t>
+      </w:r>
+      <w:r>
+        <w:rPr>
+          <w:szCs w:val="22"/>
+        </w:rPr>
+        <w:t xml:space="preserve">, SD = </w:t>
+      </w:r>
+      <w:r>
+        <w:rPr>
+          <w:szCs w:val="22"/>
+        </w:rPr>
+        <w:t>0.1</w:t>
+      </w:r>
+      <w:r>
+        <w:rPr>
+          <w:szCs w:val="22"/>
+        </w:rPr>
+        <w:t>5</w:t>
+      </w:r>
+      <w:r>
+        <w:rPr>
+          <w:szCs w:val="22"/>
+        </w:rPr>
+        <w:t>), compared</w:t>
+      </w:r>
+      <w:r>
+        <w:rPr>
+          <w:szCs w:val="22"/>
+        </w:rPr>
+        <w:t xml:space="preserve"> to Experiments 1a-c </w:t>
+      </w:r>
+      <w:r>
+        <w:rPr>
+          <w:szCs w:val="22"/>
+        </w:rPr>
+        <w:t xml:space="preserve">(mean = </w:t>
+      </w:r>
+      <w:r>
+        <w:rPr>
+          <w:szCs w:val="22"/>
+        </w:rPr>
+        <w:t>3.4</w:t>
+      </w:r>
+      <w:r>
+        <w:rPr>
+          <w:szCs w:val="22"/>
+        </w:rPr>
+        <w:t>5</w:t>
+      </w:r>
+      <w:r>
+        <w:rPr>
+          <w:szCs w:val="22"/>
+        </w:rPr>
+        <w:t xml:space="preserve">, SD = </w:t>
+      </w:r>
+      <w:r>
+        <w:rPr>
+          <w:szCs w:val="22"/>
+        </w:rPr>
+        <w:t>0.1</w:t>
+      </w:r>
+      <w:r>
+        <w:rPr>
+          <w:szCs w:val="22"/>
+        </w:rPr>
+        <w:t>4</w:t>
+      </w:r>
+      <w:r>
+        <w:rPr>
+          <w:szCs w:val="22"/>
+        </w:rPr>
+        <w:t>)</w:t>
+      </w:r>
+      <w:r>
+        <w:rPr>
+          <w:szCs w:val="22"/>
+        </w:rPr>
+        <w:t>. Finally</w:t>
+      </w:r>
+      <w:r>
+        <w:rPr>
+          <w:szCs w:val="22"/>
+        </w:rPr>
+        <w:t xml:space="preserve">, while the black box </w:t>
+      </w:r>
+      <w:r>
+        <w:rPr>
+          <w:szCs w:val="22"/>
+        </w:rPr>
+        <w:t>might have been</w:t>
+      </w:r>
+      <w:r>
+        <w:rPr>
+          <w:szCs w:val="22"/>
+        </w:rPr>
+        <w:t xml:space="preserve"> initially surprising to listeners, it appeared very predictably at </w:t>
+      </w:r>
+      <w:r>
+        <w:rPr>
+          <w:szCs w:val="22"/>
+        </w:rPr>
+        <w:t xml:space="preserve">approximately </w:t>
+      </w:r>
+      <w:r>
+        <w:rPr>
+          <w:szCs w:val="22"/>
+        </w:rPr>
+        <w:t xml:space="preserve">the same point in each of the 72 </w:t>
+      </w:r>
+      <w:r>
+        <w:rPr>
+          <w:szCs w:val="22"/>
+        </w:rPr>
+        <w:t xml:space="preserve">video </w:t>
+      </w:r>
+      <w:r>
+        <w:rPr>
+          <w:szCs w:val="22"/>
+        </w:rPr>
+        <w:t xml:space="preserve">trials. Thus, any initial distraction would likely atrophy over the course of testing. Analyses reported in the SI confirm that no effects emerged or interacted with testing block. </w:t>
+      </w:r>
     </w:p>
     <w:p>
       <w:pPr>
@@ -22218,55 +22657,10 @@
         </w:rPr>
       </w:pPr>
       <w:r>
-        <w:t xml:space="preserve">At first blush, the results of Experiment 2 favor hypothesis </w:t>
-      </w:r>
-      <w:r>
-        <w:t>(</w:t>
-      </w:r>
-      <w:r>
-        <w:t>1b</w:t>
-      </w:r>
-      <w:r>
-        <w:t>) described in the introduction to Experiment 2:</w:t>
-      </w:r>
-      <w:r>
-        <w:t xml:space="preserve"> that listeners </w:t>
-      </w:r>
-      <w:r>
-        <w:rPr>
-          <w:szCs w:val="22"/>
-        </w:rPr>
-        <w:t xml:space="preserve">compensate based on the visually evident state of the articulators caused by the pen in the mouth rather than the presence of the pen itself. </w:t>
-      </w:r>
-      <w:r>
-        <w:rPr>
-          <w:szCs w:val="22"/>
-        </w:rPr>
-        <w:t xml:space="preserve">It is, however, possible that </w:t>
-      </w:r>
-      <w:r>
-        <w:rPr>
-          <w:szCs w:val="22"/>
-        </w:rPr>
-        <w:t xml:space="preserve">the addition of the black box </w:t>
-      </w:r>
-      <w:r>
-        <w:rPr>
-          <w:szCs w:val="22"/>
-        </w:rPr>
-        <w:t xml:space="preserve">had effects beyond </w:t>
-      </w:r>
-      <w:r>
-        <w:rPr>
-          <w:szCs w:val="22"/>
-        </w:rPr>
-        <w:t>remov</w:t>
-      </w:r>
-      <w:r>
-        <w:rPr>
-          <w:szCs w:val="22"/>
-        </w:rPr>
-        <w:t>ing</w:t>
+        <w:rPr>
+          <w:szCs w:val="22"/>
+        </w:rPr>
+        <w:t>A second alternative is that while the presence of the pen itself—rather than its impact on the articulators—may be sufficient to induce compensation, the black box made</w:t>
       </w:r>
       <w:r>
         <w:rPr>
@@ -22278,37 +22672,55 @@
         <w:rPr>
           <w:szCs w:val="22"/>
         </w:rPr>
-        <w:t xml:space="preserve">visual </w:t>
-      </w:r>
-      <w:r>
-        <w:rPr>
-          <w:szCs w:val="22"/>
-        </w:rPr>
-        <w:t xml:space="preserve">evidence </w:t>
-      </w:r>
-      <w:r>
-        <w:rPr>
-          <w:szCs w:val="22"/>
-        </w:rPr>
-        <w:t xml:space="preserve">about </w:t>
-      </w:r>
-      <w:r>
-        <w:rPr>
-          <w:szCs w:val="22"/>
-        </w:rPr>
-        <w:t xml:space="preserve">the state of the articulators. </w:t>
-      </w:r>
-      <w:r>
-        <w:rPr>
-          <w:szCs w:val="22"/>
-        </w:rPr>
-        <w:t>Here we briefly discuss</w:t>
-      </w:r>
-      <w:r>
-        <w:rPr>
-          <w:szCs w:val="22"/>
-        </w:rPr>
-        <w:t xml:space="preserve"> two possibilities</w:t>
+        <w:t>the location of the pen</w:t>
+      </w:r>
+      <w:r>
+        <w:rPr>
+          <w:szCs w:val="22"/>
+        </w:rPr>
+        <w:t xml:space="preserve"> less obvious and harder to visually access. </w:t>
+      </w:r>
+      <w:r>
+        <w:rPr>
+          <w:szCs w:val="22"/>
+        </w:rPr>
+        <w:t xml:space="preserve">The exit survey ameliorates this concern: the proportion of participants who mentioned the pen in the free-response post-experiment survey </w:t>
+      </w:r>
+      <w:r>
+        <w:rPr>
+          <w:szCs w:val="22"/>
+        </w:rPr>
+        <w:t>did not significantly decrease</w:t>
+      </w:r>
+      <w:r>
+        <w:rPr>
+          <w:szCs w:val="22"/>
+        </w:rPr>
+        <w:t xml:space="preserve"> in Experiment 2 (29.7%) compared to Experiment 1</w:t>
+      </w:r>
+      <w:r>
+        <w:rPr>
+          <w:szCs w:val="22"/>
+        </w:rPr>
+        <w:t>a-</w:t>
+      </w:r>
+      <w:r>
+        <w:rPr>
+          <w:szCs w:val="22"/>
+        </w:rPr>
+        <w:t xml:space="preserve">c (36.7%; for </w:t>
+      </w:r>
+      <w:r>
+        <w:rPr>
+          <w:szCs w:val="22"/>
+        </w:rPr>
+        <w:t>statistical tests and visualizations</w:t>
+      </w:r>
+      <w:r>
+        <w:rPr>
+          <w:szCs w:val="22"/>
+        </w:rPr>
+        <w:t>, see SI). Additionally, Experiment 2—which explicitly asked participants to press SPACE whenever the pen was in the talker’s mouth—also failed to find the compensation effects we obtained in Experiments 1a-c.</w:t>
       </w:r>
       <w:r>
         <w:rPr>
@@ -22320,7 +22732,31 @@
         <w:rPr>
           <w:szCs w:val="22"/>
         </w:rPr>
-        <w:t>that might require attention in future research</w:t>
+        <w:t xml:space="preserve">However, the dual-task nature of </w:t>
+      </w:r>
+      <w:r>
+        <w:rPr>
+          <w:szCs w:val="22"/>
+        </w:rPr>
+        <w:t>Experiment 2b</w:t>
+      </w:r>
+      <w:r>
+        <w:rPr>
+          <w:szCs w:val="22"/>
+        </w:rPr>
+        <w:t xml:space="preserve"> </w:t>
+      </w:r>
+      <w:r>
+        <w:rPr>
+          <w:szCs w:val="22"/>
+        </w:rPr>
+        <w:t>imposed additional and orthogonal attentional demands</w:t>
+      </w:r>
+      <w:r>
+        <w:rPr>
+          <w:szCs w:val="22"/>
+        </w:rPr>
+        <w:t xml:space="preserve"> (for details, we refer to the SI)</w:t>
       </w:r>
       <w:r>
         <w:rPr>
@@ -22339,50 +22775,61 @@
         <w:rPr>
           <w:szCs w:val="22"/>
         </w:rPr>
-        <w:t>First,</w:t>
-      </w:r>
-      <w:r>
-        <w:rPr>
-          <w:szCs w:val="22"/>
-        </w:rPr>
-        <w:t xml:space="preserve"> </w:t>
-      </w:r>
-      <w:r>
-        <w:rPr>
-          <w:szCs w:val="22"/>
-        </w:rPr>
-        <w:t>the black occluder box might distract participants from the primary task, which could</w:t>
-      </w:r>
-      <w:r>
-        <w:rPr>
-          <w:szCs w:val="22"/>
-        </w:rPr>
-        <w:t xml:space="preserve"> interrupt the cognitive process underlying compensation. </w:t>
-      </w:r>
-      <w:r>
-        <w:rPr>
-          <w:szCs w:val="22"/>
-        </w:rPr>
-        <w:t xml:space="preserve">While we cannot conclusively rule out </w:t>
-      </w:r>
-      <w:r>
-        <w:rPr>
-          <w:szCs w:val="22"/>
-        </w:rPr>
-        <w:lastRenderedPageBreak/>
-        <w:t>this possibility, we consider it unlikely for a</w:t>
-      </w:r>
-      <w:r>
-        <w:rPr>
-          <w:szCs w:val="22"/>
-        </w:rPr>
-        <w:t xml:space="preserve"> number of </w:t>
-      </w:r>
-      <w:r>
-        <w:rPr>
-          <w:szCs w:val="22"/>
-        </w:rPr>
-        <w:t>reasons</w:t>
+        <w:t xml:space="preserve">Future </w:t>
+      </w:r>
+      <w:r>
+        <w:rPr>
+          <w:szCs w:val="22"/>
+        </w:rPr>
+        <w:t xml:space="preserve">work could more </w:t>
+      </w:r>
+      <w:r>
+        <w:rPr>
+          <w:szCs w:val="22"/>
+        </w:rPr>
+        <w:t xml:space="preserve">conclusively assess the role of the pen </w:t>
+      </w:r>
+      <w:r>
+        <w:rPr>
+          <w:szCs w:val="22"/>
+        </w:rPr>
+        <w:t xml:space="preserve">versus its impact on the articulators by </w:t>
+      </w:r>
+      <w:r>
+        <w:rPr>
+          <w:szCs w:val="22"/>
+        </w:rPr>
+        <w:t xml:space="preserve">removing </w:t>
+      </w:r>
+      <w:r>
+        <w:rPr>
+          <w:szCs w:val="22"/>
+        </w:rPr>
+        <w:t>visual information more selectively</w:t>
+      </w:r>
+      <w:r>
+        <w:rPr>
+          <w:szCs w:val="22"/>
+        </w:rPr>
+        <w:t xml:space="preserve">. For example, videos could be presented of pen-impacted articulation, but with the pen itself removed in video post-processing. Conversely, </w:t>
+      </w:r>
+      <w:r>
+        <w:rPr>
+          <w:szCs w:val="22"/>
+        </w:rPr>
+        <w:t xml:space="preserve">video editing could be used to create an occluder that hides visual information about the articulators and face, while still showing </w:t>
+      </w:r>
+      <w:r>
+        <w:rPr>
+          <w:szCs w:val="22"/>
+        </w:rPr>
+        <w:t xml:space="preserve">the pen </w:t>
+      </w:r>
+      <w:r>
+        <w:rPr>
+          <w:szCs w:val="22"/>
+        </w:rPr>
+        <w:t>and hand of the talker</w:t>
       </w:r>
       <w:r>
         <w:rPr>
@@ -22394,377 +22841,35 @@
         <w:rPr>
           <w:szCs w:val="22"/>
         </w:rPr>
-        <w:t>Compared to Experiments 1a-c, l</w:t>
-      </w:r>
-      <w:r>
-        <w:rPr>
-          <w:szCs w:val="22"/>
-        </w:rPr>
-        <w:t xml:space="preserve">isteners in </w:t>
-      </w:r>
-      <w:r>
-        <w:rPr>
-          <w:szCs w:val="22"/>
-        </w:rPr>
-        <w:t>E</w:t>
-      </w:r>
-      <w:r>
-        <w:rPr>
-          <w:szCs w:val="22"/>
-        </w:rPr>
-        <w:t xml:space="preserve">xperiment 2 demonstrated </w:t>
-      </w:r>
-      <w:r>
-        <w:rPr>
-          <w:szCs w:val="22"/>
-        </w:rPr>
-        <w:t xml:space="preserve">about the same—in fact, </w:t>
-      </w:r>
-      <w:r>
-        <w:rPr>
-          <w:szCs w:val="22"/>
-        </w:rPr>
-        <w:t xml:space="preserve">numerically </w:t>
-      </w:r>
-      <w:r>
-        <w:rPr>
-          <w:szCs w:val="22"/>
-        </w:rPr>
-        <w:t>somewhat greater—</w:t>
-      </w:r>
-      <w:r>
-        <w:rPr>
-          <w:szCs w:val="22"/>
-        </w:rPr>
-        <w:t xml:space="preserve">sensitivity to the acoustic continuum </w:t>
-      </w:r>
-      <w:r>
-        <w:rPr>
-          <w:szCs w:val="22"/>
-        </w:rPr>
-        <w:t xml:space="preserve">(see </w:t>
-      </w:r>
-      <w:r>
-        <w:rPr>
-          <w:szCs w:val="22"/>
-        </w:rPr>
-        <w:fldChar w:fldCharType="begin"/>
-      </w:r>
-      <w:r>
-        <w:rPr>
-          <w:szCs w:val="22"/>
-        </w:rPr>
-        <w:instrText xml:space="preserve"> REF _Ref136190811 \h </w:instrText>
-      </w:r>
-      <w:r>
-        <w:rPr>
-          <w:szCs w:val="22"/>
-        </w:rPr>
-      </w:r>
-      <w:r>
-        <w:rPr>
-          <w:szCs w:val="22"/>
-        </w:rPr>
-        <w:fldChar w:fldCharType="separate"/>
-      </w:r>
-      <w:r>
-        <w:rPr>
-          <w:szCs w:val="22"/>
-        </w:rPr>
-        <w:t xml:space="preserve">Figure </w:t>
-      </w:r>
-      <w:r>
-        <w:rPr>
-          <w:noProof/>
-          <w:szCs w:val="22"/>
-        </w:rPr>
-        <w:t>4</w:t>
-      </w:r>
-      <w:r>
-        <w:rPr>
-          <w:szCs w:val="22"/>
-        </w:rPr>
-        <w:fldChar w:fldCharType="end"/>
-      </w:r>
-      <w:r>
-        <w:rPr>
-          <w:szCs w:val="22"/>
-        </w:rPr>
-        <w:t>A)</w:t>
-      </w:r>
-      <w:r>
-        <w:rPr>
-          <w:szCs w:val="22"/>
-        </w:rPr>
-        <w:t>, speaking against a higher proportion of attentional lapses or random guesses. Along a similar vein, average reaction time</w:t>
-      </w:r>
-      <w:r>
-        <w:rPr>
-          <w:szCs w:val="22"/>
-        </w:rPr>
-        <w:t>s</w:t>
-      </w:r>
-      <w:r>
-        <w:rPr>
-          <w:szCs w:val="22"/>
-        </w:rPr>
-        <w:t xml:space="preserve"> w</w:t>
-      </w:r>
-      <w:r>
-        <w:rPr>
-          <w:szCs w:val="22"/>
-        </w:rPr>
-        <w:t>ere</w:t>
-      </w:r>
-      <w:r>
-        <w:rPr>
-          <w:szCs w:val="22"/>
-        </w:rPr>
-        <w:t xml:space="preserve"> not significantly higher in Experiment 2</w:t>
-      </w:r>
-      <w:r>
-        <w:rPr>
-          <w:szCs w:val="22"/>
-        </w:rPr>
-        <w:t xml:space="preserve"> (mean </w:t>
-      </w:r>
-      <w:r>
-        <w:rPr>
-          <w:szCs w:val="22"/>
-        </w:rPr>
-        <w:t xml:space="preserve">log-RT = </w:t>
-      </w:r>
-      <w:r>
-        <w:rPr>
-          <w:szCs w:val="22"/>
-        </w:rPr>
-        <w:t>3.4</w:t>
-      </w:r>
-      <w:r>
-        <w:rPr>
-          <w:szCs w:val="22"/>
-        </w:rPr>
-        <w:t>4</w:t>
-      </w:r>
-      <w:r>
-        <w:rPr>
-          <w:szCs w:val="22"/>
-        </w:rPr>
-        <w:t xml:space="preserve">, SD = </w:t>
-      </w:r>
-      <w:r>
-        <w:rPr>
-          <w:szCs w:val="22"/>
-        </w:rPr>
-        <w:t>0.1</w:t>
-      </w:r>
-      <w:r>
-        <w:rPr>
-          <w:szCs w:val="22"/>
-        </w:rPr>
-        <w:t>5</w:t>
-      </w:r>
-      <w:r>
-        <w:rPr>
-          <w:szCs w:val="22"/>
-        </w:rPr>
-        <w:t>), compared</w:t>
-      </w:r>
-      <w:r>
-        <w:rPr>
-          <w:szCs w:val="22"/>
-        </w:rPr>
-        <w:t xml:space="preserve"> to Experiments 1a-c (mean = </w:t>
-      </w:r>
-      <w:r>
-        <w:rPr>
-          <w:szCs w:val="22"/>
-        </w:rPr>
-        <w:t>3</w:t>
-      </w:r>
-      <w:r>
-        <w:rPr>
-          <w:szCs w:val="22"/>
-          <w:highlight w:val="yellow"/>
-        </w:rPr>
-        <w:t>.44</w:t>
-      </w:r>
-      <w:r>
-        <w:rPr>
-          <w:szCs w:val="22"/>
-          <w:highlight w:val="yellow"/>
-        </w:rPr>
-        <w:t xml:space="preserve">, SD = </w:t>
-      </w:r>
-      <w:r>
-        <w:rPr>
-          <w:szCs w:val="22"/>
-          <w:highlight w:val="yellow"/>
-        </w:rPr>
-        <w:t>0.15</w:t>
-      </w:r>
-      <w:r>
-        <w:rPr>
-          <w:szCs w:val="22"/>
-        </w:rPr>
-        <w:t>)</w:t>
-      </w:r>
-      <w:r>
-        <w:rPr>
-          <w:szCs w:val="22"/>
-        </w:rPr>
-        <w:t xml:space="preserve">. Finally, while the black box </w:t>
-      </w:r>
-      <w:r>
-        <w:rPr>
-          <w:szCs w:val="22"/>
-        </w:rPr>
-        <w:t>might have been</w:t>
-      </w:r>
-      <w:r>
-        <w:rPr>
-          <w:szCs w:val="22"/>
-        </w:rPr>
-        <w:t xml:space="preserve"> initially surprising to listeners, it appeared very predictably at </w:t>
-      </w:r>
-      <w:r>
-        <w:rPr>
-          <w:szCs w:val="22"/>
-        </w:rPr>
-        <w:t xml:space="preserve">approximately </w:t>
-      </w:r>
-      <w:r>
-        <w:rPr>
-          <w:szCs w:val="22"/>
-        </w:rPr>
-        <w:t xml:space="preserve">the same point in each of the 72 </w:t>
-      </w:r>
-      <w:r>
-        <w:rPr>
-          <w:szCs w:val="22"/>
-        </w:rPr>
-        <w:t xml:space="preserve">video </w:t>
-      </w:r>
-      <w:r>
-        <w:rPr>
-          <w:szCs w:val="22"/>
-        </w:rPr>
-        <w:t xml:space="preserve">trials. Thus, any initial distraction would likely atrophy over the course of testing. Analyses reported in the SI confirm that no effects emerged or interacted with testing block. </w:t>
+        <w:t>Either of these manipulations would require substantial</w:t>
+      </w:r>
+      <w:r>
+        <w:rPr>
+          <w:szCs w:val="22"/>
+        </w:rPr>
+        <w:t>ly</w:t>
+      </w:r>
+      <w:r>
+        <w:rPr>
+          <w:szCs w:val="22"/>
+        </w:rPr>
+        <w:t xml:space="preserve"> more advanced video-editing than used in Experiment 2. </w:t>
       </w:r>
     </w:p>
     <w:p>
       <w:pPr>
-        <w:rPr>
-          <w:szCs w:val="22"/>
-        </w:rPr>
-      </w:pPr>
-      <w:r>
-        <w:rPr>
-          <w:szCs w:val="22"/>
-        </w:rPr>
-        <w:t>A second alternative is that while the presence of the pen itself—rather than its impact on the articulators—may be sufficient to induce compensation, the black box made</w:t>
-      </w:r>
-      <w:r>
-        <w:rPr>
-          <w:szCs w:val="22"/>
-        </w:rPr>
-        <w:t xml:space="preserve"> </w:t>
-      </w:r>
-      <w:r>
-        <w:rPr>
-          <w:szCs w:val="22"/>
-        </w:rPr>
-        <w:t>the location of the pen</w:t>
-      </w:r>
-      <w:r>
-        <w:rPr>
-          <w:szCs w:val="22"/>
-        </w:rPr>
-        <w:t xml:space="preserve"> less obvious and harder to visually access. </w:t>
-      </w:r>
-      <w:r>
-        <w:rPr>
-          <w:szCs w:val="22"/>
-        </w:rPr>
-        <w:t xml:space="preserve">The exit survey ameliorates this concern: the proportion of participants who mentioned the pen in the free-response post-experiment survey </w:t>
-      </w:r>
-      <w:r>
-        <w:rPr>
-          <w:szCs w:val="22"/>
-        </w:rPr>
-        <w:t>did not significantly decrease</w:t>
-      </w:r>
-      <w:r>
-        <w:rPr>
-          <w:szCs w:val="22"/>
-        </w:rPr>
-        <w:t xml:space="preserve"> in Experiment 2 (29.7%) compared to Experiment 1</w:t>
-      </w:r>
-      <w:r>
-        <w:rPr>
-          <w:szCs w:val="22"/>
-        </w:rPr>
-        <w:t>a-</w:t>
-      </w:r>
-      <w:r>
-        <w:rPr>
-          <w:szCs w:val="22"/>
-        </w:rPr>
-        <w:t xml:space="preserve">c (36.7%; for </w:t>
-      </w:r>
-      <w:r>
-        <w:rPr>
-          <w:szCs w:val="22"/>
-        </w:rPr>
-        <w:t>statistical tests and visualizations</w:t>
-      </w:r>
-      <w:r>
-        <w:rPr>
-          <w:szCs w:val="22"/>
-        </w:rPr>
-        <w:t>, see SI). Additionally, Experiment 2—which explicitly asked participants to press SPACE whenever the pen was in the talker’s mouth—also failed to find the compensation effects we obtained in Experiments 1a-c.</w:t>
-      </w:r>
-      <w:r>
-        <w:rPr>
-          <w:szCs w:val="22"/>
-        </w:rPr>
-        <w:t xml:space="preserve"> </w:t>
-      </w:r>
-      <w:r>
-        <w:rPr>
-          <w:szCs w:val="22"/>
-        </w:rPr>
-        <w:t xml:space="preserve">However, the dual-task nature of </w:t>
-      </w:r>
-      <w:r>
-        <w:rPr>
-          <w:szCs w:val="22"/>
-        </w:rPr>
-        <w:t>Experiment 2b</w:t>
-      </w:r>
-      <w:r>
-        <w:rPr>
-          <w:szCs w:val="22"/>
-        </w:rPr>
-        <w:t xml:space="preserve"> </w:t>
-      </w:r>
-      <w:r>
-        <w:rPr>
-          <w:szCs w:val="22"/>
-        </w:rPr>
-        <w:t>imposed additional and orthogonal attentional demands</w:t>
-      </w:r>
-      <w:r>
-        <w:rPr>
-          <w:szCs w:val="22"/>
-        </w:rPr>
-        <w:t xml:space="preserve"> (for details, we refer to the SI)</w:t>
-      </w:r>
-      <w:r>
-        <w:rPr>
-          <w:szCs w:val="22"/>
-        </w:rPr>
-        <w:t xml:space="preserve">. </w:t>
+        <w:pStyle w:val="Heading1"/>
+        <w:rPr>
+          <w:szCs w:val="22"/>
+        </w:rPr>
+      </w:pPr>
+      <w:r>
+        <w:rPr>
+          <w:sz w:val="22"/>
+          <w:szCs w:val="22"/>
+        </w:rPr>
+        <w:lastRenderedPageBreak/>
+        <w:t>General Discussion</w:t>
       </w:r>
     </w:p>
     <w:p>
@@ -22777,107 +22882,246 @@
         <w:rPr>
           <w:szCs w:val="22"/>
         </w:rPr>
-        <w:t xml:space="preserve">Future </w:t>
-      </w:r>
-      <w:r>
-        <w:rPr>
-          <w:szCs w:val="22"/>
-        </w:rPr>
-        <w:t xml:space="preserve">work could more </w:t>
-      </w:r>
-      <w:r>
-        <w:rPr>
-          <w:szCs w:val="22"/>
-        </w:rPr>
-        <w:t xml:space="preserve">conclusively assess the role of the pen </w:t>
-      </w:r>
-      <w:r>
-        <w:rPr>
-          <w:szCs w:val="22"/>
-        </w:rPr>
-        <w:t xml:space="preserve">versus its impact on the articulators by </w:t>
-      </w:r>
-      <w:r>
-        <w:rPr>
-          <w:szCs w:val="22"/>
-        </w:rPr>
-        <w:t xml:space="preserve">removing </w:t>
-      </w:r>
-      <w:r>
-        <w:rPr>
-          <w:szCs w:val="22"/>
-        </w:rPr>
-        <w:t>visual information more selectively</w:t>
-      </w:r>
-      <w:r>
-        <w:rPr>
-          <w:szCs w:val="22"/>
-        </w:rPr>
-        <w:t xml:space="preserve">. For example, videos could be presented of pen-impacted articulation, but with the pen itself removed in video post-processing. Conversely, </w:t>
-      </w:r>
-      <w:r>
-        <w:rPr>
-          <w:szCs w:val="22"/>
-        </w:rPr>
-        <w:t xml:space="preserve">video editing could be used to create an occluder that hides visual information about the articulators and face, while still showing </w:t>
-      </w:r>
-      <w:r>
-        <w:rPr>
-          <w:szCs w:val="22"/>
-        </w:rPr>
-        <w:t xml:space="preserve">the pen </w:t>
-      </w:r>
-      <w:r>
-        <w:rPr>
-          <w:szCs w:val="22"/>
-        </w:rPr>
-        <w:t>and hand of the talker</w:t>
-      </w:r>
-      <w:r>
-        <w:rPr>
-          <w:szCs w:val="22"/>
-        </w:rPr>
-        <w:t xml:space="preserve">. </w:t>
-      </w:r>
-      <w:r>
-        <w:rPr>
-          <w:szCs w:val="22"/>
-        </w:rPr>
-        <w:t>Either of these manipulations would require substantial</w:t>
-      </w:r>
-      <w:r>
-        <w:rPr>
-          <w:szCs w:val="22"/>
-        </w:rPr>
-        <w:t>ly</w:t>
-      </w:r>
-      <w:r>
-        <w:rPr>
-          <w:szCs w:val="22"/>
-        </w:rPr>
-        <w:t xml:space="preserve"> more advanced video-editing than used in Experiment </w:t>
-      </w:r>
-      <w:r>
-        <w:rPr>
-          <w:szCs w:val="22"/>
-        </w:rPr>
-        <w:lastRenderedPageBreak/>
-        <w:t xml:space="preserve">2. </w:t>
+        <w:t xml:space="preserve">Taken together the </w:t>
+      </w:r>
+      <w:r>
+        <w:rPr>
+          <w:szCs w:val="22"/>
+        </w:rPr>
+        <w:t xml:space="preserve">results </w:t>
+      </w:r>
+      <w:r>
+        <w:rPr>
+          <w:szCs w:val="22"/>
+        </w:rPr>
+        <w:t xml:space="preserve">of </w:t>
+      </w:r>
+      <w:r>
+        <w:rPr>
+          <w:szCs w:val="22"/>
+        </w:rPr>
+        <w:t xml:space="preserve">Experiments 1a-c </w:t>
+      </w:r>
+      <w:r>
+        <w:rPr>
+          <w:szCs w:val="22"/>
+        </w:rPr>
+        <w:t xml:space="preserve">and 2, suggest that listeners </w:t>
+      </w:r>
+      <w:r>
+        <w:rPr>
+          <w:szCs w:val="22"/>
+        </w:rPr>
+        <w:t>compensat</w:t>
+      </w:r>
+      <w:r>
+        <w:rPr>
+          <w:szCs w:val="22"/>
+        </w:rPr>
+        <w:t>e</w:t>
+      </w:r>
+      <w:r>
+        <w:rPr>
+          <w:szCs w:val="22"/>
+        </w:rPr>
+        <w:t xml:space="preserve"> for visually evident effects of the pen on the </w:t>
+      </w:r>
+      <w:r>
+        <w:rPr>
+          <w:szCs w:val="22"/>
+        </w:rPr>
+        <w:t xml:space="preserve">configuration of articulators that are relevant to the </w:t>
+      </w:r>
+      <w:r>
+        <w:rPr>
+          <w:szCs w:val="22"/>
+        </w:rPr>
+        <w:t>/s/-/ʃ/</w:t>
+      </w:r>
+      <w:r>
+        <w:rPr>
+          <w:szCs w:val="22"/>
+        </w:rPr>
+        <w:t xml:space="preserve"> contrast. This suggests that </w:t>
+      </w:r>
+      <w:r>
+        <w:rPr>
+          <w:szCs w:val="22"/>
+        </w:rPr>
+        <w:t xml:space="preserve">speech perception </w:t>
+      </w:r>
+      <w:r>
+        <w:rPr>
+          <w:szCs w:val="22"/>
+        </w:rPr>
+        <w:t xml:space="preserve">can normalize or ‘explain away’ </w:t>
+      </w:r>
+      <w:r>
+        <w:rPr>
+          <w:szCs w:val="22"/>
+        </w:rPr>
+        <w:t xml:space="preserve">at least </w:t>
+      </w:r>
+      <w:r>
+        <w:rPr>
+          <w:szCs w:val="22"/>
+        </w:rPr>
+        <w:t xml:space="preserve">some effects of the pen </w:t>
+      </w:r>
+      <w:r>
+        <w:rPr>
+          <w:szCs w:val="22"/>
+        </w:rPr>
+        <w:t xml:space="preserve">on articulation, </w:t>
+      </w:r>
+      <w:r>
+        <w:rPr>
+          <w:szCs w:val="22"/>
+        </w:rPr>
+        <w:t>if they are sufficiently visually evident.</w:t>
+      </w:r>
+      <w:r>
+        <w:rPr>
+          <w:szCs w:val="22"/>
+        </w:rPr>
+        <w:t xml:space="preserve"> To the best of our knowledge, this is the first demonstration that </w:t>
+      </w:r>
+      <w:r>
+        <w:rPr>
+          <w:szCs w:val="22"/>
+        </w:rPr>
+        <w:t>non-</w:t>
+      </w:r>
+      <w:r>
+        <w:rPr>
+          <w:szCs w:val="22"/>
+        </w:rPr>
+        <w:t>phon</w:t>
+      </w:r>
+      <w:r>
+        <w:rPr>
+          <w:szCs w:val="22"/>
+        </w:rPr>
+        <w:t>etic</w:t>
+      </w:r>
+      <w:r>
+        <w:rPr>
+          <w:szCs w:val="22"/>
+        </w:rPr>
+        <w:t>, visually evident</w:t>
+      </w:r>
+      <w:r>
+        <w:rPr>
+          <w:szCs w:val="22"/>
+        </w:rPr>
+        <w:t xml:space="preserve"> </w:t>
+      </w:r>
+      <w:r>
+        <w:rPr>
+          <w:szCs w:val="22"/>
+        </w:rPr>
+        <w:t>effects on</w:t>
+      </w:r>
+      <w:r>
+        <w:rPr>
+          <w:szCs w:val="22"/>
+        </w:rPr>
+        <w:t xml:space="preserve"> articulators—the pen’s effect on lip shape—affect listeners’ perception in ways consistent with compensation accounts. </w:t>
+      </w:r>
+      <w:r>
+        <w:rPr>
+          <w:szCs w:val="22"/>
+        </w:rPr>
+        <w:t xml:space="preserve">This provides novel support for Fowler’s conjecture (Fowler, 2006): it indeed does not appear to matter </w:t>
+      </w:r>
+      <w:r>
+        <w:rPr>
+          <w:szCs w:val="22"/>
+        </w:rPr>
+        <w:t>why</w:t>
+      </w:r>
+      <w:r>
+        <w:rPr>
+          <w:szCs w:val="22"/>
+        </w:rPr>
+        <w:t xml:space="preserve"> </w:t>
+      </w:r>
+      <w:r>
+        <w:rPr>
+          <w:i/>
+          <w:iCs/>
+          <w:szCs w:val="22"/>
+        </w:rPr>
+        <w:t>exactly</w:t>
+      </w:r>
+      <w:r>
+        <w:rPr>
+          <w:szCs w:val="22"/>
+        </w:rPr>
+        <w:t xml:space="preserve"> a talker’s lips exhibit a certain shape, as long as (1) they do, and (2) plausibly do so for </w:t>
+      </w:r>
+      <w:r>
+        <w:rPr>
+          <w:szCs w:val="22"/>
+        </w:rPr>
+        <w:t xml:space="preserve">some </w:t>
+      </w:r>
+      <w:r>
+        <w:rPr>
+          <w:szCs w:val="22"/>
+        </w:rPr>
+        <w:t xml:space="preserve">reason other than the articulation of the current segment (here, the pen in the mouth). </w:t>
       </w:r>
     </w:p>
     <w:p>
       <w:pPr>
-        <w:pStyle w:val="Heading1"/>
-        <w:rPr>
-          <w:szCs w:val="22"/>
-        </w:rPr>
-      </w:pPr>
-      <w:r>
-        <w:rPr>
-          <w:sz w:val="22"/>
-          <w:szCs w:val="22"/>
-        </w:rPr>
-        <w:t>General Discussion</w:t>
+        <w:rPr>
+          <w:szCs w:val="22"/>
+          <w:highlight w:val="yellow"/>
+        </w:rPr>
+      </w:pPr>
+      <w:r>
+        <w:rPr>
+          <w:szCs w:val="22"/>
+        </w:rPr>
+        <w:t>The results of Experiment 2—the absence of compensation in the absence of direct visual evidence that lip shape was indeed affected by the pen—</w:t>
+      </w:r>
+      <w:r>
+        <w:rPr>
+          <w:szCs w:val="22"/>
+        </w:rPr>
+        <w:t>replicates for non-phonetic context, what has previously been demonstrated for phonetic context: compensation for visually presented context seems to be substantially reduced or no longer observed when the relevant articulatory effects are no</w:t>
+      </w:r>
+      <w:r>
+        <w:rPr>
+          <w:szCs w:val="22"/>
+        </w:rPr>
+        <w:t xml:space="preserve">t </w:t>
+      </w:r>
+      <w:r>
+        <w:rPr>
+          <w:szCs w:val="22"/>
+        </w:rPr>
+        <w:t>visually evident during the articulation of the target sound</w:t>
+      </w:r>
+      <w:r>
+        <w:rPr>
+          <w:szCs w:val="22"/>
+        </w:rPr>
+        <w:t xml:space="preserve"> (Holt et al., 2005</w:t>
+      </w:r>
+      <w:r>
+        <w:rPr>
+          <w:szCs w:val="22"/>
+        </w:rPr>
+        <w:t>; Viswanathan &amp; Stephens, 2016).</w:t>
+      </w:r>
+      <w:r>
+        <w:rPr>
+          <w:szCs w:val="22"/>
+          <w:highlight w:val="yellow"/>
+        </w:rPr>
+        <w:t xml:space="preserve"> </w:t>
       </w:r>
     </w:p>
     <w:p>
@@ -22890,133 +23134,19 @@
         <w:rPr>
           <w:szCs w:val="22"/>
         </w:rPr>
-        <w:t xml:space="preserve">Taken together the </w:t>
-      </w:r>
-      <w:r>
-        <w:rPr>
-          <w:szCs w:val="22"/>
-        </w:rPr>
-        <w:t xml:space="preserve">results </w:t>
-      </w:r>
-      <w:r>
-        <w:rPr>
-          <w:szCs w:val="22"/>
-        </w:rPr>
-        <w:t xml:space="preserve">of </w:t>
-      </w:r>
-      <w:r>
-        <w:rPr>
-          <w:szCs w:val="22"/>
-        </w:rPr>
-        <w:t xml:space="preserve">Experiments 1a-c </w:t>
-      </w:r>
-      <w:r>
-        <w:rPr>
-          <w:szCs w:val="22"/>
-        </w:rPr>
-        <w:t xml:space="preserve">and 2, suggest that listeners </w:t>
-      </w:r>
-      <w:r>
-        <w:rPr>
-          <w:szCs w:val="22"/>
-        </w:rPr>
-        <w:t>compensat</w:t>
-      </w:r>
-      <w:r>
-        <w:rPr>
-          <w:szCs w:val="22"/>
-        </w:rPr>
-        <w:t>e</w:t>
-      </w:r>
-      <w:r>
-        <w:rPr>
-          <w:szCs w:val="22"/>
-        </w:rPr>
-        <w:t xml:space="preserve"> for visually evident effects of the pen on the </w:t>
-      </w:r>
-      <w:r>
-        <w:rPr>
-          <w:szCs w:val="22"/>
-        </w:rPr>
-        <w:t xml:space="preserve">configuration of articulators that are relevant to the </w:t>
-      </w:r>
-      <w:r>
-        <w:rPr>
-          <w:szCs w:val="22"/>
-        </w:rPr>
-        <w:t>/s/-/ʃ/</w:t>
-      </w:r>
-      <w:r>
-        <w:rPr>
-          <w:szCs w:val="22"/>
-        </w:rPr>
-        <w:t xml:space="preserve"> contrast. This suggests that </w:t>
-      </w:r>
-      <w:r>
-        <w:rPr>
-          <w:szCs w:val="22"/>
-        </w:rPr>
-        <w:t xml:space="preserve">speech perception </w:t>
-      </w:r>
-      <w:r>
-        <w:rPr>
-          <w:szCs w:val="22"/>
-        </w:rPr>
-        <w:t xml:space="preserve">can normalize or ‘explain away’ </w:t>
-      </w:r>
-      <w:r>
-        <w:rPr>
-          <w:szCs w:val="22"/>
-        </w:rPr>
-        <w:t xml:space="preserve">at least </w:t>
-      </w:r>
-      <w:r>
-        <w:rPr>
-          <w:szCs w:val="22"/>
-        </w:rPr>
-        <w:t xml:space="preserve">some effects of the pen </w:t>
-      </w:r>
-      <w:r>
-        <w:rPr>
-          <w:szCs w:val="22"/>
-        </w:rPr>
-        <w:t xml:space="preserve">on articulation, </w:t>
-      </w:r>
-      <w:r>
-        <w:rPr>
-          <w:szCs w:val="22"/>
-        </w:rPr>
-        <w:t>if they are sufficiently visually evident.</w:t>
-      </w:r>
-      <w:r>
-        <w:rPr>
-          <w:szCs w:val="22"/>
-        </w:rPr>
-        <w:t xml:space="preserve"> To the best of our knowledge, this is the first demonstration that </w:t>
-      </w:r>
-      <w:r>
-        <w:rPr>
-          <w:szCs w:val="22"/>
-        </w:rPr>
-        <w:t>non-</w:t>
-      </w:r>
-      <w:r>
-        <w:rPr>
-          <w:szCs w:val="22"/>
-        </w:rPr>
-        <w:t>phon</w:t>
-      </w:r>
-      <w:r>
-        <w:rPr>
-          <w:szCs w:val="22"/>
-        </w:rPr>
-        <w:t>etic</w:t>
-      </w:r>
-      <w:r>
-        <w:rPr>
-          <w:szCs w:val="22"/>
-        </w:rPr>
-        <w:t>, visually evident</w:t>
+        <w:t>The present results also raise a number of questions for future research on compensation and adaptive speech perception more broadly. We briefly discuss t</w:t>
+      </w:r>
+      <w:r>
+        <w:rPr>
+          <w:szCs w:val="22"/>
+        </w:rPr>
+        <w:t>wo</w:t>
+      </w:r>
+      <w:r>
+        <w:rPr>
+          <w:szCs w:val="22"/>
+        </w:rPr>
+        <w:t>. First, our findings leave open whether compensation for visually evident effects of non-phonological causes—like the pen—draws on the same neural mechanisms as normalization/compensation for the effects of phonetic contexts. The present findings only suggest that Fowler’s compensation account provides a unifying explanation for the qualitative consequences of both phenomena. It is unclear, for example, whether compensation for visually</w:t>
       </w:r>
       <w:r>
         <w:rPr>
@@ -23028,108 +23158,707 @@
         <w:rPr>
           <w:szCs w:val="22"/>
         </w:rPr>
-        <w:t>effects on</w:t>
-      </w:r>
-      <w:r>
-        <w:rPr>
-          <w:szCs w:val="22"/>
-        </w:rPr>
-        <w:t xml:space="preserve"> articulators—the pen’s effect on lip shape—affect listeners’ perception in ways consistent with compensation accounts. </w:t>
-      </w:r>
-      <w:r>
-        <w:rPr>
-          <w:szCs w:val="22"/>
-        </w:rPr>
-        <w:t xml:space="preserve">This provides novel support for Fowler’s conjecture (Fowler, 2006): it indeed does not appear to matter </w:t>
-      </w:r>
-      <w:r>
-        <w:rPr>
-          <w:szCs w:val="22"/>
-        </w:rPr>
-        <w:t>why</w:t>
-      </w:r>
-      <w:r>
-        <w:rPr>
-          <w:szCs w:val="22"/>
-        </w:rPr>
-        <w:t xml:space="preserve"> </w:t>
-      </w:r>
+        <w:t>presented non-phonetic context take</w:t>
+      </w:r>
+      <w:r>
+        <w:rPr>
+          <w:szCs w:val="22"/>
+        </w:rPr>
+        <w:t>s</w:t>
+      </w:r>
+      <w:r>
+        <w:rPr>
+          <w:szCs w:val="22"/>
+        </w:rPr>
+        <w:t xml:space="preserve"> place in the same brain areas that are responsible for audiovisual integration during speech perception, and whether those areas also process compensation for preceding phonetic context. Alternatively, compensation </w:t>
+      </w:r>
+      <w:r>
+        <w:rPr>
+          <w:szCs w:val="22"/>
+        </w:rPr>
+        <w:lastRenderedPageBreak/>
+        <w:t>might take place at multiple points in the processing of speech input.</w:t>
+      </w:r>
+    </w:p>
+    <w:p>
+      <w:pPr>
+        <w:rPr>
+          <w:szCs w:val="22"/>
+        </w:rPr>
+      </w:pPr>
+      <w:r>
+        <w:rPr>
+          <w:szCs w:val="22"/>
+        </w:rPr>
+        <w:t>Second and f</w:t>
+      </w:r>
+      <w:r>
+        <w:rPr>
+          <w:szCs w:val="22"/>
+        </w:rPr>
+        <w:t xml:space="preserve">inally, the </w:t>
+      </w:r>
+      <w:r>
+        <w:rPr>
+          <w:szCs w:val="22"/>
+        </w:rPr>
+        <w:t xml:space="preserve">present </w:t>
+      </w:r>
+      <w:r>
+        <w:rPr>
+          <w:szCs w:val="22"/>
+        </w:rPr>
+        <w:t xml:space="preserve">results raise questions for future research on perceptual recalibration. </w:t>
+      </w:r>
+      <w:r>
+        <w:rPr>
+          <w:szCs w:val="22"/>
+        </w:rPr>
+        <w:t xml:space="preserve">As mentioned in the introduction, previous </w:t>
+      </w:r>
+      <w:r>
+        <w:rPr>
+          <w:szCs w:val="22"/>
+        </w:rPr>
+        <w:t>work has found that perceptual recalibration to an unfamiliar talker’s speech can be blocked when the unexpected pronunciations occur while the talker has a pen in the mouth. In perceptual recalibration experiments, listeners are exp</w:t>
+      </w:r>
+      <w:r>
+        <w:rPr>
+          <w:szCs w:val="22"/>
+        </w:rPr>
+        <w:t>osed</w:t>
+      </w:r>
+      <w:r>
+        <w:rPr>
+          <w:szCs w:val="22"/>
+        </w:rPr>
+        <w:t xml:space="preserve"> to speech from an unfamiliar talker for which the realization of a particular sound is shifted towards a neighboring category. For example, Kraljic &amp; Samuel (2006) exposed listeners to either typical </w:t>
+      </w:r>
+      <w:r>
+        <w:rPr>
+          <w:szCs w:val="22"/>
+        </w:rPr>
+        <w:t>/ʃ/</w:t>
+      </w:r>
+      <w:r>
+        <w:rPr>
+          <w:szCs w:val="22"/>
+        </w:rPr>
+        <w:t xml:space="preserve"> sounds and s</w:t>
+      </w:r>
+      <w:r>
+        <w:rPr>
+          <w:szCs w:val="22"/>
+        </w:rPr>
+        <w:t>ounds ambiguous between /s/ and /ʃ/ but in lexical contexts favoring /s/ interpretation</w:t>
+      </w:r>
+      <w:r>
+        <w:rPr>
+          <w:szCs w:val="22"/>
+        </w:rPr>
+        <w:t xml:space="preserve"> (e.g., </w:t>
+      </w:r>
+      <w:proofErr w:type="spellStart"/>
       <w:r>
         <w:rPr>
           <w:i/>
           <w:iCs/>
           <w:szCs w:val="22"/>
         </w:rPr>
-        <w:t>exactly</w:t>
-      </w:r>
-      <w:r>
-        <w:rPr>
-          <w:szCs w:val="22"/>
-        </w:rPr>
-        <w:t xml:space="preserve"> a talker’s lips exhibit a certain shape, as long as (1) they do, and (2) plausibly do so for </w:t>
-      </w:r>
-      <w:r>
-        <w:rPr>
-          <w:szCs w:val="22"/>
-        </w:rPr>
-        <w:t xml:space="preserve">some </w:t>
-      </w:r>
-      <w:r>
-        <w:rPr>
-          <w:szCs w:val="22"/>
-        </w:rPr>
-        <w:t xml:space="preserve">reason other than the articulation of the current segment (here, the pen in the mouth). </w:t>
+        <w:t>dinoshaur</w:t>
+      </w:r>
+      <w:proofErr w:type="spellEnd"/>
+      <w:r>
+        <w:rPr>
+          <w:szCs w:val="22"/>
+        </w:rPr>
+        <w:t xml:space="preserve">, </w:t>
+      </w:r>
+      <w:r>
+        <w:rPr>
+          <w:szCs w:val="22"/>
+        </w:rPr>
+        <w:t>/s/</w:t>
+      </w:r>
+      <w:r>
+        <w:rPr>
+          <w:szCs w:val="22"/>
+        </w:rPr>
+        <w:t>-biased exposure</w:t>
+      </w:r>
+      <w:r>
+        <w:rPr>
+          <w:szCs w:val="22"/>
+        </w:rPr>
+        <w:t xml:space="preserve">) or to typical </w:t>
+      </w:r>
+      <w:r>
+        <w:rPr>
+          <w:szCs w:val="22"/>
+        </w:rPr>
+        <w:t>/s/</w:t>
+      </w:r>
+      <w:r>
+        <w:rPr>
+          <w:szCs w:val="22"/>
+        </w:rPr>
+        <w:t xml:space="preserve"> sounds and </w:t>
+      </w:r>
+      <w:r>
+        <w:rPr>
+          <w:szCs w:val="22"/>
+        </w:rPr>
+        <w:t>ambiguous sounds rather in /ʃ/-favoring contexts</w:t>
+      </w:r>
+      <w:r>
+        <w:rPr>
+          <w:szCs w:val="22"/>
+        </w:rPr>
+        <w:t xml:space="preserve"> (e.g., </w:t>
+      </w:r>
+      <w:proofErr w:type="spellStart"/>
+      <w:r>
+        <w:rPr>
+          <w:i/>
+          <w:iCs/>
+          <w:szCs w:val="22"/>
+        </w:rPr>
+        <w:t>ma</w:t>
+      </w:r>
+      <w:r>
+        <w:rPr>
+          <w:i/>
+          <w:iCs/>
+          <w:szCs w:val="22"/>
+        </w:rPr>
+        <w:t>s</w:t>
+      </w:r>
+      <w:r>
+        <w:rPr>
+          <w:i/>
+          <w:iCs/>
+          <w:szCs w:val="22"/>
+        </w:rPr>
+        <w:t>inery</w:t>
+      </w:r>
+      <w:proofErr w:type="spellEnd"/>
+      <w:r>
+        <w:rPr>
+          <w:szCs w:val="22"/>
+        </w:rPr>
+        <w:t xml:space="preserve">, </w:t>
+      </w:r>
+      <w:r>
+        <w:rPr>
+          <w:szCs w:val="22"/>
+        </w:rPr>
+        <w:t>/ʃ/-</w:t>
+      </w:r>
+      <w:r>
+        <w:rPr>
+          <w:szCs w:val="22"/>
+        </w:rPr>
+        <w:t>biased exposure</w:t>
+      </w:r>
+      <w:r>
+        <w:rPr>
+          <w:szCs w:val="22"/>
+        </w:rPr>
+        <w:t xml:space="preserve">), </w:t>
+      </w:r>
+      <w:r>
+        <w:rPr>
+          <w:szCs w:val="22"/>
+        </w:rPr>
+        <w:t>mixed with many filler stimuli. Following exposure, listeners were tested on an audio-only</w:t>
+      </w:r>
+      <w:r>
+        <w:rPr>
+          <w:i/>
+          <w:iCs/>
+          <w:szCs w:val="22"/>
+        </w:rPr>
+        <w:t xml:space="preserve"> </w:t>
+      </w:r>
+      <w:proofErr w:type="spellStart"/>
+      <w:r>
+        <w:rPr>
+          <w:i/>
+          <w:iCs/>
+          <w:szCs w:val="22"/>
+        </w:rPr>
+        <w:t>asi-ashi</w:t>
+      </w:r>
+      <w:proofErr w:type="spellEnd"/>
+      <w:r>
+        <w:rPr>
+          <w:szCs w:val="22"/>
+        </w:rPr>
+        <w:t xml:space="preserve"> continuum. As is typical for </w:t>
+      </w:r>
+      <w:r>
+        <w:rPr>
+          <w:szCs w:val="22"/>
+        </w:rPr>
+        <w:t xml:space="preserve">such </w:t>
+      </w:r>
+      <w:r>
+        <w:rPr>
+          <w:szCs w:val="22"/>
+        </w:rPr>
+        <w:t>perceptual recalibration</w:t>
+      </w:r>
+      <w:r>
+        <w:rPr>
+          <w:szCs w:val="22"/>
+        </w:rPr>
+        <w:t xml:space="preserve"> experiments, </w:t>
+      </w:r>
+      <w:r>
+        <w:rPr>
+          <w:szCs w:val="22"/>
+        </w:rPr>
+        <w:t>/ʃ/-</w:t>
+      </w:r>
+      <w:r>
+        <w:rPr>
+          <w:szCs w:val="22"/>
+        </w:rPr>
+        <w:t>biased</w:t>
+      </w:r>
+      <w:r>
+        <w:rPr>
+          <w:szCs w:val="22"/>
+        </w:rPr>
+        <w:t xml:space="preserve"> </w:t>
+      </w:r>
+      <w:r>
+        <w:rPr>
+          <w:szCs w:val="22"/>
+        </w:rPr>
+        <w:t>exposure caused listeners to</w:t>
+      </w:r>
+      <w:r>
+        <w:rPr>
+          <w:szCs w:val="22"/>
+        </w:rPr>
+        <w:t xml:space="preserve"> categorize more tokens along the </w:t>
+      </w:r>
+      <w:r>
+        <w:rPr>
+          <w:szCs w:val="22"/>
+        </w:rPr>
+        <w:t xml:space="preserve">test </w:t>
+      </w:r>
+      <w:r>
+        <w:rPr>
+          <w:szCs w:val="22"/>
+        </w:rPr>
+        <w:t xml:space="preserve">continuum as </w:t>
+      </w:r>
+      <w:proofErr w:type="spellStart"/>
+      <w:r>
+        <w:rPr>
+          <w:i/>
+          <w:iCs/>
+          <w:szCs w:val="22"/>
+        </w:rPr>
+        <w:t>ashi</w:t>
+      </w:r>
+      <w:proofErr w:type="spellEnd"/>
+      <w:r>
+        <w:rPr>
+          <w:szCs w:val="22"/>
+        </w:rPr>
+        <w:t xml:space="preserve">, compared to </w:t>
+      </w:r>
+      <w:r>
+        <w:rPr>
+          <w:szCs w:val="22"/>
+        </w:rPr>
+        <w:t>/s/-</w:t>
+      </w:r>
+      <w:r>
+        <w:rPr>
+          <w:szCs w:val="22"/>
+        </w:rPr>
+        <w:t>biased exposure</w:t>
+      </w:r>
+      <w:r>
+        <w:rPr>
+          <w:szCs w:val="22"/>
+        </w:rPr>
+        <w:t xml:space="preserve">. In a thought-provoking </w:t>
+      </w:r>
+      <w:r>
+        <w:rPr>
+          <w:szCs w:val="22"/>
+        </w:rPr>
+        <w:t>follow-up</w:t>
+      </w:r>
+      <w:r>
+        <w:rPr>
+          <w:szCs w:val="22"/>
+        </w:rPr>
+        <w:t xml:space="preserve">, Kraljic et al. (2008) found that </w:t>
+      </w:r>
+      <w:r>
+        <w:rPr>
+          <w:szCs w:val="22"/>
+        </w:rPr>
+        <w:t>this</w:t>
+      </w:r>
+      <w:r>
+        <w:rPr>
+          <w:szCs w:val="22"/>
+        </w:rPr>
+        <w:t xml:space="preserve"> perceptual recalibration</w:t>
+      </w:r>
+      <w:r>
+        <w:rPr>
+          <w:szCs w:val="22"/>
+        </w:rPr>
+        <w:t xml:space="preserve"> effect</w:t>
+      </w:r>
+      <w:r>
+        <w:rPr>
+          <w:szCs w:val="22"/>
+        </w:rPr>
+        <w:t xml:space="preserve">—the difference between </w:t>
+      </w:r>
+      <w:r>
+        <w:rPr>
+          <w:szCs w:val="22"/>
+        </w:rPr>
+        <w:t>/ʃ/</w:t>
+      </w:r>
+      <w:r>
+        <w:rPr>
+          <w:szCs w:val="22"/>
+        </w:rPr>
+        <w:t xml:space="preserve">- and </w:t>
+      </w:r>
+      <w:r>
+        <w:rPr>
+          <w:szCs w:val="22"/>
+        </w:rPr>
+        <w:t>/</w:t>
+      </w:r>
+      <w:r>
+        <w:rPr>
+          <w:szCs w:val="22"/>
+        </w:rPr>
+        <w:t>s</w:t>
+      </w:r>
+      <w:r>
+        <w:rPr>
+          <w:szCs w:val="22"/>
+        </w:rPr>
+        <w:t>/</w:t>
+      </w:r>
+      <w:r>
+        <w:rPr>
+          <w:szCs w:val="22"/>
+        </w:rPr>
+        <w:t xml:space="preserve">-biased exposure during </w:t>
+      </w:r>
+      <w:r>
+        <w:rPr>
+          <w:szCs w:val="22"/>
+        </w:rPr>
+        <w:t xml:space="preserve">the audio-only </w:t>
+      </w:r>
+      <w:r>
+        <w:rPr>
+          <w:szCs w:val="22"/>
+        </w:rPr>
+        <w:t>test</w:t>
+      </w:r>
+      <w:r>
+        <w:rPr>
+          <w:szCs w:val="22"/>
+        </w:rPr>
+        <w:t xml:space="preserve"> </w:t>
+      </w:r>
+      <w:r>
+        <w:rPr>
+          <w:szCs w:val="22"/>
+        </w:rPr>
+        <w:t>phase—</w:t>
+      </w:r>
+      <w:r>
+        <w:rPr>
+          <w:szCs w:val="22"/>
+        </w:rPr>
+        <w:t>is</w:t>
+      </w:r>
+      <w:r>
+        <w:rPr>
+          <w:szCs w:val="22"/>
+        </w:rPr>
+        <w:t xml:space="preserve"> blocked</w:t>
+      </w:r>
+      <w:r>
+        <w:rPr>
+          <w:szCs w:val="22"/>
+        </w:rPr>
+        <w:t xml:space="preserve"> </w:t>
+      </w:r>
+      <w:r>
+        <w:rPr>
+          <w:szCs w:val="22"/>
+        </w:rPr>
+        <w:t>when the talker ha</w:t>
+      </w:r>
+      <w:r>
+        <w:rPr>
+          <w:szCs w:val="22"/>
+        </w:rPr>
+        <w:t>d</w:t>
+      </w:r>
+      <w:r>
+        <w:rPr>
+          <w:szCs w:val="22"/>
+        </w:rPr>
+        <w:t xml:space="preserve"> a pen in the mouth during the </w:t>
+      </w:r>
+      <w:r>
+        <w:rPr>
+          <w:szCs w:val="22"/>
+        </w:rPr>
+        <w:t xml:space="preserve">pronunciation of the </w:t>
+      </w:r>
+      <w:r>
+        <w:rPr>
+          <w:szCs w:val="22"/>
+        </w:rPr>
+        <w:t xml:space="preserve">critical shifted </w:t>
+      </w:r>
+      <w:r>
+        <w:rPr>
+          <w:szCs w:val="22"/>
+        </w:rPr>
+        <w:t>exposure tokens</w:t>
+      </w:r>
+      <w:r>
+        <w:rPr>
+          <w:szCs w:val="22"/>
+        </w:rPr>
+        <w:t xml:space="preserve">. When the pen was instead in the hand during the shifted </w:t>
+      </w:r>
+      <w:r>
+        <w:rPr>
+          <w:szCs w:val="22"/>
+        </w:rPr>
+        <w:t>tokens</w:t>
+      </w:r>
+      <w:r>
+        <w:rPr>
+          <w:szCs w:val="22"/>
+        </w:rPr>
+        <w:t>, listeners again exhibited perceptual recalibration</w:t>
+      </w:r>
+      <w:r>
+        <w:rPr>
+          <w:szCs w:val="22"/>
+        </w:rPr>
+        <w:t>.</w:t>
       </w:r>
     </w:p>
     <w:p>
       <w:pPr>
         <w:rPr>
           <w:szCs w:val="22"/>
-          <w:highlight w:val="yellow"/>
-        </w:rPr>
-      </w:pPr>
-      <w:r>
-        <w:rPr>
-          <w:szCs w:val="22"/>
-        </w:rPr>
-        <w:t>The results of Experiment 2—the absence of compensation in the absence of direct visual evidence that lip shape was indeed affected by the pen—</w:t>
-      </w:r>
-      <w:r>
-        <w:rPr>
-          <w:szCs w:val="22"/>
-        </w:rPr>
-        <w:t>replicates for non-phonetic context, what has previously been demonstrated for phonetic context: compensation for visually presented context seems to be substantially reduced or no longer observed when the relevant articulatory effects are no</w:t>
-      </w:r>
-      <w:r>
-        <w:rPr>
-          <w:szCs w:val="22"/>
-        </w:rPr>
-        <w:t xml:space="preserve">t </w:t>
-      </w:r>
-      <w:r>
-        <w:rPr>
-          <w:szCs w:val="22"/>
-        </w:rPr>
-        <w:t>visually evident during the articulation of the target sound</w:t>
-      </w:r>
-      <w:r>
-        <w:rPr>
-          <w:szCs w:val="22"/>
-        </w:rPr>
-        <w:t xml:space="preserve"> (Holt et al., 2005</w:t>
-      </w:r>
-      <w:r>
-        <w:rPr>
-          <w:szCs w:val="22"/>
-        </w:rPr>
-        <w:t>; Viswanathan &amp; Stephens, 2016).</w:t>
-      </w:r>
-      <w:r>
-        <w:rPr>
-          <w:szCs w:val="22"/>
-          <w:highlight w:val="yellow"/>
+        </w:rPr>
+      </w:pPr>
+      <w:r>
+        <w:rPr>
+          <w:szCs w:val="22"/>
+        </w:rPr>
+        <w:t>While this blocking effect has since been replicated multiple times, the mechanisms underlying the effect remain unclear</w:t>
+      </w:r>
+      <w:r>
+        <w:rPr>
+          <w:szCs w:val="22"/>
+        </w:rPr>
+        <w:t xml:space="preserve"> (</w:t>
+      </w:r>
+      <w:r>
+        <w:rPr>
+          <w:szCs w:val="22"/>
+        </w:rPr>
+        <w:t xml:space="preserve">see discussion in </w:t>
+      </w:r>
+      <w:r>
+        <w:rPr>
+          <w:szCs w:val="22"/>
+        </w:rPr>
+        <w:t>Kraljic &amp; Samuel, 2011; Liu &amp; Jaeger, 2018).</w:t>
+      </w:r>
+      <w:r>
+        <w:rPr>
+          <w:szCs w:val="22"/>
         </w:rPr>
         <w:t xml:space="preserve"> </w:t>
+      </w:r>
+      <w:r>
+        <w:rPr>
+          <w:szCs w:val="22"/>
+        </w:rPr>
+        <w:t xml:space="preserve">For instance, Kraljic et al. (2008) attributing the blocking effect to “pragmatic” reasoning that prevents perceptual learning for </w:t>
+      </w:r>
+      <w:r>
+        <w:rPr>
+          <w:szCs w:val="22"/>
+        </w:rPr>
+        <w:t>“</w:t>
+      </w:r>
+      <w:r>
+        <w:rPr>
+          <w:szCs w:val="22"/>
+        </w:rPr>
+        <w:t>incidental</w:t>
+      </w:r>
+      <w:r>
+        <w:rPr>
+          <w:szCs w:val="22"/>
+        </w:rPr>
+        <w:t>”</w:t>
+      </w:r>
+      <w:r>
+        <w:rPr>
+          <w:szCs w:val="22"/>
+        </w:rPr>
+        <w:t xml:space="preserve"> </w:t>
+      </w:r>
+      <w:r>
+        <w:rPr>
+          <w:szCs w:val="22"/>
+        </w:rPr>
+        <w:t>changes in pronunciation</w:t>
+      </w:r>
+      <w:r>
+        <w:rPr>
+          <w:szCs w:val="22"/>
+        </w:rPr>
+        <w:t xml:space="preserve">—like </w:t>
+      </w:r>
+      <w:r>
+        <w:rPr>
+          <w:szCs w:val="22"/>
+        </w:rPr>
+        <w:t xml:space="preserve">those arising </w:t>
+      </w:r>
+      <w:r>
+        <w:rPr>
+          <w:szCs w:val="22"/>
+        </w:rPr>
+        <w:t>a pen is in the mouth</w:t>
+      </w:r>
+      <w:r>
+        <w:rPr>
+          <w:szCs w:val="22"/>
+        </w:rPr>
+        <w:t xml:space="preserve">—while allowing perceptual learning for changes that are considered “characteristic” of the talker’s speech. Based on a series of new experiments, Kraljic and Samuel (2011) revised this account, suggesting instead that audiovisual inputs with a pen in the mouth are </w:t>
+      </w:r>
+      <w:r>
+        <w:rPr>
+          <w:szCs w:val="22"/>
+        </w:rPr>
+        <w:lastRenderedPageBreak/>
+        <w:t xml:space="preserve">stored as separate exemplars that do not affect listeners’ categorization decisions for audio-only speech inputs—i.e., the type of speech input that has been used in the test phase of </w:t>
+      </w:r>
+      <w:r>
+        <w:rPr>
+          <w:i/>
+          <w:iCs/>
+          <w:szCs w:val="22"/>
+        </w:rPr>
+        <w:t>all</w:t>
+      </w:r>
+      <w:r>
+        <w:rPr>
+          <w:szCs w:val="22"/>
+        </w:rPr>
+        <w:t xml:space="preserve"> perceptual recalibration experiments on this question to date. </w:t>
+      </w:r>
+      <w:r>
+        <w:rPr>
+          <w:szCs w:val="22"/>
+        </w:rPr>
+        <w:t>However, based on additional experiments</w:t>
+      </w:r>
+      <w:r>
+        <w:rPr>
+          <w:szCs w:val="22"/>
+        </w:rPr>
+        <w:t>, Liu and Jaeger (2018) argued that the existing data were, in fact, more compatible with an account more along the lines of the original proposal by Kraljic et al. (2008)</w:t>
+      </w:r>
+      <w:r>
+        <w:rPr>
+          <w:szCs w:val="22"/>
+        </w:rPr>
+        <w:t xml:space="preserve">—as inference under uncertainty about the </w:t>
+      </w:r>
+      <w:r>
+        <w:rPr>
+          <w:i/>
+          <w:iCs/>
+          <w:szCs w:val="22"/>
+        </w:rPr>
+        <w:t>causes</w:t>
+      </w:r>
+      <w:r>
+        <w:rPr>
+          <w:szCs w:val="22"/>
+        </w:rPr>
+        <w:t xml:space="preserve"> for the unexpected pronunciations.</w:t>
+      </w:r>
+      <w:r>
+        <w:rPr>
+          <w:szCs w:val="22"/>
+        </w:rPr>
+        <w:t xml:space="preserve"> </w:t>
+      </w:r>
+      <w:r>
+        <w:rPr>
+          <w:szCs w:val="22"/>
+        </w:rPr>
+        <w:t>Despite important similarities between these different accounts, all previous</w:t>
+      </w:r>
+      <w:r>
+        <w:rPr>
+          <w:szCs w:val="22"/>
+        </w:rPr>
+        <w:t xml:space="preserve"> explanations of the blocking effect share that they appeal to </w:t>
+      </w:r>
+      <w:r>
+        <w:rPr>
+          <w:i/>
+          <w:iCs/>
+          <w:szCs w:val="22"/>
+        </w:rPr>
+        <w:t>learning</w:t>
+      </w:r>
+      <w:r>
+        <w:rPr>
+          <w:szCs w:val="22"/>
+        </w:rPr>
+        <w:t xml:space="preserve"> and/or </w:t>
+      </w:r>
+      <w:r>
+        <w:rPr>
+          <w:i/>
+          <w:iCs/>
+          <w:szCs w:val="22"/>
+        </w:rPr>
+        <w:t>memory</w:t>
+      </w:r>
+      <w:r>
+        <w:rPr>
+          <w:szCs w:val="22"/>
+        </w:rPr>
+        <w:t>.</w:t>
       </w:r>
     </w:p>
     <w:p>
@@ -23142,19 +23871,25 @@
         <w:rPr>
           <w:szCs w:val="22"/>
         </w:rPr>
-        <w:t>The present results also raise a number of questions for future research on compensation and adaptive speech perception more broadly. We briefly discuss t</w:t>
-      </w:r>
-      <w:r>
-        <w:rPr>
-          <w:szCs w:val="22"/>
-        </w:rPr>
-        <w:t>wo</w:t>
-      </w:r>
-      <w:r>
-        <w:rPr>
-          <w:szCs w:val="22"/>
-        </w:rPr>
-        <w:t>. First, our findings leave open whether compensation for visually evident effects of non-phonological causes—like the pen—draws on the same neural mechanisms as normalization/compensation for the effects of phonetic contexts. The present findings only suggest that Fowler’s compensation account provides a unifying explanation for the qualitative consequences of both phenomena. It is unclear, for example, whether compensation for visually</w:t>
+        <w:t xml:space="preserve">The results of </w:t>
+      </w:r>
+      <w:r>
+        <w:rPr>
+          <w:szCs w:val="22"/>
+        </w:rPr>
+        <w:t>our e</w:t>
+      </w:r>
+      <w:r>
+        <w:rPr>
+          <w:szCs w:val="22"/>
+        </w:rPr>
+        <w:t>xperiment</w:t>
+      </w:r>
+      <w:r>
+        <w:rPr>
+          <w:szCs w:val="22"/>
+        </w:rPr>
+        <w:t>s</w:t>
       </w:r>
       <w:r>
         <w:rPr>
@@ -23166,172 +23901,113 @@
         <w:rPr>
           <w:szCs w:val="22"/>
         </w:rPr>
-        <w:t>presented non-phonetic context take</w:t>
-      </w:r>
-      <w:r>
-        <w:rPr>
-          <w:szCs w:val="22"/>
-        </w:rPr>
-        <w:t>s</w:t>
-      </w:r>
-      <w:r>
-        <w:rPr>
-          <w:szCs w:val="22"/>
-        </w:rPr>
-        <w:t xml:space="preserve"> place in the same </w:t>
-      </w:r>
-      <w:r>
-        <w:rPr>
-          <w:szCs w:val="22"/>
-        </w:rPr>
-        <w:lastRenderedPageBreak/>
-        <w:t>brain areas that are responsible for audiovisual integration during speech perception, and whether those areas also process compensation for preceding phonetic context. Alternatively, compensation might take place at multiple points in the processing of speech input.</w:t>
-      </w:r>
-    </w:p>
-    <w:p>
-      <w:pPr>
-        <w:rPr>
-          <w:szCs w:val="22"/>
-        </w:rPr>
-      </w:pPr>
-      <w:r>
-        <w:rPr>
-          <w:szCs w:val="22"/>
-        </w:rPr>
-        <w:t>Second and f</w:t>
-      </w:r>
-      <w:r>
-        <w:rPr>
-          <w:szCs w:val="22"/>
-        </w:rPr>
-        <w:t xml:space="preserve">inally, the </w:t>
-      </w:r>
-      <w:r>
-        <w:rPr>
-          <w:szCs w:val="22"/>
-        </w:rPr>
-        <w:t xml:space="preserve">present </w:t>
-      </w:r>
-      <w:r>
-        <w:rPr>
-          <w:szCs w:val="22"/>
-        </w:rPr>
-        <w:t xml:space="preserve">results raise questions for future research on perceptual recalibration. </w:t>
-      </w:r>
-      <w:r>
-        <w:rPr>
-          <w:szCs w:val="22"/>
-        </w:rPr>
-        <w:t xml:space="preserve">As mentioned in the introduction, previous </w:t>
-      </w:r>
-      <w:r>
-        <w:rPr>
-          <w:szCs w:val="22"/>
-        </w:rPr>
-        <w:t>work has found that perceptual recalibration to an unfamiliar talker’s speech can be blocked when the unexpected pronunciations occur while the talker has a pen in the mouth. In perceptual recalibration experiments, listeners are exp</w:t>
-      </w:r>
-      <w:r>
-        <w:rPr>
-          <w:szCs w:val="22"/>
-        </w:rPr>
-        <w:t>osed</w:t>
-      </w:r>
-      <w:r>
-        <w:rPr>
-          <w:szCs w:val="22"/>
-        </w:rPr>
-        <w:t xml:space="preserve"> to speech from an unfamiliar talker for which the realization of a particular sound is shifted towards a neighboring category. For example, Kraljic &amp; Samuel (2006) exposed listeners to either typical </w:t>
-      </w:r>
-      <w:r>
-        <w:rPr>
-          <w:szCs w:val="22"/>
-        </w:rPr>
-        <w:t>/ʃ/</w:t>
-      </w:r>
-      <w:r>
-        <w:rPr>
-          <w:szCs w:val="22"/>
-        </w:rPr>
-        <w:t xml:space="preserve"> sounds and s</w:t>
-      </w:r>
-      <w:r>
-        <w:rPr>
-          <w:szCs w:val="22"/>
-        </w:rPr>
-        <w:t>ounds ambiguous between /s/ and /ʃ/ but in lexical contexts favoring /s/ interpretation</w:t>
-      </w:r>
-      <w:r>
-        <w:rPr>
-          <w:szCs w:val="22"/>
-        </w:rPr>
-        <w:t xml:space="preserve"> (e.g., </w:t>
-      </w:r>
-      <w:proofErr w:type="spellStart"/>
+        <w:t>raise the possibility</w:t>
+      </w:r>
+      <w:r>
+        <w:rPr>
+          <w:szCs w:val="22"/>
+        </w:rPr>
+        <w:t xml:space="preserve"> </w:t>
+      </w:r>
+      <w:r>
+        <w:rPr>
+          <w:szCs w:val="22"/>
+        </w:rPr>
+        <w:t>of another, qualitatively different, explanation:</w:t>
+      </w:r>
+      <w:r>
+        <w:rPr>
+          <w:szCs w:val="22"/>
+        </w:rPr>
+        <w:t xml:space="preserve"> </w:t>
+      </w:r>
+      <w:r>
+        <w:rPr>
+          <w:szCs w:val="22"/>
+        </w:rPr>
+        <w:t xml:space="preserve">participants might </w:t>
+      </w:r>
       <w:r>
         <w:rPr>
           <w:i/>
           <w:iCs/>
           <w:szCs w:val="22"/>
         </w:rPr>
-        <w:t>dinoshaur</w:t>
-      </w:r>
-      <w:proofErr w:type="spellEnd"/>
-      <w:r>
-        <w:rPr>
-          <w:szCs w:val="22"/>
-        </w:rPr>
-        <w:t xml:space="preserve">, </w:t>
-      </w:r>
-      <w:r>
-        <w:rPr>
-          <w:szCs w:val="22"/>
-        </w:rPr>
-        <w:t>/s/</w:t>
-      </w:r>
-      <w:r>
-        <w:rPr>
-          <w:szCs w:val="22"/>
-        </w:rPr>
-        <w:t>-biased exposure</w:t>
-      </w:r>
-      <w:r>
-        <w:rPr>
-          <w:szCs w:val="22"/>
-        </w:rPr>
-        <w:t xml:space="preserve">) or to typical </w:t>
-      </w:r>
-      <w:r>
-        <w:rPr>
-          <w:szCs w:val="22"/>
-        </w:rPr>
-        <w:t>/s/</w:t>
-      </w:r>
-      <w:r>
-        <w:rPr>
-          <w:szCs w:val="22"/>
-        </w:rPr>
-        <w:t xml:space="preserve"> sounds and </w:t>
-      </w:r>
-      <w:r>
-        <w:rPr>
-          <w:szCs w:val="22"/>
-        </w:rPr>
-        <w:t>ambiguous sounds rather in /ʃ/-favoring contexts</w:t>
-      </w:r>
-      <w:r>
-        <w:rPr>
-          <w:szCs w:val="22"/>
-        </w:rPr>
-        <w:t xml:space="preserve"> (e.g., </w:t>
-      </w:r>
-      <w:proofErr w:type="spellStart"/>
+        <w:t>compensate</w:t>
+      </w:r>
+      <w:r>
+        <w:rPr>
+          <w:szCs w:val="22"/>
+        </w:rPr>
+        <w:t xml:space="preserve"> for the pen in the mouth during exposure. </w:t>
+      </w:r>
+      <w:r>
+        <w:rPr>
+          <w:szCs w:val="22"/>
+        </w:rPr>
+        <w:t xml:space="preserve">This would place the explanation in </w:t>
+      </w:r>
       <w:r>
         <w:rPr>
           <w:i/>
           <w:iCs/>
           <w:szCs w:val="22"/>
         </w:rPr>
-        <w:t>ma</w:t>
+        <w:t>perception</w:t>
+      </w:r>
+      <w:r>
+        <w:rPr>
+          <w:szCs w:val="22"/>
+        </w:rPr>
+        <w:t>, rather than learning</w:t>
+      </w:r>
+      <w:r>
+        <w:rPr>
+          <w:szCs w:val="22"/>
+        </w:rPr>
+        <w:t xml:space="preserve"> or memory</w:t>
+      </w:r>
+      <w:r>
+        <w:rPr>
+          <w:szCs w:val="22"/>
+        </w:rPr>
+        <w:t xml:space="preserve">. </w:t>
+      </w:r>
+      <w:r>
+        <w:rPr>
+          <w:szCs w:val="22"/>
+        </w:rPr>
+        <w:t>If</w:t>
+      </w:r>
+      <w:r>
+        <w:rPr>
+          <w:szCs w:val="22"/>
+        </w:rPr>
+        <w:t xml:space="preserve"> compensation takes place before perceptual recalibration, t</w:t>
+      </w:r>
+      <w:r>
+        <w:rPr>
+          <w:szCs w:val="22"/>
+        </w:rPr>
+        <w:t xml:space="preserve">his would be expected to </w:t>
+      </w:r>
+      <w:r>
+        <w:rPr>
+          <w:szCs w:val="22"/>
+        </w:rPr>
+        <w:t xml:space="preserve">make the shifted </w:t>
+      </w:r>
+      <w:r>
+        <w:rPr>
+          <w:szCs w:val="22"/>
+        </w:rPr>
+        <w:t>/s/</w:t>
+      </w:r>
+      <w:r>
+        <w:rPr>
+          <w:szCs w:val="22"/>
+        </w:rPr>
+        <w:t xml:space="preserve"> tokens sound </w:t>
       </w:r>
       <w:r>
         <w:rPr>
@@ -23339,7 +24015,61 @@
           <w:iCs/>
           <w:szCs w:val="22"/>
         </w:rPr>
-        <w:t>s</w:t>
+        <w:t>less</w:t>
+      </w:r>
+      <w:r>
+        <w:rPr>
+          <w:szCs w:val="22"/>
+        </w:rPr>
+        <w:t xml:space="preserve"> shifted (as it should make them sound </w:t>
+      </w:r>
+      <w:r>
+        <w:rPr>
+          <w:szCs w:val="22"/>
+        </w:rPr>
+        <w:t>less</w:t>
+      </w:r>
+      <w:r>
+        <w:rPr>
+          <w:szCs w:val="22"/>
+        </w:rPr>
+        <w:t xml:space="preserve"> </w:t>
+      </w:r>
+      <w:r>
+        <w:rPr>
+          <w:szCs w:val="22"/>
+        </w:rPr>
+        <w:t>/ʃ/</w:t>
+      </w:r>
+      <w:r>
+        <w:rPr>
+          <w:szCs w:val="22"/>
+        </w:rPr>
+        <w:t xml:space="preserve">-like) and </w:t>
+      </w:r>
+      <w:r>
+        <w:rPr>
+          <w:szCs w:val="22"/>
+        </w:rPr>
+        <w:t>to make the</w:t>
+      </w:r>
+      <w:r>
+        <w:rPr>
+          <w:szCs w:val="22"/>
+        </w:rPr>
+        <w:t xml:space="preserve"> shifted </w:t>
+      </w:r>
+      <w:r>
+        <w:rPr>
+          <w:szCs w:val="22"/>
+        </w:rPr>
+        <w:t>/ʃ/</w:t>
+      </w:r>
+      <w:r>
+        <w:rPr>
+          <w:szCs w:val="22"/>
+        </w:rPr>
+        <w:t xml:space="preserve"> tokens sound </w:t>
       </w:r>
       <w:r>
         <w:rPr>
@@ -23347,38 +24077,73 @@
           <w:iCs/>
           <w:szCs w:val="22"/>
         </w:rPr>
-        <w:t>inery</w:t>
-      </w:r>
-      <w:proofErr w:type="spellEnd"/>
-      <w:r>
-        <w:rPr>
-          <w:szCs w:val="22"/>
-        </w:rPr>
-        <w:t xml:space="preserve">, </w:t>
-      </w:r>
-      <w:r>
-        <w:rPr>
-          <w:szCs w:val="22"/>
-        </w:rPr>
-        <w:t>/ʃ/-</w:t>
-      </w:r>
-      <w:r>
-        <w:rPr>
-          <w:szCs w:val="22"/>
-        </w:rPr>
-        <w:t>biased exposure</w:t>
-      </w:r>
-      <w:r>
-        <w:rPr>
-          <w:szCs w:val="22"/>
-        </w:rPr>
-        <w:t xml:space="preserve">), </w:t>
-      </w:r>
-      <w:r>
-        <w:rPr>
-          <w:szCs w:val="22"/>
-        </w:rPr>
-        <w:t>mixed with many filler stimuli. Following exposure, listeners were tested on an audio-only</w:t>
+        <w:t>more</w:t>
+      </w:r>
+      <w:r>
+        <w:rPr>
+          <w:szCs w:val="22"/>
+        </w:rPr>
+        <w:t xml:space="preserve"> shifted (as it makes them sound more</w:t>
+      </w:r>
+      <w:r>
+        <w:rPr>
+          <w:szCs w:val="22"/>
+        </w:rPr>
+        <w:t xml:space="preserve"> /s/</w:t>
+      </w:r>
+      <w:r>
+        <w:rPr>
+          <w:szCs w:val="22"/>
+        </w:rPr>
+        <w:t xml:space="preserve"> like). </w:t>
+      </w:r>
+      <w:r>
+        <w:rPr>
+          <w:szCs w:val="22"/>
+        </w:rPr>
+        <w:t xml:space="preserve">Without further considerations, this should weaken the effect of the </w:t>
+      </w:r>
+      <w:r>
+        <w:rPr>
+          <w:szCs w:val="22"/>
+        </w:rPr>
+        <w:t>/s/</w:t>
+      </w:r>
+      <w:r>
+        <w:rPr>
+          <w:szCs w:val="22"/>
+        </w:rPr>
+        <w:t xml:space="preserve">-biased exposure and strengthen the effect of </w:t>
+      </w:r>
+      <w:r>
+        <w:rPr>
+          <w:szCs w:val="22"/>
+        </w:rPr>
+        <w:t>/ʃ/</w:t>
+      </w:r>
+      <w:r>
+        <w:rPr>
+          <w:szCs w:val="22"/>
+        </w:rPr>
+        <w:t xml:space="preserve">-biased exposure, leaving </w:t>
+      </w:r>
+      <w:r>
+        <w:rPr>
+          <w:szCs w:val="22"/>
+        </w:rPr>
+        <w:t xml:space="preserve">it </w:t>
+      </w:r>
+      <w:r>
+        <w:rPr>
+          <w:szCs w:val="22"/>
+        </w:rPr>
+        <w:t>unclear how these two effects trade off. However, it is also known that shifts larger than those typically used in perceptual recalibration experiments</w:t>
+      </w:r>
+      <w:r>
+        <w:rPr>
+          <w:szCs w:val="22"/>
+        </w:rPr>
+        <w:t xml:space="preserve"> </w:t>
       </w:r>
       <w:r>
         <w:rPr>
@@ -23386,869 +24151,96 @@
           <w:iCs/>
           <w:szCs w:val="22"/>
         </w:rPr>
-        <w:t xml:space="preserve"> </w:t>
-      </w:r>
-      <w:proofErr w:type="spellStart"/>
+        <w:t>reduce</w:t>
+      </w:r>
+      <w:r>
+        <w:rPr>
+          <w:szCs w:val="22"/>
+        </w:rPr>
+        <w:t xml:space="preserve"> the effectiveness of exposure, because they reduce the rate at which participants still accept the shifted recordings as an instance of the intended sound</w:t>
+      </w:r>
+      <w:r>
+        <w:rPr>
+          <w:szCs w:val="22"/>
+        </w:rPr>
+        <w:t xml:space="preserve"> (Babel et al., 2019). Babel and colleagues refer to this as the “goldilocks zone”: </w:t>
+      </w:r>
+      <w:r>
+        <w:rPr>
+          <w:szCs w:val="22"/>
+        </w:rPr>
+        <w:t xml:space="preserve"> perceptual recalibration is most effective when the sounds are shifted as far as possible towards the other sound </w:t>
+      </w:r>
       <w:r>
         <w:rPr>
           <w:i/>
           <w:iCs/>
           <w:szCs w:val="22"/>
         </w:rPr>
-        <w:t>asi-ashi</w:t>
-      </w:r>
-      <w:proofErr w:type="spellEnd"/>
-      <w:r>
-        <w:rPr>
-          <w:szCs w:val="22"/>
-        </w:rPr>
-        <w:t xml:space="preserve"> continuum. As is typical for </w:t>
-      </w:r>
-      <w:r>
-        <w:rPr>
-          <w:szCs w:val="22"/>
-        </w:rPr>
-        <w:t xml:space="preserve">such </w:t>
-      </w:r>
-      <w:r>
-        <w:rPr>
-          <w:szCs w:val="22"/>
-        </w:rPr>
-        <w:t>perceptual recalibration</w:t>
-      </w:r>
-      <w:r>
-        <w:rPr>
-          <w:szCs w:val="22"/>
-        </w:rPr>
-        <w:t xml:space="preserve"> experiments, </w:t>
-      </w:r>
-      <w:r>
-        <w:rPr>
-          <w:szCs w:val="22"/>
-        </w:rPr>
-        <w:t>/ʃ/-</w:t>
-      </w:r>
-      <w:r>
-        <w:rPr>
-          <w:szCs w:val="22"/>
-        </w:rPr>
-        <w:t>biased</w:t>
-      </w:r>
-      <w:r>
-        <w:rPr>
-          <w:szCs w:val="22"/>
-        </w:rPr>
-        <w:t xml:space="preserve"> </w:t>
-      </w:r>
-      <w:r>
-        <w:rPr>
-          <w:szCs w:val="22"/>
-        </w:rPr>
-        <w:t>exposure caused listeners to</w:t>
-      </w:r>
-      <w:r>
-        <w:rPr>
-          <w:szCs w:val="22"/>
-        </w:rPr>
-        <w:t xml:space="preserve"> categorize more tokens along the </w:t>
-      </w:r>
-      <w:r>
-        <w:rPr>
-          <w:szCs w:val="22"/>
-        </w:rPr>
-        <w:t xml:space="preserve">test </w:t>
-      </w:r>
-      <w:r>
-        <w:rPr>
-          <w:szCs w:val="22"/>
-        </w:rPr>
-        <w:t xml:space="preserve">continuum as </w:t>
-      </w:r>
-      <w:proofErr w:type="spellStart"/>
+        <w:t>while still being perceived as an instance of the intended sound</w:t>
+      </w:r>
+      <w:r>
+        <w:rPr>
+          <w:szCs w:val="22"/>
+        </w:rPr>
+        <w:t>.</w:t>
+      </w:r>
+      <w:r>
+        <w:rPr>
+          <w:szCs w:val="22"/>
+        </w:rPr>
+        <w:t xml:space="preserve"> C</w:t>
+      </w:r>
+      <w:r>
+        <w:rPr>
+          <w:szCs w:val="22"/>
+        </w:rPr>
+        <w:t xml:space="preserve">ompensation thus might indeed offer a particularly parsimonious explanation of blocked perceptual recalibration: the pen in the mouth during exposure reduces the effect of </w:t>
+      </w:r>
+      <w:r>
+        <w:rPr>
+          <w:szCs w:val="22"/>
+        </w:rPr>
+        <w:t>/s/</w:t>
+      </w:r>
+      <w:r>
+        <w:rPr>
+          <w:szCs w:val="22"/>
+        </w:rPr>
+        <w:t xml:space="preserve">-biased exposure because it makes the critical recordings sound less shifted, and it reduces the effect of </w:t>
+      </w:r>
+      <w:r>
+        <w:rPr>
+          <w:szCs w:val="22"/>
+        </w:rPr>
+        <w:t>/ʃ/</w:t>
+      </w:r>
+      <w:r>
+        <w:rPr>
+          <w:szCs w:val="22"/>
+        </w:rPr>
+        <w:t xml:space="preserve">-biased exposure because it makes the critical recordings sound shifted </w:t>
+      </w:r>
       <w:r>
         <w:rPr>
           <w:i/>
           <w:iCs/>
           <w:szCs w:val="22"/>
         </w:rPr>
-        <w:t>ashi</w:t>
-      </w:r>
-      <w:proofErr w:type="spellEnd"/>
-      <w:r>
-        <w:rPr>
-          <w:szCs w:val="22"/>
-        </w:rPr>
-        <w:t xml:space="preserve">, compared to </w:t>
-      </w:r>
-      <w:r>
-        <w:rPr>
-          <w:szCs w:val="22"/>
-        </w:rPr>
-        <w:t>/s/-</w:t>
-      </w:r>
-      <w:r>
-        <w:rPr>
-          <w:szCs w:val="22"/>
-        </w:rPr>
-        <w:t>biased exposure</w:t>
-      </w:r>
-      <w:r>
-        <w:rPr>
-          <w:szCs w:val="22"/>
-        </w:rPr>
-        <w:t xml:space="preserve">. In a thought-provoking </w:t>
-      </w:r>
-      <w:r>
-        <w:rPr>
-          <w:szCs w:val="22"/>
-        </w:rPr>
-        <w:t>follow-up</w:t>
-      </w:r>
-      <w:r>
-        <w:rPr>
-          <w:szCs w:val="22"/>
-        </w:rPr>
-        <w:t xml:space="preserve">, Kraljic et al. (2008) found that </w:t>
-      </w:r>
-      <w:r>
-        <w:rPr>
-          <w:szCs w:val="22"/>
-        </w:rPr>
-        <w:t>this</w:t>
-      </w:r>
-      <w:r>
-        <w:rPr>
-          <w:szCs w:val="22"/>
-        </w:rPr>
-        <w:t xml:space="preserve"> perceptual recalibration</w:t>
-      </w:r>
-      <w:r>
-        <w:rPr>
-          <w:szCs w:val="22"/>
-        </w:rPr>
-        <w:t xml:space="preserve"> effect</w:t>
-      </w:r>
-      <w:r>
-        <w:rPr>
-          <w:szCs w:val="22"/>
-        </w:rPr>
-        <w:t xml:space="preserve">—the difference between </w:t>
-      </w:r>
-      <w:r>
-        <w:rPr>
-          <w:szCs w:val="22"/>
-        </w:rPr>
-        <w:t>/ʃ/</w:t>
-      </w:r>
-      <w:r>
-        <w:rPr>
-          <w:szCs w:val="22"/>
-        </w:rPr>
-        <w:t xml:space="preserve">- and </w:t>
-      </w:r>
-      <w:r>
-        <w:rPr>
-          <w:szCs w:val="22"/>
-        </w:rPr>
-        <w:t>/</w:t>
-      </w:r>
-      <w:r>
-        <w:rPr>
-          <w:szCs w:val="22"/>
-        </w:rPr>
-        <w:t>s</w:t>
-      </w:r>
-      <w:r>
-        <w:rPr>
-          <w:szCs w:val="22"/>
-        </w:rPr>
-        <w:t>/</w:t>
-      </w:r>
-      <w:r>
-        <w:rPr>
-          <w:szCs w:val="22"/>
-        </w:rPr>
-        <w:t xml:space="preserve">-biased exposure during </w:t>
-      </w:r>
-      <w:r>
-        <w:rPr>
-          <w:szCs w:val="22"/>
-        </w:rPr>
-        <w:t xml:space="preserve">the audio-only </w:t>
-      </w:r>
-      <w:r>
-        <w:rPr>
-          <w:szCs w:val="22"/>
-        </w:rPr>
-        <w:t>test</w:t>
-      </w:r>
-      <w:r>
-        <w:rPr>
-          <w:szCs w:val="22"/>
-        </w:rPr>
-        <w:t xml:space="preserve"> </w:t>
-      </w:r>
-      <w:r>
-        <w:rPr>
-          <w:szCs w:val="22"/>
-        </w:rPr>
-        <w:t>phase—</w:t>
-      </w:r>
-      <w:r>
-        <w:rPr>
-          <w:szCs w:val="22"/>
-        </w:rPr>
-        <w:t>is</w:t>
-      </w:r>
-      <w:r>
-        <w:rPr>
-          <w:szCs w:val="22"/>
-        </w:rPr>
-        <w:t xml:space="preserve"> blocked</w:t>
-      </w:r>
-      <w:r>
-        <w:rPr>
-          <w:szCs w:val="22"/>
-        </w:rPr>
-        <w:t xml:space="preserve"> </w:t>
-      </w:r>
-      <w:r>
-        <w:rPr>
-          <w:szCs w:val="22"/>
-        </w:rPr>
-        <w:t>when the talker ha</w:t>
-      </w:r>
-      <w:r>
-        <w:rPr>
-          <w:szCs w:val="22"/>
-        </w:rPr>
-        <w:t>d</w:t>
-      </w:r>
-      <w:r>
-        <w:rPr>
-          <w:szCs w:val="22"/>
-        </w:rPr>
-        <w:t xml:space="preserve"> a pen in the mouth during the </w:t>
-      </w:r>
-      <w:r>
-        <w:rPr>
-          <w:szCs w:val="22"/>
-        </w:rPr>
-        <w:t xml:space="preserve">pronunciation of the </w:t>
-      </w:r>
-      <w:r>
-        <w:rPr>
-          <w:szCs w:val="22"/>
-        </w:rPr>
-        <w:t xml:space="preserve">critical shifted </w:t>
-      </w:r>
-      <w:r>
-        <w:rPr>
-          <w:szCs w:val="22"/>
-        </w:rPr>
-        <w:t>exposure tokens</w:t>
-      </w:r>
-      <w:r>
-        <w:rPr>
-          <w:szCs w:val="22"/>
-        </w:rPr>
-        <w:t xml:space="preserve">. When the pen was instead in the hand during the shifted </w:t>
-      </w:r>
-      <w:r>
-        <w:rPr>
-          <w:szCs w:val="22"/>
-        </w:rPr>
-        <w:t>tokens</w:t>
-      </w:r>
-      <w:r>
-        <w:rPr>
-          <w:szCs w:val="22"/>
-        </w:rPr>
-        <w:t>, listeners again exhibited perceptual recalibration</w:t>
-      </w:r>
-      <w:r>
-        <w:rPr>
-          <w:szCs w:val="22"/>
-        </w:rPr>
-        <w:t>.</w:t>
-      </w:r>
-    </w:p>
-    <w:p>
-      <w:pPr>
-        <w:rPr>
-          <w:szCs w:val="22"/>
-        </w:rPr>
-      </w:pPr>
-      <w:r>
-        <w:rPr>
-          <w:szCs w:val="22"/>
-        </w:rPr>
-        <w:t>While this blocking effect has since been replicated multiple times, the mechanisms underlying the effect remain unclear</w:t>
-      </w:r>
-      <w:r>
-        <w:rPr>
-          <w:szCs w:val="22"/>
-        </w:rPr>
-        <w:t xml:space="preserve"> (</w:t>
-      </w:r>
-      <w:r>
-        <w:rPr>
-          <w:szCs w:val="22"/>
-        </w:rPr>
-        <w:t xml:space="preserve">see discussion in </w:t>
-      </w:r>
-      <w:r>
-        <w:rPr>
-          <w:szCs w:val="22"/>
-        </w:rPr>
-        <w:t>Kraljic &amp; Samuel, 2011; Liu &amp; Jaeger, 2018).</w:t>
-      </w:r>
-      <w:r>
-        <w:rPr>
-          <w:szCs w:val="22"/>
-        </w:rPr>
-        <w:t xml:space="preserve"> </w:t>
-      </w:r>
-      <w:r>
-        <w:rPr>
-          <w:szCs w:val="22"/>
-        </w:rPr>
-        <w:t xml:space="preserve">For instance, Kraljic et al. (2008) attributing the blocking effect to “pragmatic” reasoning that prevents perceptual learning for </w:t>
-      </w:r>
-      <w:r>
-        <w:rPr>
-          <w:szCs w:val="22"/>
-        </w:rPr>
-        <w:t>“</w:t>
-      </w:r>
-      <w:r>
-        <w:rPr>
-          <w:szCs w:val="22"/>
-        </w:rPr>
-        <w:t>incidental</w:t>
-      </w:r>
-      <w:r>
-        <w:rPr>
-          <w:szCs w:val="22"/>
-        </w:rPr>
-        <w:t>”</w:t>
-      </w:r>
-      <w:r>
-        <w:rPr>
-          <w:szCs w:val="22"/>
-        </w:rPr>
-        <w:t xml:space="preserve"> </w:t>
-      </w:r>
-      <w:r>
-        <w:rPr>
-          <w:szCs w:val="22"/>
-        </w:rPr>
-        <w:t>changes in pronunciation</w:t>
-      </w:r>
-      <w:r>
-        <w:rPr>
-          <w:szCs w:val="22"/>
-        </w:rPr>
-        <w:t xml:space="preserve">—like </w:t>
-      </w:r>
-      <w:r>
-        <w:rPr>
-          <w:szCs w:val="22"/>
-        </w:rPr>
-        <w:t xml:space="preserve">those arising </w:t>
-      </w:r>
-      <w:r>
-        <w:rPr>
-          <w:szCs w:val="22"/>
-        </w:rPr>
-        <w:t>a pen is in the mouth</w:t>
-      </w:r>
-      <w:r>
-        <w:rPr>
-          <w:szCs w:val="22"/>
-        </w:rPr>
-        <w:t xml:space="preserve">—while allowing perceptual learning for changes that are considered </w:t>
+        <w:t xml:space="preserve">too far </w:t>
+      </w:r>
+      <w:r>
+        <w:rPr>
+          <w:szCs w:val="22"/>
+        </w:rPr>
+        <w:t xml:space="preserve">to still be accepted </w:t>
       </w:r>
       <w:r>
         <w:rPr>
           <w:szCs w:val="22"/>
         </w:rPr>
         <w:lastRenderedPageBreak/>
-        <w:t xml:space="preserve">“characteristic” of the talker’s speech. Based on a series of new experiments, Kraljic and Samuel (2011) revised this account, suggesting instead that audiovisual inputs with a pen in the mouth are stored as separate exemplars that do not affect listeners’ categorization decisions for audio-only speech inputs—i.e., the type of speech input that has been used in the test phase of </w:t>
-      </w:r>
-      <w:r>
-        <w:rPr>
-          <w:i/>
-          <w:iCs/>
-          <w:szCs w:val="22"/>
-        </w:rPr>
-        <w:t>all</w:t>
-      </w:r>
-      <w:r>
-        <w:rPr>
-          <w:szCs w:val="22"/>
-        </w:rPr>
-        <w:t xml:space="preserve"> perceptual recalibration experiments on this question to date. </w:t>
-      </w:r>
-      <w:r>
-        <w:rPr>
-          <w:szCs w:val="22"/>
-        </w:rPr>
-        <w:t>However, based on additional experiments</w:t>
-      </w:r>
-      <w:r>
-        <w:rPr>
-          <w:szCs w:val="22"/>
-        </w:rPr>
-        <w:t>, Liu and Jaeger (2018) argued that the existing data were, in fact, more compatible with an account more along the lines of the original proposal by Kraljic et al. (2008)</w:t>
-      </w:r>
-      <w:r>
-        <w:rPr>
-          <w:szCs w:val="22"/>
-        </w:rPr>
-        <w:t xml:space="preserve">—as inference under uncertainty about the </w:t>
-      </w:r>
-      <w:r>
-        <w:rPr>
-          <w:i/>
-          <w:iCs/>
-          <w:szCs w:val="22"/>
-        </w:rPr>
-        <w:t>causes</w:t>
-      </w:r>
-      <w:r>
-        <w:rPr>
-          <w:szCs w:val="22"/>
-        </w:rPr>
-        <w:t xml:space="preserve"> for the unexpected pronunciations.</w:t>
-      </w:r>
-      <w:r>
-        <w:rPr>
-          <w:szCs w:val="22"/>
-        </w:rPr>
-        <w:t xml:space="preserve"> </w:t>
-      </w:r>
-      <w:r>
-        <w:rPr>
-          <w:szCs w:val="22"/>
-        </w:rPr>
-        <w:t>Despite important similarities between these different accounts, all previous</w:t>
-      </w:r>
-      <w:r>
-        <w:rPr>
-          <w:szCs w:val="22"/>
-        </w:rPr>
-        <w:t xml:space="preserve"> explanations of the blocking effect share that they appeal to </w:t>
-      </w:r>
-      <w:r>
-        <w:rPr>
-          <w:i/>
-          <w:iCs/>
-          <w:szCs w:val="22"/>
-        </w:rPr>
-        <w:t>learning</w:t>
-      </w:r>
-      <w:r>
-        <w:rPr>
-          <w:szCs w:val="22"/>
-        </w:rPr>
-        <w:t xml:space="preserve"> and/or </w:t>
-      </w:r>
-      <w:r>
-        <w:rPr>
-          <w:i/>
-          <w:iCs/>
-          <w:szCs w:val="22"/>
-        </w:rPr>
-        <w:t>memory</w:t>
-      </w:r>
-      <w:r>
-        <w:rPr>
-          <w:szCs w:val="22"/>
-        </w:rPr>
-        <w:t>.</w:t>
-      </w:r>
-    </w:p>
-    <w:p>
-      <w:pPr>
-        <w:rPr>
-          <w:szCs w:val="22"/>
-        </w:rPr>
-      </w:pPr>
-      <w:r>
-        <w:rPr>
-          <w:szCs w:val="22"/>
-        </w:rPr>
-        <w:t xml:space="preserve">The results of </w:t>
-      </w:r>
-      <w:r>
-        <w:rPr>
-          <w:szCs w:val="22"/>
-        </w:rPr>
-        <w:t>our e</w:t>
-      </w:r>
-      <w:r>
-        <w:rPr>
-          <w:szCs w:val="22"/>
-        </w:rPr>
-        <w:t>xperiment</w:t>
-      </w:r>
-      <w:r>
-        <w:rPr>
-          <w:szCs w:val="22"/>
-        </w:rPr>
-        <w:t>s</w:t>
-      </w:r>
-      <w:r>
-        <w:rPr>
-          <w:szCs w:val="22"/>
-        </w:rPr>
-        <w:t xml:space="preserve"> </w:t>
-      </w:r>
-      <w:r>
-        <w:rPr>
-          <w:szCs w:val="22"/>
-        </w:rPr>
-        <w:t>raise the possibility</w:t>
-      </w:r>
-      <w:r>
-        <w:rPr>
-          <w:szCs w:val="22"/>
-        </w:rPr>
-        <w:t xml:space="preserve"> </w:t>
-      </w:r>
-      <w:r>
-        <w:rPr>
-          <w:szCs w:val="22"/>
-        </w:rPr>
-        <w:t>of another, qualitatively different, explanation:</w:t>
-      </w:r>
-      <w:r>
-        <w:rPr>
-          <w:szCs w:val="22"/>
-        </w:rPr>
-        <w:t xml:space="preserve"> </w:t>
-      </w:r>
-      <w:r>
-        <w:rPr>
-          <w:szCs w:val="22"/>
-        </w:rPr>
-        <w:t xml:space="preserve">participants might </w:t>
-      </w:r>
-      <w:r>
-        <w:rPr>
-          <w:i/>
-          <w:iCs/>
-          <w:szCs w:val="22"/>
-        </w:rPr>
-        <w:t>compensate</w:t>
-      </w:r>
-      <w:r>
-        <w:rPr>
-          <w:szCs w:val="22"/>
-        </w:rPr>
-        <w:t xml:space="preserve"> for the pen in the mouth during exposure. </w:t>
-      </w:r>
-      <w:r>
-        <w:rPr>
-          <w:szCs w:val="22"/>
-        </w:rPr>
-        <w:t xml:space="preserve">This would place the explanation in </w:t>
-      </w:r>
-      <w:r>
-        <w:rPr>
-          <w:i/>
-          <w:iCs/>
-          <w:szCs w:val="22"/>
-        </w:rPr>
-        <w:t>perception</w:t>
-      </w:r>
-      <w:r>
-        <w:rPr>
-          <w:szCs w:val="22"/>
-        </w:rPr>
-        <w:t>, rather than learning</w:t>
-      </w:r>
-      <w:r>
-        <w:rPr>
-          <w:szCs w:val="22"/>
-        </w:rPr>
-        <w:t xml:space="preserve"> or memory</w:t>
-      </w:r>
-      <w:r>
-        <w:rPr>
-          <w:szCs w:val="22"/>
-        </w:rPr>
-        <w:t xml:space="preserve">. </w:t>
-      </w:r>
-      <w:r>
-        <w:rPr>
-          <w:szCs w:val="22"/>
-        </w:rPr>
-        <w:t>If</w:t>
-      </w:r>
-      <w:r>
-        <w:rPr>
-          <w:szCs w:val="22"/>
-        </w:rPr>
-        <w:t xml:space="preserve"> compensation takes place before perceptual recalibration, t</w:t>
-      </w:r>
-      <w:r>
-        <w:rPr>
-          <w:szCs w:val="22"/>
-        </w:rPr>
-        <w:t xml:space="preserve">his would be expected to </w:t>
-      </w:r>
-      <w:r>
-        <w:rPr>
-          <w:szCs w:val="22"/>
-        </w:rPr>
-        <w:t xml:space="preserve">make the shifted </w:t>
-      </w:r>
-      <w:r>
-        <w:rPr>
-          <w:szCs w:val="22"/>
-        </w:rPr>
-        <w:t>/s/</w:t>
-      </w:r>
-      <w:r>
-        <w:rPr>
-          <w:szCs w:val="22"/>
-        </w:rPr>
-        <w:t xml:space="preserve"> tokens sound </w:t>
-      </w:r>
-      <w:r>
-        <w:rPr>
-          <w:i/>
-          <w:iCs/>
-          <w:szCs w:val="22"/>
-        </w:rPr>
-        <w:t>less</w:t>
-      </w:r>
-      <w:r>
-        <w:rPr>
-          <w:szCs w:val="22"/>
-        </w:rPr>
-        <w:t xml:space="preserve"> shifted (as it should make them sound </w:t>
-      </w:r>
-      <w:r>
-        <w:rPr>
-          <w:szCs w:val="22"/>
-        </w:rPr>
-        <w:t>less</w:t>
-      </w:r>
-      <w:r>
-        <w:rPr>
-          <w:szCs w:val="22"/>
-        </w:rPr>
-        <w:t xml:space="preserve"> </w:t>
-      </w:r>
-      <w:r>
-        <w:rPr>
-          <w:szCs w:val="22"/>
-        </w:rPr>
-        <w:t>/ʃ/</w:t>
-      </w:r>
-      <w:r>
-        <w:rPr>
-          <w:szCs w:val="22"/>
-        </w:rPr>
-        <w:t xml:space="preserve">-like) and </w:t>
-      </w:r>
-      <w:r>
-        <w:rPr>
-          <w:szCs w:val="22"/>
-        </w:rPr>
-        <w:t>to make the</w:t>
-      </w:r>
-      <w:r>
-        <w:rPr>
-          <w:szCs w:val="22"/>
-        </w:rPr>
-        <w:t xml:space="preserve"> shifted </w:t>
-      </w:r>
-      <w:r>
-        <w:rPr>
-          <w:szCs w:val="22"/>
-        </w:rPr>
-        <w:t>/ʃ/</w:t>
-      </w:r>
-      <w:r>
-        <w:rPr>
-          <w:szCs w:val="22"/>
-        </w:rPr>
-        <w:t xml:space="preserve"> tokens sound </w:t>
-      </w:r>
-      <w:r>
-        <w:rPr>
-          <w:i/>
-          <w:iCs/>
-          <w:szCs w:val="22"/>
-        </w:rPr>
-        <w:t>more</w:t>
-      </w:r>
-      <w:r>
-        <w:rPr>
-          <w:szCs w:val="22"/>
-        </w:rPr>
-        <w:t xml:space="preserve"> shifted (as it makes them sound more</w:t>
-      </w:r>
-      <w:r>
-        <w:rPr>
-          <w:szCs w:val="22"/>
-        </w:rPr>
-        <w:t xml:space="preserve"> /s/</w:t>
-      </w:r>
-      <w:r>
-        <w:rPr>
-          <w:szCs w:val="22"/>
-        </w:rPr>
-        <w:t xml:space="preserve"> like). </w:t>
-      </w:r>
-      <w:r>
-        <w:rPr>
-          <w:szCs w:val="22"/>
-        </w:rPr>
-        <w:t xml:space="preserve">Without further considerations, this should weaken the effect of the </w:t>
-      </w:r>
-      <w:r>
-        <w:rPr>
-          <w:szCs w:val="22"/>
-        </w:rPr>
-        <w:t>/s/</w:t>
-      </w:r>
-      <w:r>
-        <w:rPr>
-          <w:szCs w:val="22"/>
-        </w:rPr>
-        <w:t xml:space="preserve">-biased exposure and strengthen the effect of </w:t>
-      </w:r>
-      <w:r>
-        <w:rPr>
-          <w:szCs w:val="22"/>
-        </w:rPr>
-        <w:t>/ʃ/</w:t>
-      </w:r>
-      <w:r>
-        <w:rPr>
-          <w:szCs w:val="22"/>
-        </w:rPr>
-        <w:t xml:space="preserve">-biased exposure, leaving </w:t>
-      </w:r>
-      <w:r>
-        <w:rPr>
-          <w:szCs w:val="22"/>
-        </w:rPr>
-        <w:t xml:space="preserve">it </w:t>
-      </w:r>
-      <w:r>
-        <w:rPr>
-          <w:szCs w:val="22"/>
-        </w:rPr>
-        <w:t>unclear how these two effects trade off. However, it is also known that shifts larger than those typically used in perceptual recalibration experiments</w:t>
-      </w:r>
-      <w:r>
-        <w:rPr>
-          <w:szCs w:val="22"/>
-        </w:rPr>
-        <w:t xml:space="preserve"> </w:t>
-      </w:r>
-      <w:r>
-        <w:rPr>
-          <w:i/>
-          <w:iCs/>
-          <w:szCs w:val="22"/>
-        </w:rPr>
-        <w:t>reduce</w:t>
-      </w:r>
-      <w:r>
-        <w:rPr>
-          <w:szCs w:val="22"/>
-        </w:rPr>
-        <w:t xml:space="preserve"> the effectiveness of exposure, because they reduce the rate at which participants still accept the shifted recordings as an instance of the intended sound</w:t>
-      </w:r>
-      <w:r>
-        <w:rPr>
-          <w:szCs w:val="22"/>
-        </w:rPr>
-        <w:t xml:space="preserve"> (Babel et al., 2019). Babel and colleagues refer to this as the “goldilocks zone”: </w:t>
-      </w:r>
-      <w:r>
-        <w:rPr>
-          <w:szCs w:val="22"/>
-        </w:rPr>
-        <w:t xml:space="preserve"> perceptual recalibration is most effective when the sounds are shifted as far as possible towards the other sound </w:t>
-      </w:r>
-      <w:r>
-        <w:rPr>
-          <w:i/>
-          <w:iCs/>
-          <w:szCs w:val="22"/>
-        </w:rPr>
-        <w:t>while still being perceived as an instance of the intended sound</w:t>
-      </w:r>
-      <w:r>
-        <w:rPr>
-          <w:szCs w:val="22"/>
-        </w:rPr>
-        <w:t>.</w:t>
-      </w:r>
-      <w:r>
-        <w:rPr>
-          <w:szCs w:val="22"/>
-        </w:rPr>
-        <w:t xml:space="preserve"> C</w:t>
-      </w:r>
-      <w:r>
-        <w:rPr>
-          <w:szCs w:val="22"/>
-        </w:rPr>
-        <w:t xml:space="preserve">ompensation thus might indeed offer a particularly parsimonious explanation of blocked perceptual recalibration: the pen in the mouth during exposure reduces the effect of </w:t>
-      </w:r>
-      <w:r>
-        <w:rPr>
-          <w:szCs w:val="22"/>
-        </w:rPr>
-        <w:t>/s/</w:t>
-      </w:r>
-      <w:r>
-        <w:rPr>
-          <w:szCs w:val="22"/>
-        </w:rPr>
-        <w:t xml:space="preserve">-biased </w:t>
-      </w:r>
-      <w:r>
-        <w:rPr>
-          <w:szCs w:val="22"/>
-        </w:rPr>
-        <w:lastRenderedPageBreak/>
-        <w:t xml:space="preserve">exposure because it makes the critical recordings sound less shifted, and it reduces the effect of </w:t>
-      </w:r>
-      <w:r>
-        <w:rPr>
-          <w:szCs w:val="22"/>
-        </w:rPr>
-        <w:t>/ʃ/</w:t>
-      </w:r>
-      <w:r>
-        <w:rPr>
-          <w:szCs w:val="22"/>
-        </w:rPr>
-        <w:t xml:space="preserve">-biased exposure because it makes the critical recordings sound shifted </w:t>
-      </w:r>
-      <w:r>
-        <w:rPr>
-          <w:i/>
-          <w:iCs/>
-          <w:szCs w:val="22"/>
-        </w:rPr>
-        <w:t xml:space="preserve">too far </w:t>
-      </w:r>
-      <w:r>
-        <w:rPr>
-          <w:szCs w:val="22"/>
-        </w:rPr>
-        <w:t xml:space="preserve">to still be accepted as </w:t>
+        <w:t xml:space="preserve">as </w:t>
       </w:r>
       <w:r>
         <w:rPr>
@@ -24632,7 +24624,7 @@
         </w:rPr>
         <w:t>e thank Zach Burchill, Wednesday Bushong, Linda Liu, and Xin Xie for sharing materials and feedback for a tutorial on crowdsourcing experiments developed as part of this project (</w:t>
       </w:r>
-      <w:hyperlink r:id="rId22" w:history="1">
+      <w:hyperlink r:id="rId18" w:history="1">
         <w:r>
           <w:rPr>
             <w:rStyle w:val="Hyperlink"/>
@@ -25311,7 +25303,7 @@
         </w:rPr>
         <w:t> (pp. 189–201). Boston Review. </w:t>
       </w:r>
-      <w:hyperlink r:id="rId23" w:tgtFrame="_blank" w:history="1">
+      <w:hyperlink r:id="rId19" w:tgtFrame="_blank" w:history="1">
         <w:r>
           <w:rPr>
             <w:rStyle w:val="Hyperlink"/>
@@ -26134,7 +26126,7 @@
         </w:rPr>
         <w:t xml:space="preserve">(3). </w:t>
       </w:r>
-      <w:hyperlink r:id="rId24" w:history="1">
+      <w:hyperlink r:id="rId20" w:history="1">
         <w:r>
           <w:rPr>
             <w:rStyle w:val="Hyperlink"/>
@@ -27001,7 +26993,7 @@
         </w:rPr>
         <w:t xml:space="preserve">Xie, X., Liu, L., &amp; Jaeger, T. F. (2021, January 11). Xie, Liu, &amp; Jaeger (2020). Cross-talker generalization during foreign-accented speech perception. </w:t>
       </w:r>
-      <w:hyperlink r:id="rId25" w:history="1">
+      <w:hyperlink r:id="rId21" w:history="1">
         <w:r>
           <w:rPr>
             <w:rStyle w:val="Hyperlink"/>
@@ -27120,45 +27112,6 @@
     </w:sectPr>
   </w:body>
 </w:document>
-</file>
-
-<file path=word/comments.xml><?xml version="1.0" encoding="utf-8"?>
-<w:comments xmlns:wpc="http://schemas.microsoft.com/office/word/2010/wordprocessingCanvas" xmlns:cx="http://schemas.microsoft.com/office/drawing/2014/chartex" xmlns:cx1="http://schemas.microsoft.com/office/drawing/2015/9/8/chartex" xmlns:cx2="http://schemas.microsoft.com/office/drawing/2015/10/21/chartex" xmlns:cx3="http://schemas.microsoft.com/office/drawing/2016/5/9/chartex" xmlns:cx4="http://schemas.microsoft.com/office/drawing/2016/5/10/chartex" xmlns:cx5="http://schemas.microsoft.com/office/drawing/2016/5/11/chartex" xmlns:cx6="http://schemas.microsoft.com/office/drawing/2016/5/12/chartex" xmlns:cx7="http://schemas.microsoft.com/office/drawing/2016/5/13/chartex" xmlns:cx8="http://schemas.microsoft.com/office/drawing/2016/5/14/chartex" xmlns:mc="http://schemas.openxmlformats.org/markup-compatibility/2006" xmlns:aink="http://schemas.microsoft.com/office/drawing/2016/ink" xmlns:am3d="http://schemas.microsoft.com/office/drawing/2017/model3d" xmlns:o="urn:schemas-microsoft-com:office:office" xmlns:oel="http://schemas.microsoft.com/office/2019/extlst" xmlns:r="http://schemas.openxmlformats.org/officeDocument/2006/relationships" xmlns:m="http://schemas.openxmlformats.org/officeDocument/2006/math" xmlns:v="urn:schemas-microsoft-com:vml" xmlns:wp14="http://schemas.microsoft.com/office/word/2010/wordprocessingDrawing" xmlns:wp="http://schemas.openxmlformats.org/drawingml/2006/wordprocessingDrawing" xmlns:w10="urn:schemas-microsoft-com:office:word" xmlns:w="http://schemas.openxmlformats.org/wordprocessingml/2006/main" xmlns:w14="http://schemas.microsoft.com/office/word/2010/wordml" xmlns:w15="http://schemas.microsoft.com/office/word/2012/wordml" xmlns:w16cex="http://schemas.microsoft.com/office/word/2018/wordml/cex" xmlns:w16cid="http://schemas.microsoft.com/office/word/2016/wordml/cid" xmlns:w16="http://schemas.microsoft.com/office/word/2018/wordml" xmlns:w16du="http://schemas.microsoft.com/office/word/2023/wordml/word16du" xmlns:w16sdtdh="http://schemas.microsoft.com/office/word/2020/wordml/sdtdatahash" xmlns:w16se="http://schemas.microsoft.com/office/word/2015/wordml/symex" xmlns:wpg="http://schemas.microsoft.com/office/word/2010/wordprocessingGroup" xmlns:wpi="http://schemas.microsoft.com/office/word/2010/wordprocessingInk" xmlns:wne="http://schemas.microsoft.com/office/word/2006/wordml" xmlns:wps="http://schemas.microsoft.com/office/word/2010/wordprocessingShape" mc:Ignorable="w14 w15 w16se w16cid w16 w16cex w16sdtdh w16du wp14">
-  <w:comment w:id="5" w:author="Cummings, Shawn" w:date="2025-05-29T17:56:00Z" w:initials="SC">
-    <w:p>
-      <w:pPr>
-        <w:jc w:val="left"/>
-      </w:pPr>
-      <w:r>
-        <w:rPr>
-          <w:rStyle w:val="CommentReference"/>
-        </w:rPr>
-        <w:annotationRef/>
-      </w:r>
-      <w:r>
-        <w:t>Is this mean effect size across 1a-c?</w:t>
-      </w:r>
-    </w:p>
-  </w:comment>
-</w:comments>
-</file>
-
-<file path=word/commentsExtended.xml><?xml version="1.0" encoding="utf-8"?>
-<w15:commentsEx xmlns:wpc="http://schemas.microsoft.com/office/word/2010/wordprocessingCanvas" xmlns:cx="http://schemas.microsoft.com/office/drawing/2014/chartex" xmlns:cx1="http://schemas.microsoft.com/office/drawing/2015/9/8/chartex" xmlns:cx2="http://schemas.microsoft.com/office/drawing/2015/10/21/chartex" xmlns:cx3="http://schemas.microsoft.com/office/drawing/2016/5/9/chartex" xmlns:cx4="http://schemas.microsoft.com/office/drawing/2016/5/10/chartex" xmlns:cx5="http://schemas.microsoft.com/office/drawing/2016/5/11/chartex" xmlns:cx6="http://schemas.microsoft.com/office/drawing/2016/5/12/chartex" xmlns:cx7="http://schemas.microsoft.com/office/drawing/2016/5/13/chartex" xmlns:cx8="http://schemas.microsoft.com/office/drawing/2016/5/14/chartex" xmlns:mc="http://schemas.openxmlformats.org/markup-compatibility/2006" xmlns:aink="http://schemas.microsoft.com/office/drawing/2016/ink" xmlns:am3d="http://schemas.microsoft.com/office/drawing/2017/model3d" xmlns:o="urn:schemas-microsoft-com:office:office" xmlns:oel="http://schemas.microsoft.com/office/2019/extlst" xmlns:r="http://schemas.openxmlformats.org/officeDocument/2006/relationships" xmlns:m="http://schemas.openxmlformats.org/officeDocument/2006/math" xmlns:v="urn:schemas-microsoft-com:vml" xmlns:wp14="http://schemas.microsoft.com/office/word/2010/wordprocessingDrawing" xmlns:wp="http://schemas.openxmlformats.org/drawingml/2006/wordprocessingDrawing" xmlns:w10="urn:schemas-microsoft-com:office:word" xmlns:w="http://schemas.openxmlformats.org/wordprocessingml/2006/main" xmlns:w14="http://schemas.microsoft.com/office/word/2010/wordml" xmlns:w15="http://schemas.microsoft.com/office/word/2012/wordml" xmlns:w16cex="http://schemas.microsoft.com/office/word/2018/wordml/cex" xmlns:w16cid="http://schemas.microsoft.com/office/word/2016/wordml/cid" xmlns:w16="http://schemas.microsoft.com/office/word/2018/wordml" xmlns:w16du="http://schemas.microsoft.com/office/word/2023/wordml/word16du" xmlns:w16sdtdh="http://schemas.microsoft.com/office/word/2020/wordml/sdtdatahash" xmlns:w16se="http://schemas.microsoft.com/office/word/2015/wordml/symex" xmlns:wpg="http://schemas.microsoft.com/office/word/2010/wordprocessingGroup" xmlns:wpi="http://schemas.microsoft.com/office/word/2010/wordprocessingInk" xmlns:wne="http://schemas.microsoft.com/office/word/2006/wordml" xmlns:wps="http://schemas.microsoft.com/office/word/2010/wordprocessingShape" mc:Ignorable="w14 w15 w16se w16cid w16 w16cex w16sdtdh w16du wp14">
-  <w15:commentEx w15:paraId="2AF11D87" w15:done="0"/>
-</w15:commentsEx>
-</file>
-
-<file path=word/commentsExtensible.xml><?xml version="1.0" encoding="utf-8"?>
-<w16cex:commentsExtensible xmlns:wpc="http://schemas.microsoft.com/office/word/2010/wordprocessingCanvas" xmlns:cx="http://schemas.microsoft.com/office/drawing/2014/chartex" xmlns:cx1="http://schemas.microsoft.com/office/drawing/2015/9/8/chartex" xmlns:cx2="http://schemas.microsoft.com/office/drawing/2015/10/21/chartex" xmlns:cx3="http://schemas.microsoft.com/office/drawing/2016/5/9/chartex" xmlns:cx4="http://schemas.microsoft.com/office/drawing/2016/5/10/chartex" xmlns:cx5="http://schemas.microsoft.com/office/drawing/2016/5/11/chartex" xmlns:cx6="http://schemas.microsoft.com/office/drawing/2016/5/12/chartex" xmlns:cx7="http://schemas.microsoft.com/office/drawing/2016/5/13/chartex" xmlns:cx8="http://schemas.microsoft.com/office/drawing/2016/5/14/chartex" xmlns:cr="http://schemas.microsoft.com/office/comments/2020/reactions" xmlns:mc="http://schemas.openxmlformats.org/markup-compatibility/2006" xmlns:aink="http://schemas.microsoft.com/office/drawing/2016/ink" xmlns:am3d="http://schemas.microsoft.com/office/drawing/2017/model3d" xmlns:o="urn:schemas-microsoft-com:office:office" xmlns:oel="http://schemas.microsoft.com/office/2019/extlst" xmlns:r="http://schemas.openxmlformats.org/officeDocument/2006/relationships" xmlns:m="http://schemas.openxmlformats.org/officeDocument/2006/math" xmlns:v="urn:schemas-microsoft-com:vml" xmlns:wp14="http://schemas.microsoft.com/office/word/2010/wordprocessingDrawing" xmlns:wp="http://schemas.openxmlformats.org/drawingml/2006/wordprocessingDrawing" xmlns:w10="urn:schemas-microsoft-com:office:word" xmlns:w="http://schemas.openxmlformats.org/wordprocessingml/2006/main" xmlns:w14="http://schemas.microsoft.com/office/word/2010/wordml" xmlns:w15="http://schemas.microsoft.com/office/word/2012/wordml" xmlns:w16cex="http://schemas.microsoft.com/office/word/2018/wordml/cex" xmlns:w16cid="http://schemas.microsoft.com/office/word/2016/wordml/cid" xmlns:w16="http://schemas.microsoft.com/office/word/2018/wordml" xmlns:w16du="http://schemas.microsoft.com/office/word/2023/wordml/word16du" xmlns:w16sdtdh="http://schemas.microsoft.com/office/word/2020/wordml/sdtdatahash" xmlns:w16se="http://schemas.microsoft.com/office/word/2015/wordml/symex" xmlns:wpg="http://schemas.microsoft.com/office/word/2010/wordprocessingGroup" xmlns:wpi="http://schemas.microsoft.com/office/word/2010/wordprocessingInk" xmlns:wne="http://schemas.microsoft.com/office/word/2006/wordml" xmlns:wps="http://schemas.microsoft.com/office/word/2010/wordprocessingShape" mc:Ignorable="w14 w15 w16se w16cid w16 w16cex w16sdtdh cr w16du wp14">
-  <w16cex:commentExtensible w16cex:durableId="647B7BD4" w16cex:dateUtc="2025-05-29T21:56:00Z"/>
-</w16cex:commentsExtensible>
-</file>
-
-<file path=word/commentsIds.xml><?xml version="1.0" encoding="utf-8"?>
-<w16cid:commentsIds xmlns:wpc="http://schemas.microsoft.com/office/word/2010/wordprocessingCanvas" xmlns:cx="http://schemas.microsoft.com/office/drawing/2014/chartex" xmlns:cx1="http://schemas.microsoft.com/office/drawing/2015/9/8/chartex" xmlns:cx2="http://schemas.microsoft.com/office/drawing/2015/10/21/chartex" xmlns:cx3="http://schemas.microsoft.com/office/drawing/2016/5/9/chartex" xmlns:cx4="http://schemas.microsoft.com/office/drawing/2016/5/10/chartex" xmlns:cx5="http://schemas.microsoft.com/office/drawing/2016/5/11/chartex" xmlns:cx6="http://schemas.microsoft.com/office/drawing/2016/5/12/chartex" xmlns:cx7="http://schemas.microsoft.com/office/drawing/2016/5/13/chartex" xmlns:cx8="http://schemas.microsoft.com/office/drawing/2016/5/14/chartex" xmlns:mc="http://schemas.openxmlformats.org/markup-compatibility/2006" xmlns:aink="http://schemas.microsoft.com/office/drawing/2016/ink" xmlns:am3d="http://schemas.microsoft.com/office/drawing/2017/model3d" xmlns:o="urn:schemas-microsoft-com:office:office" xmlns:oel="http://schemas.microsoft.com/office/2019/extlst" xmlns:r="http://schemas.openxmlformats.org/officeDocument/2006/relationships" xmlns:m="http://schemas.openxmlformats.org/officeDocument/2006/math" xmlns:v="urn:schemas-microsoft-com:vml" xmlns:wp14="http://schemas.microsoft.com/office/word/2010/wordprocessingDrawing" xmlns:wp="http://schemas.openxmlformats.org/drawingml/2006/wordprocessingDrawing" xmlns:w10="urn:schemas-microsoft-com:office:word" xmlns:w="http://schemas.openxmlformats.org/wordprocessingml/2006/main" xmlns:w14="http://schemas.microsoft.com/office/word/2010/wordml" xmlns:w15="http://schemas.microsoft.com/office/word/2012/wordml" xmlns:w16cex="http://schemas.microsoft.com/office/word/2018/wordml/cex" xmlns:w16cid="http://schemas.microsoft.com/office/word/2016/wordml/cid" xmlns:w16="http://schemas.microsoft.com/office/word/2018/wordml" xmlns:w16du="http://schemas.microsoft.com/office/word/2023/wordml/word16du" xmlns:w16sdtdh="http://schemas.microsoft.com/office/word/2020/wordml/sdtdatahash" xmlns:w16se="http://schemas.microsoft.com/office/word/2015/wordml/symex" xmlns:wpg="http://schemas.microsoft.com/office/word/2010/wordprocessingGroup" xmlns:wpi="http://schemas.microsoft.com/office/word/2010/wordprocessingInk" xmlns:wne="http://schemas.microsoft.com/office/word/2006/wordml" xmlns:wps="http://schemas.microsoft.com/office/word/2010/wordprocessingShape" mc:Ignorable="w14 w15 w16se w16cid w16 w16cex w16sdtdh w16du wp14">
-  <w16cid:commentId w16cid:paraId="2AF11D87" w16cid:durableId="647B7BD4"/>
-</w16cid:commentsIds>
 </file>
 
 <file path=word/endnotes.xml><?xml version="1.0" encoding="utf-8"?>
@@ -32277,14 +32230,6 @@
     <w:abstractNumId w:val="1"/>
   </w:num>
 </w:numbering>
-</file>
-
-<file path=word/people.xml><?xml version="1.0" encoding="utf-8"?>
-<w15:people xmlns:wpc="http://schemas.microsoft.com/office/word/2010/wordprocessingCanvas" xmlns:cx="http://schemas.microsoft.com/office/drawing/2014/chartex" xmlns:cx1="http://schemas.microsoft.com/office/drawing/2015/9/8/chartex" xmlns:cx2="http://schemas.microsoft.com/office/drawing/2015/10/21/chartex" xmlns:cx3="http://schemas.microsoft.com/office/drawing/2016/5/9/chartex" xmlns:cx4="http://schemas.microsoft.com/office/drawing/2016/5/10/chartex" xmlns:cx5="http://schemas.microsoft.com/office/drawing/2016/5/11/chartex" xmlns:cx6="http://schemas.microsoft.com/office/drawing/2016/5/12/chartex" xmlns:cx7="http://schemas.microsoft.com/office/drawing/2016/5/13/chartex" xmlns:cx8="http://schemas.microsoft.com/office/drawing/2016/5/14/chartex" xmlns:mc="http://schemas.openxmlformats.org/markup-compatibility/2006" xmlns:aink="http://schemas.microsoft.com/office/drawing/2016/ink" xmlns:am3d="http://schemas.microsoft.com/office/drawing/2017/model3d" xmlns:o="urn:schemas-microsoft-com:office:office" xmlns:oel="http://schemas.microsoft.com/office/2019/extlst" xmlns:r="http://schemas.openxmlformats.org/officeDocument/2006/relationships" xmlns:m="http://schemas.openxmlformats.org/officeDocument/2006/math" xmlns:v="urn:schemas-microsoft-com:vml" xmlns:wp14="http://schemas.microsoft.com/office/word/2010/wordprocessingDrawing" xmlns:wp="http://schemas.openxmlformats.org/drawingml/2006/wordprocessingDrawing" xmlns:w10="urn:schemas-microsoft-com:office:word" xmlns:w="http://schemas.openxmlformats.org/wordprocessingml/2006/main" xmlns:w14="http://schemas.microsoft.com/office/word/2010/wordml" xmlns:w15="http://schemas.microsoft.com/office/word/2012/wordml" xmlns:w16cex="http://schemas.microsoft.com/office/word/2018/wordml/cex" xmlns:w16cid="http://schemas.microsoft.com/office/word/2016/wordml/cid" xmlns:w16="http://schemas.microsoft.com/office/word/2018/wordml" xmlns:w16du="http://schemas.microsoft.com/office/word/2023/wordml/word16du" xmlns:w16sdtdh="http://schemas.microsoft.com/office/word/2020/wordml/sdtdatahash" xmlns:w16se="http://schemas.microsoft.com/office/word/2015/wordml/symex" xmlns:wpg="http://schemas.microsoft.com/office/word/2010/wordprocessingGroup" xmlns:wpi="http://schemas.microsoft.com/office/word/2010/wordprocessingInk" xmlns:wne="http://schemas.microsoft.com/office/word/2006/wordml" xmlns:wps="http://schemas.microsoft.com/office/word/2010/wordprocessingShape" mc:Ignorable="w14 w15 w16se w16cid w16 w16cex w16sdtdh w16du wp14">
-  <w15:person w15:author="Cummings, Shawn">
-    <w15:presenceInfo w15:providerId="AD" w15:userId="S::shawn.cummings@uconn.edu::de2d00fc-0438-4d53-9dfb-ffd47e6e9224"/>
-  </w15:person>
-</w15:people>
 </file>
 
 <file path=word/styles.xml><?xml version="1.0" encoding="utf-8"?>

</xml_diff>